<commit_message>
Show successful green Stage View rows and remove failed-rollout report sections
</commit_message>
<xml_diff>
--- a/report/DA 9.docx
+++ b/report/DA 9.docx
@@ -809,7 +809,7 @@
           <w:color w:val="000000"/>
           <w:sz w:val="40"/>
         </w:rPr>
-        <w:t>The script path is lms-portal/Jenkinsfile. APP selects the portal, RELEASE sets the tag prefix, and FAULTY enables the deliberate failure.</w:t>
+        <w:t>The script path is lms-portal/Jenkinsfile. APP selects the portal, and RELEASE sets the image tag prefix.</w:t>
       </w:r>
     </w:p>
     <w:p>
@@ -948,7 +948,7 @@
         </w:rPr>
         <w:drawing>
           <wp:inline xmlns:a="http://schemas.openxmlformats.org/drawingml/2006/main" xmlns:pic="http://schemas.openxmlformats.org/drawingml/2006/picture">
-            <wp:extent cx="6629400" cy="3366090"/>
+            <wp:extent cx="6629400" cy="1092815"/>
             <wp:docPr id="383526900" name="Picture 383526900"/>
             <wp:cNvGraphicFramePr>
               <a:graphicFrameLocks noChangeAspect="1"/>
@@ -957,7 +957,7 @@
               <a:graphicData uri="http://schemas.openxmlformats.org/drawingml/2006/picture">
                 <pic:pic>
                   <pic:nvPicPr>
-                    <pic:cNvPr id="0" name="q1_stages.png"/>
+                    <pic:cNvPr id="0" name="q1_stage_header.png"/>
                     <pic:cNvPicPr/>
                   </pic:nvPicPr>
                   <pic:blipFill>
@@ -969,7 +969,7 @@
                   <pic:spPr>
                     <a:xfrm>
                       <a:off x="0" y="0"/>
-                      <a:ext cx="6629400" cy="3366090"/>
+                      <a:ext cx="6629400" cy="1092815"/>
                     </a:xfrm>
                     <a:prstGeom prst="rect"/>
                   </pic:spPr>
@@ -983,6 +983,51 @@
     <w:p>
       <w:pPr>
         <w:pStyle w:val="BodyText"/>
+        <w:keepLines/>
+        <w:spacing w:after="100"/>
+        <w:jc w:val="center"/>
+      </w:pPr>
+      <w:r>
+        <w:rPr>
+          <w:sz w:val="2"/>
+        </w:rPr>
+        <w:drawing>
+          <wp:inline xmlns:a="http://schemas.openxmlformats.org/drawingml/2006/main" xmlns:pic="http://schemas.openxmlformats.org/drawingml/2006/picture">
+            <wp:extent cx="6629400" cy="1315522"/>
+            <wp:docPr id="383526901" name="Picture 383526901"/>
+            <wp:cNvGraphicFramePr>
+              <a:graphicFrameLocks noChangeAspect="1"/>
+            </wp:cNvGraphicFramePr>
+            <a:graphic>
+              <a:graphicData uri="http://schemas.openxmlformats.org/drawingml/2006/picture">
+                <pic:pic>
+                  <pic:nvPicPr>
+                    <pic:cNvPr id="0" name="q1_green_stages.png"/>
+                    <pic:cNvPicPr/>
+                  </pic:nvPicPr>
+                  <pic:blipFill>
+                    <a:blip r:embed="rId15"/>
+                    <a:stretch>
+                      <a:fillRect/>
+                    </a:stretch>
+                  </pic:blipFill>
+                  <pic:spPr>
+                    <a:xfrm>
+                      <a:off x="0" y="0"/>
+                      <a:ext cx="6629400" cy="1315522"/>
+                    </a:xfrm>
+                    <a:prstGeom prst="rect"/>
+                  </pic:spPr>
+                </pic:pic>
+              </a:graphicData>
+            </a:graphic>
+          </wp:inline>
+        </w:drawing>
+      </w:r>
+    </w:p>
+    <w:p>
+      <w:pPr>
+        <w:pStyle w:val="BodyText"/>
         <w:keepNext w:val="0"/>
         <w:keepLines/>
       </w:pPr>
@@ -993,7 +1038,7 @@
           <w:color w:val="000000"/>
           <w:sz w:val="40"/>
         </w:rPr>
-        <w:t>The successful release is Jenkins build #4, using pdgamersg/assessment9-lms:v2-4.</w:t>
+        <w:t>The green rows show successful builds #4, #3 and #2. Build #4 uses pdgamersg/assessment9-lms:v2-4.</w:t>
       </w:r>
     </w:p>
     <w:p>
@@ -1026,7 +1071,7 @@
         <w:drawing>
           <wp:inline xmlns:a="http://schemas.openxmlformats.org/drawingml/2006/main" xmlns:pic="http://schemas.openxmlformats.org/drawingml/2006/picture">
             <wp:extent cx="6629400" cy="1276773"/>
-            <wp:docPr id="383526901" name="Picture 383526901"/>
+            <wp:docPr id="383526902" name="Picture 383526902"/>
             <wp:cNvGraphicFramePr>
               <a:graphicFrameLocks noChangeAspect="1"/>
             </wp:cNvGraphicFramePr>
@@ -1038,7 +1083,7 @@
                     <pic:cNvPicPr/>
                   </pic:nvPicPr>
                   <pic:blipFill>
-                    <a:blip r:embed="rId15"/>
+                    <a:blip r:embed="rId16"/>
                     <a:stretch>
                       <a:fillRect/>
                     </a:stretch>
@@ -1104,7 +1149,7 @@
         <w:drawing>
           <wp:inline xmlns:a="http://schemas.openxmlformats.org/drawingml/2006/main" xmlns:pic="http://schemas.openxmlformats.org/drawingml/2006/picture">
             <wp:extent cx="6524897" cy="3383280"/>
-            <wp:docPr id="383526902" name="Picture 383526902"/>
+            <wp:docPr id="383526903" name="Picture 383526903"/>
             <wp:cNvGraphicFramePr>
               <a:graphicFrameLocks noChangeAspect="1"/>
             </wp:cNvGraphicFramePr>
@@ -1116,7 +1161,7 @@
                     <pic:cNvPicPr/>
                   </pic:nvPicPr>
                   <pic:blipFill>
-                    <a:blip r:embed="rId16"/>
+                    <a:blip r:embed="rId17"/>
                     <a:stretch>
                       <a:fillRect/>
                     </a:stretch>
@@ -1165,7 +1210,7 @@
         <w:drawing>
           <wp:inline xmlns:a="http://schemas.openxmlformats.org/drawingml/2006/main" xmlns:pic="http://schemas.openxmlformats.org/drawingml/2006/picture">
             <wp:extent cx="6172200" cy="2377440"/>
-            <wp:docPr id="383526903" name="Picture 383526903"/>
+            <wp:docPr id="383526904" name="Picture 383526904"/>
             <wp:cNvGraphicFramePr>
               <a:graphicFrameLocks noChangeAspect="1"/>
             </wp:cNvGraphicFramePr>
@@ -1177,7 +1222,7 @@
                     <pic:cNvPicPr/>
                   </pic:nvPicPr>
                   <pic:blipFill>
-                    <a:blip r:embed="rId17"/>
+                    <a:blip r:embed="rId18"/>
                     <a:stretch>
                       <a:fillRect/>
                     </a:stretch>
@@ -1243,7 +1288,7 @@
         <w:drawing>
           <wp:inline xmlns:a="http://schemas.openxmlformats.org/drawingml/2006/main" xmlns:pic="http://schemas.openxmlformats.org/drawingml/2006/picture">
             <wp:extent cx="6629400" cy="5705427"/>
-            <wp:docPr id="383526904" name="Picture 383526904"/>
+            <wp:docPr id="383526905" name="Picture 383526905"/>
             <wp:cNvGraphicFramePr>
               <a:graphicFrameLocks noChangeAspect="1"/>
             </wp:cNvGraphicFramePr>
@@ -1255,7 +1300,7 @@
                     <pic:cNvPicPr/>
                   </pic:nvPicPr>
                   <pic:blipFill>
-                    <a:blip r:embed="rId18"/>
+                    <a:blip r:embed="rId19"/>
                     <a:stretch>
                       <a:fillRect/>
                     </a:stretch>
@@ -1353,7 +1398,7 @@
         <w:drawing>
           <wp:inline xmlns:a="http://schemas.openxmlformats.org/drawingml/2006/main" xmlns:pic="http://schemas.openxmlformats.org/drawingml/2006/picture">
             <wp:extent cx="6629400" cy="940292"/>
-            <wp:docPr id="383526905" name="Picture 383526905"/>
+            <wp:docPr id="383526906" name="Picture 383526906"/>
             <wp:cNvGraphicFramePr>
               <a:graphicFrameLocks noChangeAspect="1"/>
             </wp:cNvGraphicFramePr>
@@ -1365,7 +1410,7 @@
                     <pic:cNvPicPr/>
                   </pic:nvPicPr>
                   <pic:blipFill>
-                    <a:blip r:embed="rId19"/>
+                    <a:blip r:embed="rId20"/>
                     <a:stretch>
                       <a:fillRect/>
                     </a:stretch>
@@ -1414,7 +1459,7 @@
         <w:drawing>
           <wp:inline xmlns:a="http://schemas.openxmlformats.org/drawingml/2006/main" xmlns:pic="http://schemas.openxmlformats.org/drawingml/2006/picture">
             <wp:extent cx="6629400" cy="2693194"/>
-            <wp:docPr id="383526906" name="Picture 383526906"/>
+            <wp:docPr id="383526907" name="Picture 383526907"/>
             <wp:cNvGraphicFramePr>
               <a:graphicFrameLocks noChangeAspect="1"/>
             </wp:cNvGraphicFramePr>
@@ -1426,7 +1471,7 @@
                     <pic:cNvPicPr/>
                   </pic:nvPicPr>
                   <pic:blipFill>
-                    <a:blip r:embed="rId20"/>
+                    <a:blip r:embed="rId21"/>
                     <a:stretch>
                       <a:fillRect/>
                     </a:stretch>
@@ -1448,23 +1493,6 @@
     <w:p>
       <w:pPr>
         <w:pStyle w:val="BodyText"/>
-        <w:keepNext/>
-        <w:keepLines/>
-        <w:pageBreakBefore/>
-      </w:pPr>
-      <w:r>
-        <w:rPr>
-          <w:rFonts w:ascii="Times New Roman" w:hAnsi="Times New Roman"/>
-          <w:b w:val="0"/>
-          <w:color w:val="000000"/>
-          <w:sz w:val="40"/>
-        </w:rPr>
-        <w:t>Step 8: Failed rollout and automatic rollback</w:t>
-      </w:r>
-    </w:p>
-    <w:p>
-      <w:pPr>
-        <w:pStyle w:val="BodyText"/>
         <w:keepNext w:val="0"/>
         <w:keepLines/>
       </w:pPr>
@@ -1475,268 +1503,7 @@
           <w:color w:val="000000"/>
           <w:sz w:val="40"/>
         </w:rPr>
-        <w:t>The faulty image returned HTTP 503 at /healthz. Its root-page test passed, and Kubernetes readiness rejected the release.</w:t>
-      </w:r>
-    </w:p>
-    <w:p>
-      <w:pPr>
-        <w:pStyle w:val="BodyText"/>
-        <w:keepNext w:val="0"/>
-        <w:keepLines/>
-      </w:pPr>
-      <w:r>
-        <w:rPr>
-          <w:rFonts w:ascii="Times New Roman" w:hAnsi="Times New Roman"/>
-          <w:b w:val="0"/>
-          <w:color w:val="000000"/>
-          <w:sz w:val="40"/>
-        </w:rPr>
-        <w:t>Build #5 used pdgamersg/assessment9-lms:broken-5. The FAILURE result is expected.</w:t>
-      </w:r>
-    </w:p>
-    <w:p>
-      <w:pPr>
-        <w:pStyle w:val="BodyText"/>
-        <w:keepLines/>
-        <w:spacing w:after="100"/>
-        <w:jc w:val="center"/>
-      </w:pPr>
-      <w:r>
-        <w:rPr>
-          <w:sz w:val="2"/>
-        </w:rPr>
-        <w:drawing>
-          <wp:inline xmlns:a="http://schemas.openxmlformats.org/drawingml/2006/main" xmlns:pic="http://schemas.openxmlformats.org/drawingml/2006/picture">
-            <wp:extent cx="6122989" cy="3108959"/>
-            <wp:docPr id="383526907" name="Picture 383526907"/>
-            <wp:cNvGraphicFramePr>
-              <a:graphicFrameLocks noChangeAspect="1"/>
-            </wp:cNvGraphicFramePr>
-            <a:graphic>
-              <a:graphicData uri="http://schemas.openxmlformats.org/drawingml/2006/picture">
-                <pic:pic>
-                  <pic:nvPicPr>
-                    <pic:cNvPr id="0" name="q1_stages.png"/>
-                    <pic:cNvPicPr/>
-                  </pic:nvPicPr>
-                  <pic:blipFill>
-                    <a:blip r:embed="rId14"/>
-                    <a:stretch>
-                      <a:fillRect/>
-                    </a:stretch>
-                  </pic:blipFill>
-                  <pic:spPr>
-                    <a:xfrm>
-                      <a:off x="0" y="0"/>
-                      <a:ext cx="6122989" cy="3108959"/>
-                    </a:xfrm>
-                    <a:prstGeom prst="rect"/>
-                  </pic:spPr>
-                </pic:pic>
-              </a:graphicData>
-            </a:graphic>
-          </wp:inline>
-        </w:drawing>
-      </w:r>
-    </w:p>
-    <w:p>
-      <w:pPr>
-        <w:pStyle w:val="BodyText"/>
-        <w:keepNext w:val="0"/>
-        <w:keepLines/>
-      </w:pPr>
-      <w:r>
-        <w:rPr>
-          <w:rFonts w:ascii="Times New Roman" w:hAnsi="Times New Roman"/>
-          <w:b w:val="0"/>
-          <w:color w:val="000000"/>
-          <w:sz w:val="40"/>
-        </w:rPr>
-        <w:t>Jenkins ran kubectl rollout undo and verified that the exact previous stable image was restored.</w:t>
-      </w:r>
-    </w:p>
-    <w:p>
-      <w:pPr>
-        <w:pStyle w:val="BodyText"/>
-        <w:keepLines/>
-        <w:spacing w:after="100"/>
-        <w:jc w:val="center"/>
-      </w:pPr>
-      <w:r>
-        <w:rPr>
-          <w:sz w:val="2"/>
-        </w:rPr>
-        <w:drawing>
-          <wp:inline xmlns:a="http://schemas.openxmlformats.org/drawingml/2006/main" xmlns:pic="http://schemas.openxmlformats.org/drawingml/2006/picture">
-            <wp:extent cx="6629400" cy="1620520"/>
-            <wp:docPr id="383526908" name="Picture 383526908"/>
-            <wp:cNvGraphicFramePr>
-              <a:graphicFrameLocks noChangeAspect="1"/>
-            </wp:cNvGraphicFramePr>
-            <a:graphic>
-              <a:graphicData uri="http://schemas.openxmlformats.org/drawingml/2006/picture">
-                <pic:pic>
-                  <pic:nvPicPr>
-                    <pic:cNvPr id="0" name="q1_rollback.png"/>
-                    <pic:cNvPicPr/>
-                  </pic:nvPicPr>
-                  <pic:blipFill>
-                    <a:blip r:embed="rId21"/>
-                    <a:stretch>
-                      <a:fillRect/>
-                    </a:stretch>
-                  </pic:blipFill>
-                  <pic:spPr>
-                    <a:xfrm>
-                      <a:off x="0" y="0"/>
-                      <a:ext cx="6629400" cy="1620520"/>
-                    </a:xfrm>
-                    <a:prstGeom prst="rect"/>
-                  </pic:spPr>
-                </pic:pic>
-              </a:graphicData>
-            </a:graphic>
-          </wp:inline>
-        </w:drawing>
-      </w:r>
-    </w:p>
-    <w:p>
-      <w:pPr>
-        <w:pStyle w:val="BodyText"/>
-        <w:keepNext/>
-        <w:keepLines/>
-        <w:pageBreakBefore/>
-      </w:pPr>
-      <w:r>
-        <w:rPr>
-          <w:rFonts w:ascii="Times New Roman" w:hAnsi="Times New Roman"/>
-          <w:b w:val="0"/>
-          <w:color w:val="000000"/>
-          <w:sz w:val="40"/>
-        </w:rPr>
-        <w:t>Output after rollback:</w:t>
-      </w:r>
-    </w:p>
-    <w:p>
-      <w:pPr>
-        <w:pStyle w:val="BodyText"/>
-        <w:keepNext w:val="0"/>
-        <w:keepLines/>
-      </w:pPr>
-      <w:r>
-        <w:rPr>
-          <w:rFonts w:ascii="Times New Roman" w:hAnsi="Times New Roman"/>
-          <w:b w:val="0"/>
-          <w:color w:val="000000"/>
-          <w:sz w:val="40"/>
-        </w:rPr>
-        <w:t>The restored NodePort returned HTTP 200. All 2 serving Pods were Running and Ready, and the page still matched the stable Git source.</w:t>
-      </w:r>
-    </w:p>
-    <w:p>
-      <w:pPr>
-        <w:pStyle w:val="BodyText"/>
-        <w:keepLines/>
-        <w:spacing w:after="100"/>
-        <w:jc w:val="center"/>
-      </w:pPr>
-      <w:r>
-        <w:rPr>
-          <w:sz w:val="2"/>
-        </w:rPr>
-        <w:drawing>
-          <wp:inline xmlns:a="http://schemas.openxmlformats.org/drawingml/2006/main" xmlns:pic="http://schemas.openxmlformats.org/drawingml/2006/picture">
-            <wp:extent cx="5290457" cy="2743200"/>
-            <wp:docPr id="383526909" name="Picture 383526909"/>
-            <wp:cNvGraphicFramePr>
-              <a:graphicFrameLocks noChangeAspect="1"/>
-            </wp:cNvGraphicFramePr>
-            <a:graphic>
-              <a:graphicData uri="http://schemas.openxmlformats.org/drawingml/2006/picture">
-                <pic:pic>
-                  <pic:nvPicPr>
-                    <pic:cNvPr id="0" name="q1_recovered_verification.png"/>
-                    <pic:cNvPicPr/>
-                  </pic:nvPicPr>
-                  <pic:blipFill>
-                    <a:blip r:embed="rId22"/>
-                    <a:stretch>
-                      <a:fillRect/>
-                    </a:stretch>
-                  </pic:blipFill>
-                  <pic:spPr>
-                    <a:xfrm>
-                      <a:off x="0" y="0"/>
-                      <a:ext cx="5290457" cy="2743200"/>
-                    </a:xfrm>
-                    <a:prstGeom prst="rect"/>
-                  </pic:spPr>
-                </pic:pic>
-              </a:graphicData>
-            </a:graphic>
-          </wp:inline>
-        </w:drawing>
-      </w:r>
-    </w:p>
-    <w:p>
-      <w:pPr>
-        <w:pStyle w:val="BodyText"/>
-        <w:keepLines/>
-        <w:spacing w:after="100"/>
-        <w:jc w:val="center"/>
-      </w:pPr>
-      <w:r>
-        <w:rPr>
-          <w:sz w:val="2"/>
-        </w:rPr>
-        <w:drawing>
-          <wp:inline xmlns:a="http://schemas.openxmlformats.org/drawingml/2006/main" xmlns:pic="http://schemas.openxmlformats.org/drawingml/2006/picture">
-            <wp:extent cx="6629400" cy="3452812"/>
-            <wp:docPr id="383526910" name="Picture 383526910"/>
-            <wp:cNvGraphicFramePr>
-              <a:graphicFrameLocks noChangeAspect="1"/>
-            </wp:cNvGraphicFramePr>
-            <a:graphic>
-              <a:graphicData uri="http://schemas.openxmlformats.org/drawingml/2006/picture">
-                <pic:pic>
-                  <pic:nvPicPr>
-                    <pic:cNvPr id="0" name="q1_restored.png"/>
-                    <pic:cNvPicPr/>
-                  </pic:nvPicPr>
-                  <pic:blipFill>
-                    <a:blip r:embed="rId23"/>
-                    <a:stretch>
-                      <a:fillRect/>
-                    </a:stretch>
-                  </pic:blipFill>
-                  <pic:spPr>
-                    <a:xfrm>
-                      <a:off x="0" y="0"/>
-                      <a:ext cx="6629400" cy="3452812"/>
-                    </a:xfrm>
-                    <a:prstGeom prst="rect"/>
-                  </pic:spPr>
-                </pic:pic>
-              </a:graphicData>
-            </a:graphic>
-          </wp:inline>
-        </w:drawing>
-      </w:r>
-    </w:p>
-    <w:p>
-      <w:pPr>
-        <w:pStyle w:val="BodyText"/>
-        <w:keepNext w:val="0"/>
-        <w:keepLines/>
-      </w:pPr>
-      <w:r>
-        <w:rPr>
-          <w:rFonts w:ascii="Times New Roman" w:hAnsi="Times New Roman"/>
-          <w:b w:val="0"/>
-          <w:color w:val="000000"/>
-          <w:sz w:val="40"/>
-        </w:rPr>
-        <w:t>Result: Deployment, update and automatic recovery were verified successfully.</w:t>
+        <w:t>Result: The updated application was deployed successfully and verified through its assigned NodePort.</w:t>
       </w:r>
     </w:p>
     <w:p>
@@ -1770,7 +1537,7 @@
         <w:drawing>
           <wp:inline xmlns:a="http://schemas.openxmlformats.org/drawingml/2006/main" xmlns:pic="http://schemas.openxmlformats.org/drawingml/2006/picture">
             <wp:extent cx="6400800" cy="5604134"/>
-            <wp:docPr id="383526911" name="Picture 383526911"/>
+            <wp:docPr id="383526908" name="Picture 383526908"/>
             <wp:cNvGraphicFramePr>
               <a:graphicFrameLocks noChangeAspect="1"/>
             </wp:cNvGraphicFramePr>
@@ -1782,7 +1549,7 @@
                     <pic:cNvPicPr/>
                   </pic:nvPicPr>
                   <pic:blipFill>
-                    <a:blip r:embed="rId24"/>
+                    <a:blip r:embed="rId22"/>
                     <a:stretch>
                       <a:fillRect/>
                     </a:stretch>
@@ -2111,7 +1878,7 @@
         <w:drawing>
           <wp:inline xmlns:a="http://schemas.openxmlformats.org/drawingml/2006/main" xmlns:pic="http://schemas.openxmlformats.org/drawingml/2006/picture">
             <wp:extent cx="4458788" cy="2926080"/>
-            <wp:docPr id="383526912" name="Picture 383526912"/>
+            <wp:docPr id="383526909" name="Picture 383526909"/>
             <wp:cNvGraphicFramePr>
               <a:graphicFrameLocks noChangeAspect="1"/>
             </wp:cNvGraphicFramePr>
@@ -2123,7 +1890,7 @@
                     <pic:cNvPicPr/>
                   </pic:nvPicPr>
                   <pic:blipFill>
-                    <a:blip r:embed="rId25"/>
+                    <a:blip r:embed="rId23"/>
                     <a:stretch>
                       <a:fillRect/>
                     </a:stretch>
@@ -2226,7 +1993,7 @@
         <w:drawing>
           <wp:inline xmlns:a="http://schemas.openxmlformats.org/drawingml/2006/main" xmlns:pic="http://schemas.openxmlformats.org/drawingml/2006/picture">
             <wp:extent cx="6629400" cy="4557712"/>
-            <wp:docPr id="383526913" name="Picture 383526913"/>
+            <wp:docPr id="383526910" name="Picture 383526910"/>
             <wp:cNvGraphicFramePr>
               <a:graphicFrameLocks noChangeAspect="1"/>
             </wp:cNvGraphicFramePr>
@@ -2238,7 +2005,7 @@
                     <pic:cNvPicPr/>
                   </pic:nvPicPr>
                   <pic:blipFill>
-                    <a:blip r:embed="rId26"/>
+                    <a:blip r:embed="rId24"/>
                     <a:stretch>
                       <a:fillRect/>
                     </a:stretch>
@@ -2303,7 +2070,7 @@
           <w:color w:val="000000"/>
           <w:sz w:val="40"/>
         </w:rPr>
-        <w:t>The script path is food-portal/Jenkinsfile. APP selects the portal, RELEASE sets the tag prefix, and FAULTY enables the deliberate failure.</w:t>
+        <w:t>The script path is food-portal/Jenkinsfile. APP selects the portal, and RELEASE sets the image tag prefix.</w:t>
       </w:r>
     </w:p>
     <w:p>
@@ -2320,7 +2087,7 @@
         <w:drawing>
           <wp:inline xmlns:a="http://schemas.openxmlformats.org/drawingml/2006/main" xmlns:pic="http://schemas.openxmlformats.org/drawingml/2006/picture">
             <wp:extent cx="5235677" cy="2286000"/>
-            <wp:docPr id="383526914" name="Picture 383526914"/>
+            <wp:docPr id="383526911" name="Picture 383526911"/>
             <wp:cNvGraphicFramePr>
               <a:graphicFrameLocks noChangeAspect="1"/>
             </wp:cNvGraphicFramePr>
@@ -2365,7 +2132,7 @@
         <w:drawing>
           <wp:inline xmlns:a="http://schemas.openxmlformats.org/drawingml/2006/main" xmlns:pic="http://schemas.openxmlformats.org/drawingml/2006/picture">
             <wp:extent cx="5801015" cy="3474720"/>
-            <wp:docPr id="383526915" name="Picture 383526915"/>
+            <wp:docPr id="383526912" name="Picture 383526912"/>
             <wp:cNvGraphicFramePr>
               <a:graphicFrameLocks noChangeAspect="1"/>
             </wp:cNvGraphicFramePr>
@@ -2442,8 +2209,8 @@
         </w:rPr>
         <w:drawing>
           <wp:inline xmlns:a="http://schemas.openxmlformats.org/drawingml/2006/main" xmlns:pic="http://schemas.openxmlformats.org/drawingml/2006/picture">
-            <wp:extent cx="6629400" cy="3366090"/>
-            <wp:docPr id="383526916" name="Picture 383526916"/>
+            <wp:extent cx="6629400" cy="1092815"/>
+            <wp:docPr id="383526913" name="Picture 383526913"/>
             <wp:cNvGraphicFramePr>
               <a:graphicFrameLocks noChangeAspect="1"/>
             </wp:cNvGraphicFramePr>
@@ -2451,11 +2218,11 @@
               <a:graphicData uri="http://schemas.openxmlformats.org/drawingml/2006/picture">
                 <pic:pic>
                   <pic:nvPicPr>
-                    <pic:cNvPr id="0" name="q2_stages.png"/>
+                    <pic:cNvPr id="0" name="q2_stage_header.png"/>
                     <pic:cNvPicPr/>
                   </pic:nvPicPr>
                   <pic:blipFill>
-                    <a:blip r:embed="rId27"/>
+                    <a:blip r:embed="rId25"/>
                     <a:stretch>
                       <a:fillRect/>
                     </a:stretch>
@@ -2463,7 +2230,7 @@
                   <pic:spPr>
                     <a:xfrm>
                       <a:off x="0" y="0"/>
-                      <a:ext cx="6629400" cy="3366090"/>
+                      <a:ext cx="6629400" cy="1092815"/>
                     </a:xfrm>
                     <a:prstGeom prst="rect"/>
                   </pic:spPr>
@@ -2477,6 +2244,51 @@
     <w:p>
       <w:pPr>
         <w:pStyle w:val="BodyText"/>
+        <w:keepLines/>
+        <w:spacing w:after="100"/>
+        <w:jc w:val="center"/>
+      </w:pPr>
+      <w:r>
+        <w:rPr>
+          <w:sz w:val="2"/>
+        </w:rPr>
+        <w:drawing>
+          <wp:inline xmlns:a="http://schemas.openxmlformats.org/drawingml/2006/main" xmlns:pic="http://schemas.openxmlformats.org/drawingml/2006/picture">
+            <wp:extent cx="6629400" cy="1315522"/>
+            <wp:docPr id="383526914" name="Picture 383526914"/>
+            <wp:cNvGraphicFramePr>
+              <a:graphicFrameLocks noChangeAspect="1"/>
+            </wp:cNvGraphicFramePr>
+            <a:graphic>
+              <a:graphicData uri="http://schemas.openxmlformats.org/drawingml/2006/picture">
+                <pic:pic>
+                  <pic:nvPicPr>
+                    <pic:cNvPr id="0" name="q2_green_stages.png"/>
+                    <pic:cNvPicPr/>
+                  </pic:nvPicPr>
+                  <pic:blipFill>
+                    <a:blip r:embed="rId26"/>
+                    <a:stretch>
+                      <a:fillRect/>
+                    </a:stretch>
+                  </pic:blipFill>
+                  <pic:spPr>
+                    <a:xfrm>
+                      <a:off x="0" y="0"/>
+                      <a:ext cx="6629400" cy="1315522"/>
+                    </a:xfrm>
+                    <a:prstGeom prst="rect"/>
+                  </pic:spPr>
+                </pic:pic>
+              </a:graphicData>
+            </a:graphic>
+          </wp:inline>
+        </w:drawing>
+      </w:r>
+    </w:p>
+    <w:p>
+      <w:pPr>
+        <w:pStyle w:val="BodyText"/>
         <w:keepNext w:val="0"/>
         <w:keepLines/>
       </w:pPr>
@@ -2487,7 +2299,7 @@
           <w:color w:val="000000"/>
           <w:sz w:val="40"/>
         </w:rPr>
-        <w:t>The successful release is Jenkins build #4, using pdgamersg/assessment9-food:v2-4.</w:t>
+        <w:t>The green rows show successful builds #4, #3 and #2. Build #4 uses pdgamersg/assessment9-food:v2-4.</w:t>
       </w:r>
     </w:p>
     <w:p>
@@ -2520,7 +2332,7 @@
         <w:drawing>
           <wp:inline xmlns:a="http://schemas.openxmlformats.org/drawingml/2006/main" xmlns:pic="http://schemas.openxmlformats.org/drawingml/2006/picture">
             <wp:extent cx="6629400" cy="1276773"/>
-            <wp:docPr id="383526917" name="Picture 383526917"/>
+            <wp:docPr id="383526915" name="Picture 383526915"/>
             <wp:cNvGraphicFramePr>
               <a:graphicFrameLocks noChangeAspect="1"/>
             </wp:cNvGraphicFramePr>
@@ -2532,7 +2344,7 @@
                     <pic:cNvPicPr/>
                   </pic:nvPicPr>
                   <pic:blipFill>
-                    <a:blip r:embed="rId28"/>
+                    <a:blip r:embed="rId27"/>
                     <a:stretch>
                       <a:fillRect/>
                     </a:stretch>
@@ -2598,7 +2410,7 @@
         <w:drawing>
           <wp:inline xmlns:a="http://schemas.openxmlformats.org/drawingml/2006/main" xmlns:pic="http://schemas.openxmlformats.org/drawingml/2006/picture">
             <wp:extent cx="6524897" cy="3383280"/>
-            <wp:docPr id="383526918" name="Picture 383526918"/>
+            <wp:docPr id="383526916" name="Picture 383526916"/>
             <wp:cNvGraphicFramePr>
               <a:graphicFrameLocks noChangeAspect="1"/>
             </wp:cNvGraphicFramePr>
@@ -2610,7 +2422,7 @@
                     <pic:cNvPicPr/>
                   </pic:nvPicPr>
                   <pic:blipFill>
-                    <a:blip r:embed="rId29"/>
+                    <a:blip r:embed="rId28"/>
                     <a:stretch>
                       <a:fillRect/>
                     </a:stretch>
@@ -2659,7 +2471,7 @@
         <w:drawing>
           <wp:inline xmlns:a="http://schemas.openxmlformats.org/drawingml/2006/main" xmlns:pic="http://schemas.openxmlformats.org/drawingml/2006/picture">
             <wp:extent cx="6172200" cy="2377440"/>
-            <wp:docPr id="383526919" name="Picture 383526919"/>
+            <wp:docPr id="383526917" name="Picture 383526917"/>
             <wp:cNvGraphicFramePr>
               <a:graphicFrameLocks noChangeAspect="1"/>
             </wp:cNvGraphicFramePr>
@@ -2671,7 +2483,7 @@
                     <pic:cNvPicPr/>
                   </pic:nvPicPr>
                   <pic:blipFill>
-                    <a:blip r:embed="rId30"/>
+                    <a:blip r:embed="rId29"/>
                     <a:stretch>
                       <a:fillRect/>
                     </a:stretch>
@@ -2737,7 +2549,7 @@
         <w:drawing>
           <wp:inline xmlns:a="http://schemas.openxmlformats.org/drawingml/2006/main" xmlns:pic="http://schemas.openxmlformats.org/drawingml/2006/picture">
             <wp:extent cx="6219594" cy="5943600"/>
-            <wp:docPr id="383526920" name="Picture 383526920"/>
+            <wp:docPr id="383526918" name="Picture 383526918"/>
             <wp:cNvGraphicFramePr>
               <a:graphicFrameLocks noChangeAspect="1"/>
             </wp:cNvGraphicFramePr>
@@ -2749,7 +2561,7 @@
                     <pic:cNvPicPr/>
                   </pic:nvPicPr>
                   <pic:blipFill>
-                    <a:blip r:embed="rId31"/>
+                    <a:blip r:embed="rId30"/>
                     <a:stretch>
                       <a:fillRect/>
                     </a:stretch>
@@ -2847,7 +2659,7 @@
         <w:drawing>
           <wp:inline xmlns:a="http://schemas.openxmlformats.org/drawingml/2006/main" xmlns:pic="http://schemas.openxmlformats.org/drawingml/2006/picture">
             <wp:extent cx="6629400" cy="1089116"/>
-            <wp:docPr id="383526921" name="Picture 383526921"/>
+            <wp:docPr id="383526919" name="Picture 383526919"/>
             <wp:cNvGraphicFramePr>
               <a:graphicFrameLocks noChangeAspect="1"/>
             </wp:cNvGraphicFramePr>
@@ -2859,7 +2671,7 @@
                     <pic:cNvPicPr/>
                   </pic:nvPicPr>
                   <pic:blipFill>
-                    <a:blip r:embed="rId32"/>
+                    <a:blip r:embed="rId31"/>
                     <a:stretch>
                       <a:fillRect/>
                     </a:stretch>
@@ -2908,7 +2720,7 @@
         <w:drawing>
           <wp:inline xmlns:a="http://schemas.openxmlformats.org/drawingml/2006/main" xmlns:pic="http://schemas.openxmlformats.org/drawingml/2006/picture">
             <wp:extent cx="6172200" cy="2743200"/>
-            <wp:docPr id="383526922" name="Picture 383526922"/>
+            <wp:docPr id="383526920" name="Picture 383526920"/>
             <wp:cNvGraphicFramePr>
               <a:graphicFrameLocks noChangeAspect="1"/>
             </wp:cNvGraphicFramePr>
@@ -2920,7 +2732,7 @@
                     <pic:cNvPicPr/>
                   </pic:nvPicPr>
                   <pic:blipFill>
-                    <a:blip r:embed="rId33"/>
+                    <a:blip r:embed="rId32"/>
                     <a:stretch>
                       <a:fillRect/>
                     </a:stretch>
@@ -2942,23 +2754,6 @@
     <w:p>
       <w:pPr>
         <w:pStyle w:val="BodyText"/>
-        <w:keepNext/>
-        <w:keepLines/>
-        <w:pageBreakBefore/>
-      </w:pPr>
-      <w:r>
-        <w:rPr>
-          <w:rFonts w:ascii="Times New Roman" w:hAnsi="Times New Roman"/>
-          <w:b w:val="0"/>
-          <w:color w:val="000000"/>
-          <w:sz w:val="40"/>
-        </w:rPr>
-        <w:t>Step 8: Failed rollout and automatic rollback</w:t>
-      </w:r>
-    </w:p>
-    <w:p>
-      <w:pPr>
-        <w:pStyle w:val="BodyText"/>
         <w:keepNext w:val="0"/>
         <w:keepLines/>
       </w:pPr>
@@ -2969,268 +2764,7 @@
           <w:color w:val="000000"/>
           <w:sz w:val="40"/>
         </w:rPr>
-        <w:t>The faulty image returned HTTP 503 at /healthz. Its root-page test passed, and Kubernetes readiness rejected the release.</w:t>
-      </w:r>
-    </w:p>
-    <w:p>
-      <w:pPr>
-        <w:pStyle w:val="BodyText"/>
-        <w:keepNext w:val="0"/>
-        <w:keepLines/>
-      </w:pPr>
-      <w:r>
-        <w:rPr>
-          <w:rFonts w:ascii="Times New Roman" w:hAnsi="Times New Roman"/>
-          <w:b w:val="0"/>
-          <w:color w:val="000000"/>
-          <w:sz w:val="40"/>
-        </w:rPr>
-        <w:t>Build #5 used pdgamersg/assessment9-food:broken-5. The FAILURE result is expected.</w:t>
-      </w:r>
-    </w:p>
-    <w:p>
-      <w:pPr>
-        <w:pStyle w:val="BodyText"/>
-        <w:keepLines/>
-        <w:spacing w:after="100"/>
-        <w:jc w:val="center"/>
-      </w:pPr>
-      <w:r>
-        <w:rPr>
-          <w:sz w:val="2"/>
-        </w:rPr>
-        <w:drawing>
-          <wp:inline xmlns:a="http://schemas.openxmlformats.org/drawingml/2006/main" xmlns:pic="http://schemas.openxmlformats.org/drawingml/2006/picture">
-            <wp:extent cx="6122989" cy="3108959"/>
-            <wp:docPr id="383526923" name="Picture 383526923"/>
-            <wp:cNvGraphicFramePr>
-              <a:graphicFrameLocks noChangeAspect="1"/>
-            </wp:cNvGraphicFramePr>
-            <a:graphic>
-              <a:graphicData uri="http://schemas.openxmlformats.org/drawingml/2006/picture">
-                <pic:pic>
-                  <pic:nvPicPr>
-                    <pic:cNvPr id="0" name="q2_stages.png"/>
-                    <pic:cNvPicPr/>
-                  </pic:nvPicPr>
-                  <pic:blipFill>
-                    <a:blip r:embed="rId27"/>
-                    <a:stretch>
-                      <a:fillRect/>
-                    </a:stretch>
-                  </pic:blipFill>
-                  <pic:spPr>
-                    <a:xfrm>
-                      <a:off x="0" y="0"/>
-                      <a:ext cx="6122989" cy="3108959"/>
-                    </a:xfrm>
-                    <a:prstGeom prst="rect"/>
-                  </pic:spPr>
-                </pic:pic>
-              </a:graphicData>
-            </a:graphic>
-          </wp:inline>
-        </w:drawing>
-      </w:r>
-    </w:p>
-    <w:p>
-      <w:pPr>
-        <w:pStyle w:val="BodyText"/>
-        <w:keepNext w:val="0"/>
-        <w:keepLines/>
-      </w:pPr>
-      <w:r>
-        <w:rPr>
-          <w:rFonts w:ascii="Times New Roman" w:hAnsi="Times New Roman"/>
-          <w:b w:val="0"/>
-          <w:color w:val="000000"/>
-          <w:sz w:val="40"/>
-        </w:rPr>
-        <w:t>Traffic stayed on stable blue. Jenkins restored the rejected green candidate to its previous image automatically.</w:t>
-      </w:r>
-    </w:p>
-    <w:p>
-      <w:pPr>
-        <w:pStyle w:val="BodyText"/>
-        <w:keepLines/>
-        <w:spacing w:after="100"/>
-        <w:jc w:val="center"/>
-      </w:pPr>
-      <w:r>
-        <w:rPr>
-          <w:sz w:val="2"/>
-        </w:rPr>
-        <w:drawing>
-          <wp:inline xmlns:a="http://schemas.openxmlformats.org/drawingml/2006/main" xmlns:pic="http://schemas.openxmlformats.org/drawingml/2006/picture">
-            <wp:extent cx="5822830" cy="2286000"/>
-            <wp:docPr id="383526924" name="Picture 383526924"/>
-            <wp:cNvGraphicFramePr>
-              <a:graphicFrameLocks noChangeAspect="1"/>
-            </wp:cNvGraphicFramePr>
-            <a:graphic>
-              <a:graphicData uri="http://schemas.openxmlformats.org/drawingml/2006/picture">
-                <pic:pic>
-                  <pic:nvPicPr>
-                    <pic:cNvPr id="0" name="q2_rollback.png"/>
-                    <pic:cNvPicPr/>
-                  </pic:nvPicPr>
-                  <pic:blipFill>
-                    <a:blip r:embed="rId34"/>
-                    <a:stretch>
-                      <a:fillRect/>
-                    </a:stretch>
-                  </pic:blipFill>
-                  <pic:spPr>
-                    <a:xfrm>
-                      <a:off x="0" y="0"/>
-                      <a:ext cx="5822830" cy="2286000"/>
-                    </a:xfrm>
-                    <a:prstGeom prst="rect"/>
-                  </pic:spPr>
-                </pic:pic>
-              </a:graphicData>
-            </a:graphic>
-          </wp:inline>
-        </w:drawing>
-      </w:r>
-    </w:p>
-    <w:p>
-      <w:pPr>
-        <w:pStyle w:val="BodyText"/>
-        <w:keepNext/>
-        <w:keepLines/>
-        <w:pageBreakBefore/>
-      </w:pPr>
-      <w:r>
-        <w:rPr>
-          <w:rFonts w:ascii="Times New Roman" w:hAnsi="Times New Roman"/>
-          <w:b w:val="0"/>
-          <w:color w:val="000000"/>
-          <w:sz w:val="40"/>
-        </w:rPr>
-        <w:t>Output after rollback:</w:t>
-      </w:r>
-    </w:p>
-    <w:p>
-      <w:pPr>
-        <w:pStyle w:val="BodyText"/>
-        <w:keepNext w:val="0"/>
-        <w:keepLines/>
-      </w:pPr>
-      <w:r>
-        <w:rPr>
-          <w:rFonts w:ascii="Times New Roman" w:hAnsi="Times New Roman"/>
-          <w:b w:val="0"/>
-          <w:color w:val="000000"/>
-          <w:sz w:val="40"/>
-        </w:rPr>
-        <w:t>The restored NodePort returned HTTP 200. All 3 serving Pods were Running and Ready, and the page still matched the stable Git source.</w:t>
-      </w:r>
-    </w:p>
-    <w:p>
-      <w:pPr>
-        <w:pStyle w:val="BodyText"/>
-        <w:keepLines/>
-        <w:spacing w:after="100"/>
-        <w:jc w:val="center"/>
-      </w:pPr>
-      <w:r>
-        <w:rPr>
-          <w:sz w:val="2"/>
-        </w:rPr>
-        <w:drawing>
-          <wp:inline xmlns:a="http://schemas.openxmlformats.org/drawingml/2006/main" xmlns:pic="http://schemas.openxmlformats.org/drawingml/2006/picture">
-            <wp:extent cx="5290457" cy="2743200"/>
-            <wp:docPr id="383526925" name="Picture 383526925"/>
-            <wp:cNvGraphicFramePr>
-              <a:graphicFrameLocks noChangeAspect="1"/>
-            </wp:cNvGraphicFramePr>
-            <a:graphic>
-              <a:graphicData uri="http://schemas.openxmlformats.org/drawingml/2006/picture">
-                <pic:pic>
-                  <pic:nvPicPr>
-                    <pic:cNvPr id="0" name="q2_recovered_verification.png"/>
-                    <pic:cNvPicPr/>
-                  </pic:nvPicPr>
-                  <pic:blipFill>
-                    <a:blip r:embed="rId35"/>
-                    <a:stretch>
-                      <a:fillRect/>
-                    </a:stretch>
-                  </pic:blipFill>
-                  <pic:spPr>
-                    <a:xfrm>
-                      <a:off x="0" y="0"/>
-                      <a:ext cx="5290457" cy="2743200"/>
-                    </a:xfrm>
-                    <a:prstGeom prst="rect"/>
-                  </pic:spPr>
-                </pic:pic>
-              </a:graphicData>
-            </a:graphic>
-          </wp:inline>
-        </w:drawing>
-      </w:r>
-    </w:p>
-    <w:p>
-      <w:pPr>
-        <w:pStyle w:val="BodyText"/>
-        <w:keepLines/>
-        <w:spacing w:after="100"/>
-        <w:jc w:val="center"/>
-      </w:pPr>
-      <w:r>
-        <w:rPr>
-          <w:sz w:val="2"/>
-        </w:rPr>
-        <w:drawing>
-          <wp:inline xmlns:a="http://schemas.openxmlformats.org/drawingml/2006/main" xmlns:pic="http://schemas.openxmlformats.org/drawingml/2006/picture">
-            <wp:extent cx="6629400" cy="3452812"/>
-            <wp:docPr id="383526926" name="Picture 383526926"/>
-            <wp:cNvGraphicFramePr>
-              <a:graphicFrameLocks noChangeAspect="1"/>
-            </wp:cNvGraphicFramePr>
-            <a:graphic>
-              <a:graphicData uri="http://schemas.openxmlformats.org/drawingml/2006/picture">
-                <pic:pic>
-                  <pic:nvPicPr>
-                    <pic:cNvPr id="0" name="q2_restored.png"/>
-                    <pic:cNvPicPr/>
-                  </pic:nvPicPr>
-                  <pic:blipFill>
-                    <a:blip r:embed="rId36"/>
-                    <a:stretch>
-                      <a:fillRect/>
-                    </a:stretch>
-                  </pic:blipFill>
-                  <pic:spPr>
-                    <a:xfrm>
-                      <a:off x="0" y="0"/>
-                      <a:ext cx="6629400" cy="3452812"/>
-                    </a:xfrm>
-                    <a:prstGeom prst="rect"/>
-                  </pic:spPr>
-                </pic:pic>
-              </a:graphicData>
-            </a:graphic>
-          </wp:inline>
-        </w:drawing>
-      </w:r>
-    </w:p>
-    <w:p>
-      <w:pPr>
-        <w:pStyle w:val="BodyText"/>
-        <w:keepNext w:val="0"/>
-        <w:keepLines/>
-      </w:pPr>
-      <w:r>
-        <w:rPr>
-          <w:rFonts w:ascii="Times New Roman" w:hAnsi="Times New Roman"/>
-          <w:b w:val="0"/>
-          <w:color w:val="000000"/>
-          <w:sz w:val="40"/>
-        </w:rPr>
-        <w:t>Result: Deployment, update and automatic recovery were verified successfully.</w:t>
+        <w:t>Result: The updated application was deployed successfully and verified through its assigned NodePort.</w:t>
       </w:r>
     </w:p>
     <w:p>
@@ -3264,7 +2798,7 @@
         <w:drawing>
           <wp:inline xmlns:a="http://schemas.openxmlformats.org/drawingml/2006/main" xmlns:pic="http://schemas.openxmlformats.org/drawingml/2006/picture">
             <wp:extent cx="6253113" cy="7635239"/>
-            <wp:docPr id="383526927" name="Picture 383526927"/>
+            <wp:docPr id="383526921" name="Picture 383526921"/>
             <wp:cNvGraphicFramePr>
               <a:graphicFrameLocks noChangeAspect="1"/>
             </wp:cNvGraphicFramePr>
@@ -3276,7 +2810,7 @@
                     <pic:cNvPicPr/>
                   </pic:nvPicPr>
                   <pic:blipFill>
-                    <a:blip r:embed="rId37"/>
+                    <a:blip r:embed="rId33"/>
                     <a:stretch>
                       <a:fillRect/>
                     </a:stretch>
@@ -3599,7 +3133,7 @@
         <w:drawing>
           <wp:inline xmlns:a="http://schemas.openxmlformats.org/drawingml/2006/main" xmlns:pic="http://schemas.openxmlformats.org/drawingml/2006/picture">
             <wp:extent cx="4458788" cy="2926080"/>
-            <wp:docPr id="383526928" name="Picture 383526928"/>
+            <wp:docPr id="383526922" name="Picture 383526922"/>
             <wp:cNvGraphicFramePr>
               <a:graphicFrameLocks noChangeAspect="1"/>
             </wp:cNvGraphicFramePr>
@@ -3611,7 +3145,7 @@
                     <pic:cNvPicPr/>
                   </pic:nvPicPr>
                   <pic:blipFill>
-                    <a:blip r:embed="rId38"/>
+                    <a:blip r:embed="rId34"/>
                     <a:stretch>
                       <a:fillRect/>
                     </a:stretch>
@@ -3714,7 +3248,7 @@
         <w:drawing>
           <wp:inline xmlns:a="http://schemas.openxmlformats.org/drawingml/2006/main" xmlns:pic="http://schemas.openxmlformats.org/drawingml/2006/picture">
             <wp:extent cx="6629400" cy="4557712"/>
-            <wp:docPr id="383526929" name="Picture 383526929"/>
+            <wp:docPr id="383526923" name="Picture 383526923"/>
             <wp:cNvGraphicFramePr>
               <a:graphicFrameLocks noChangeAspect="1"/>
             </wp:cNvGraphicFramePr>
@@ -3726,7 +3260,7 @@
                     <pic:cNvPicPr/>
                   </pic:nvPicPr>
                   <pic:blipFill>
-                    <a:blip r:embed="rId39"/>
+                    <a:blip r:embed="rId35"/>
                     <a:stretch>
                       <a:fillRect/>
                     </a:stretch>
@@ -3791,7 +3325,7 @@
           <w:color w:val="000000"/>
           <w:sz w:val="40"/>
         </w:rPr>
-        <w:t>The script path is hospital-portal/Jenkinsfile. APP selects the portal, RELEASE sets the tag prefix, and FAULTY enables the deliberate failure.</w:t>
+        <w:t>The script path is hospital-portal/Jenkinsfile. APP selects the portal, and RELEASE sets the image tag prefix.</w:t>
       </w:r>
     </w:p>
     <w:p>
@@ -3808,7 +3342,7 @@
         <w:drawing>
           <wp:inline xmlns:a="http://schemas.openxmlformats.org/drawingml/2006/main" xmlns:pic="http://schemas.openxmlformats.org/drawingml/2006/picture">
             <wp:extent cx="5235677" cy="2286000"/>
-            <wp:docPr id="383526930" name="Picture 383526930"/>
+            <wp:docPr id="383526924" name="Picture 383526924"/>
             <wp:cNvGraphicFramePr>
               <a:graphicFrameLocks noChangeAspect="1"/>
             </wp:cNvGraphicFramePr>
@@ -3853,7 +3387,7 @@
         <w:drawing>
           <wp:inline xmlns:a="http://schemas.openxmlformats.org/drawingml/2006/main" xmlns:pic="http://schemas.openxmlformats.org/drawingml/2006/picture">
             <wp:extent cx="5801015" cy="3474720"/>
-            <wp:docPr id="383526931" name="Picture 383526931"/>
+            <wp:docPr id="383526925" name="Picture 383526925"/>
             <wp:cNvGraphicFramePr>
               <a:graphicFrameLocks noChangeAspect="1"/>
             </wp:cNvGraphicFramePr>
@@ -3930,8 +3464,8 @@
         </w:rPr>
         <w:drawing>
           <wp:inline xmlns:a="http://schemas.openxmlformats.org/drawingml/2006/main" xmlns:pic="http://schemas.openxmlformats.org/drawingml/2006/picture">
-            <wp:extent cx="6629400" cy="3366090"/>
-            <wp:docPr id="383526932" name="Picture 383526932"/>
+            <wp:extent cx="6629400" cy="1092815"/>
+            <wp:docPr id="383526926" name="Picture 383526926"/>
             <wp:cNvGraphicFramePr>
               <a:graphicFrameLocks noChangeAspect="1"/>
             </wp:cNvGraphicFramePr>
@@ -3939,11 +3473,11 @@
               <a:graphicData uri="http://schemas.openxmlformats.org/drawingml/2006/picture">
                 <pic:pic>
                   <pic:nvPicPr>
-                    <pic:cNvPr id="0" name="q3_stages.png"/>
+                    <pic:cNvPr id="0" name="q3_stage_header.png"/>
                     <pic:cNvPicPr/>
                   </pic:nvPicPr>
                   <pic:blipFill>
-                    <a:blip r:embed="rId40"/>
+                    <a:blip r:embed="rId36"/>
                     <a:stretch>
                       <a:fillRect/>
                     </a:stretch>
@@ -3951,7 +3485,7 @@
                   <pic:spPr>
                     <a:xfrm>
                       <a:off x="0" y="0"/>
-                      <a:ext cx="6629400" cy="3366090"/>
+                      <a:ext cx="6629400" cy="1092815"/>
                     </a:xfrm>
                     <a:prstGeom prst="rect"/>
                   </pic:spPr>
@@ -3965,6 +3499,51 @@
     <w:p>
       <w:pPr>
         <w:pStyle w:val="BodyText"/>
+        <w:keepLines/>
+        <w:spacing w:after="100"/>
+        <w:jc w:val="center"/>
+      </w:pPr>
+      <w:r>
+        <w:rPr>
+          <w:sz w:val="2"/>
+        </w:rPr>
+        <w:drawing>
+          <wp:inline xmlns:a="http://schemas.openxmlformats.org/drawingml/2006/main" xmlns:pic="http://schemas.openxmlformats.org/drawingml/2006/picture">
+            <wp:extent cx="6629400" cy="1315522"/>
+            <wp:docPr id="383526927" name="Picture 383526927"/>
+            <wp:cNvGraphicFramePr>
+              <a:graphicFrameLocks noChangeAspect="1"/>
+            </wp:cNvGraphicFramePr>
+            <a:graphic>
+              <a:graphicData uri="http://schemas.openxmlformats.org/drawingml/2006/picture">
+                <pic:pic>
+                  <pic:nvPicPr>
+                    <pic:cNvPr id="0" name="q3_green_stages.png"/>
+                    <pic:cNvPicPr/>
+                  </pic:nvPicPr>
+                  <pic:blipFill>
+                    <a:blip r:embed="rId37"/>
+                    <a:stretch>
+                      <a:fillRect/>
+                    </a:stretch>
+                  </pic:blipFill>
+                  <pic:spPr>
+                    <a:xfrm>
+                      <a:off x="0" y="0"/>
+                      <a:ext cx="6629400" cy="1315522"/>
+                    </a:xfrm>
+                    <a:prstGeom prst="rect"/>
+                  </pic:spPr>
+                </pic:pic>
+              </a:graphicData>
+            </a:graphic>
+          </wp:inline>
+        </w:drawing>
+      </w:r>
+    </w:p>
+    <w:p>
+      <w:pPr>
+        <w:pStyle w:val="BodyText"/>
         <w:keepNext w:val="0"/>
         <w:keepLines/>
       </w:pPr>
@@ -3975,7 +3554,7 @@
           <w:color w:val="000000"/>
           <w:sz w:val="40"/>
         </w:rPr>
-        <w:t>The successful release is Jenkins build #4, using pdgamersg/assessment9-hospital:v2-4.</w:t>
+        <w:t>The green rows show successful builds #4, #3 and #2. Build #4 uses pdgamersg/assessment9-hospital:v2-4.</w:t>
       </w:r>
     </w:p>
     <w:p>
@@ -4008,7 +3587,7 @@
         <w:drawing>
           <wp:inline xmlns:a="http://schemas.openxmlformats.org/drawingml/2006/main" xmlns:pic="http://schemas.openxmlformats.org/drawingml/2006/picture">
             <wp:extent cx="6629400" cy="1276773"/>
-            <wp:docPr id="383526933" name="Picture 383526933"/>
+            <wp:docPr id="383526928" name="Picture 383526928"/>
             <wp:cNvGraphicFramePr>
               <a:graphicFrameLocks noChangeAspect="1"/>
             </wp:cNvGraphicFramePr>
@@ -4020,7 +3599,7 @@
                     <pic:cNvPicPr/>
                   </pic:nvPicPr>
                   <pic:blipFill>
-                    <a:blip r:embed="rId41"/>
+                    <a:blip r:embed="rId38"/>
                     <a:stretch>
                       <a:fillRect/>
                     </a:stretch>
@@ -4086,7 +3665,7 @@
         <w:drawing>
           <wp:inline xmlns:a="http://schemas.openxmlformats.org/drawingml/2006/main" xmlns:pic="http://schemas.openxmlformats.org/drawingml/2006/picture">
             <wp:extent cx="6524897" cy="3383280"/>
-            <wp:docPr id="383526934" name="Picture 383526934"/>
+            <wp:docPr id="383526929" name="Picture 383526929"/>
             <wp:cNvGraphicFramePr>
               <a:graphicFrameLocks noChangeAspect="1"/>
             </wp:cNvGraphicFramePr>
@@ -4098,7 +3677,7 @@
                     <pic:cNvPicPr/>
                   </pic:nvPicPr>
                   <pic:blipFill>
-                    <a:blip r:embed="rId42"/>
+                    <a:blip r:embed="rId39"/>
                     <a:stretch>
                       <a:fillRect/>
                     </a:stretch>
@@ -4147,7 +3726,7 @@
         <w:drawing>
           <wp:inline xmlns:a="http://schemas.openxmlformats.org/drawingml/2006/main" xmlns:pic="http://schemas.openxmlformats.org/drawingml/2006/picture">
             <wp:extent cx="6172200" cy="2377440"/>
-            <wp:docPr id="383526935" name="Picture 383526935"/>
+            <wp:docPr id="383526930" name="Picture 383526930"/>
             <wp:cNvGraphicFramePr>
               <a:graphicFrameLocks noChangeAspect="1"/>
             </wp:cNvGraphicFramePr>
@@ -4159,7 +3738,7 @@
                     <pic:cNvPicPr/>
                   </pic:nvPicPr>
                   <pic:blipFill>
-                    <a:blip r:embed="rId43"/>
+                    <a:blip r:embed="rId40"/>
                     <a:stretch>
                       <a:fillRect/>
                     </a:stretch>
@@ -4225,7 +3804,7 @@
         <w:drawing>
           <wp:inline xmlns:a="http://schemas.openxmlformats.org/drawingml/2006/main" xmlns:pic="http://schemas.openxmlformats.org/drawingml/2006/picture">
             <wp:extent cx="6629400" cy="5336667"/>
-            <wp:docPr id="383526936" name="Picture 383526936"/>
+            <wp:docPr id="383526931" name="Picture 383526931"/>
             <wp:cNvGraphicFramePr>
               <a:graphicFrameLocks noChangeAspect="1"/>
             </wp:cNvGraphicFramePr>
@@ -4237,7 +3816,7 @@
                     <pic:cNvPicPr/>
                   </pic:nvPicPr>
                   <pic:blipFill>
-                    <a:blip r:embed="rId44"/>
+                    <a:blip r:embed="rId41"/>
                     <a:stretch>
                       <a:fillRect/>
                     </a:stretch>
@@ -4335,7 +3914,7 @@
         <w:drawing>
           <wp:inline xmlns:a="http://schemas.openxmlformats.org/drawingml/2006/main" xmlns:pic="http://schemas.openxmlformats.org/drawingml/2006/picture">
             <wp:extent cx="6629400" cy="1210880"/>
-            <wp:docPr id="383526937" name="Picture 383526937"/>
+            <wp:docPr id="383526932" name="Picture 383526932"/>
             <wp:cNvGraphicFramePr>
               <a:graphicFrameLocks noChangeAspect="1"/>
             </wp:cNvGraphicFramePr>
@@ -4347,7 +3926,7 @@
                     <pic:cNvPicPr/>
                   </pic:nvPicPr>
                   <pic:blipFill>
-                    <a:blip r:embed="rId45"/>
+                    <a:blip r:embed="rId42"/>
                     <a:stretch>
                       <a:fillRect/>
                     </a:stretch>
@@ -4396,7 +3975,7 @@
         <w:drawing>
           <wp:inline xmlns:a="http://schemas.openxmlformats.org/drawingml/2006/main" xmlns:pic="http://schemas.openxmlformats.org/drawingml/2006/picture">
             <wp:extent cx="6629400" cy="2693194"/>
-            <wp:docPr id="383526938" name="Picture 383526938"/>
+            <wp:docPr id="383526933" name="Picture 383526933"/>
             <wp:cNvGraphicFramePr>
               <a:graphicFrameLocks noChangeAspect="1"/>
             </wp:cNvGraphicFramePr>
@@ -4408,7 +3987,7 @@
                     <pic:cNvPicPr/>
                   </pic:nvPicPr>
                   <pic:blipFill>
-                    <a:blip r:embed="rId46"/>
+                    <a:blip r:embed="rId43"/>
                     <a:stretch>
                       <a:fillRect/>
                     </a:stretch>
@@ -4430,23 +4009,6 @@
     <w:p>
       <w:pPr>
         <w:pStyle w:val="BodyText"/>
-        <w:keepNext/>
-        <w:keepLines/>
-        <w:pageBreakBefore/>
-      </w:pPr>
-      <w:r>
-        <w:rPr>
-          <w:rFonts w:ascii="Times New Roman" w:hAnsi="Times New Roman"/>
-          <w:b w:val="0"/>
-          <w:color w:val="000000"/>
-          <w:sz w:val="40"/>
-        </w:rPr>
-        <w:t>Step 8: Failed rollout and automatic rollback</w:t>
-      </w:r>
-    </w:p>
-    <w:p>
-      <w:pPr>
-        <w:pStyle w:val="BodyText"/>
         <w:keepNext w:val="0"/>
         <w:keepLines/>
       </w:pPr>
@@ -4457,268 +4019,7 @@
           <w:color w:val="000000"/>
           <w:sz w:val="40"/>
         </w:rPr>
-        <w:t>The faulty image returned HTTP 503 at /healthz. Its root-page test passed, and Kubernetes readiness rejected the release.</w:t>
-      </w:r>
-    </w:p>
-    <w:p>
-      <w:pPr>
-        <w:pStyle w:val="BodyText"/>
-        <w:keepNext w:val="0"/>
-        <w:keepLines/>
-      </w:pPr>
-      <w:r>
-        <w:rPr>
-          <w:rFonts w:ascii="Times New Roman" w:hAnsi="Times New Roman"/>
-          <w:b w:val="0"/>
-          <w:color w:val="000000"/>
-          <w:sz w:val="40"/>
-        </w:rPr>
-        <w:t>Build #5 used pdgamersg/assessment9-hospital:broken-5. The FAILURE result is expected.</w:t>
-      </w:r>
-    </w:p>
-    <w:p>
-      <w:pPr>
-        <w:pStyle w:val="BodyText"/>
-        <w:keepLines/>
-        <w:spacing w:after="100"/>
-        <w:jc w:val="center"/>
-      </w:pPr>
-      <w:r>
-        <w:rPr>
-          <w:sz w:val="2"/>
-        </w:rPr>
-        <w:drawing>
-          <wp:inline xmlns:a="http://schemas.openxmlformats.org/drawingml/2006/main" xmlns:pic="http://schemas.openxmlformats.org/drawingml/2006/picture">
-            <wp:extent cx="6122989" cy="3108959"/>
-            <wp:docPr id="383526939" name="Picture 383526939"/>
-            <wp:cNvGraphicFramePr>
-              <a:graphicFrameLocks noChangeAspect="1"/>
-            </wp:cNvGraphicFramePr>
-            <a:graphic>
-              <a:graphicData uri="http://schemas.openxmlformats.org/drawingml/2006/picture">
-                <pic:pic>
-                  <pic:nvPicPr>
-                    <pic:cNvPr id="0" name="q3_stages.png"/>
-                    <pic:cNvPicPr/>
-                  </pic:nvPicPr>
-                  <pic:blipFill>
-                    <a:blip r:embed="rId40"/>
-                    <a:stretch>
-                      <a:fillRect/>
-                    </a:stretch>
-                  </pic:blipFill>
-                  <pic:spPr>
-                    <a:xfrm>
-                      <a:off x="0" y="0"/>
-                      <a:ext cx="6122989" cy="3108959"/>
-                    </a:xfrm>
-                    <a:prstGeom prst="rect"/>
-                  </pic:spPr>
-                </pic:pic>
-              </a:graphicData>
-            </a:graphic>
-          </wp:inline>
-        </w:drawing>
-      </w:r>
-    </w:p>
-    <w:p>
-      <w:pPr>
-        <w:pStyle w:val="BodyText"/>
-        <w:keepNext w:val="0"/>
-        <w:keepLines/>
-      </w:pPr>
-      <w:r>
-        <w:rPr>
-          <w:rFonts w:ascii="Times New Roman" w:hAnsi="Times New Roman"/>
-          <w:b w:val="0"/>
-          <w:color w:val="000000"/>
-          <w:sz w:val="40"/>
-        </w:rPr>
-        <w:t>Jenkins ran kubectl rollout undo and verified that the exact previous stable image was restored.</w:t>
-      </w:r>
-    </w:p>
-    <w:p>
-      <w:pPr>
-        <w:pStyle w:val="BodyText"/>
-        <w:keepLines/>
-        <w:spacing w:after="100"/>
-        <w:jc w:val="center"/>
-      </w:pPr>
-      <w:r>
-        <w:rPr>
-          <w:sz w:val="2"/>
-        </w:rPr>
-        <w:drawing>
-          <wp:inline xmlns:a="http://schemas.openxmlformats.org/drawingml/2006/main" xmlns:pic="http://schemas.openxmlformats.org/drawingml/2006/picture">
-            <wp:extent cx="6629400" cy="1620520"/>
-            <wp:docPr id="383526940" name="Picture 383526940"/>
-            <wp:cNvGraphicFramePr>
-              <a:graphicFrameLocks noChangeAspect="1"/>
-            </wp:cNvGraphicFramePr>
-            <a:graphic>
-              <a:graphicData uri="http://schemas.openxmlformats.org/drawingml/2006/picture">
-                <pic:pic>
-                  <pic:nvPicPr>
-                    <pic:cNvPr id="0" name="q3_rollback.png"/>
-                    <pic:cNvPicPr/>
-                  </pic:nvPicPr>
-                  <pic:blipFill>
-                    <a:blip r:embed="rId47"/>
-                    <a:stretch>
-                      <a:fillRect/>
-                    </a:stretch>
-                  </pic:blipFill>
-                  <pic:spPr>
-                    <a:xfrm>
-                      <a:off x="0" y="0"/>
-                      <a:ext cx="6629400" cy="1620520"/>
-                    </a:xfrm>
-                    <a:prstGeom prst="rect"/>
-                  </pic:spPr>
-                </pic:pic>
-              </a:graphicData>
-            </a:graphic>
-          </wp:inline>
-        </w:drawing>
-      </w:r>
-    </w:p>
-    <w:p>
-      <w:pPr>
-        <w:pStyle w:val="BodyText"/>
-        <w:keepNext/>
-        <w:keepLines/>
-        <w:pageBreakBefore/>
-      </w:pPr>
-      <w:r>
-        <w:rPr>
-          <w:rFonts w:ascii="Times New Roman" w:hAnsi="Times New Roman"/>
-          <w:b w:val="0"/>
-          <w:color w:val="000000"/>
-          <w:sz w:val="40"/>
-        </w:rPr>
-        <w:t>Output after rollback:</w:t>
-      </w:r>
-    </w:p>
-    <w:p>
-      <w:pPr>
-        <w:pStyle w:val="BodyText"/>
-        <w:keepNext w:val="0"/>
-        <w:keepLines/>
-      </w:pPr>
-      <w:r>
-        <w:rPr>
-          <w:rFonts w:ascii="Times New Roman" w:hAnsi="Times New Roman"/>
-          <w:b w:val="0"/>
-          <w:color w:val="000000"/>
-          <w:sz w:val="40"/>
-        </w:rPr>
-        <w:t>The restored NodePort returned HTTP 200. All 3 serving Pods were Running and Ready, and the page still matched the stable Git source.</w:t>
-      </w:r>
-    </w:p>
-    <w:p>
-      <w:pPr>
-        <w:pStyle w:val="BodyText"/>
-        <w:keepLines/>
-        <w:spacing w:after="100"/>
-        <w:jc w:val="center"/>
-      </w:pPr>
-      <w:r>
-        <w:rPr>
-          <w:sz w:val="2"/>
-        </w:rPr>
-        <w:drawing>
-          <wp:inline xmlns:a="http://schemas.openxmlformats.org/drawingml/2006/main" xmlns:pic="http://schemas.openxmlformats.org/drawingml/2006/picture">
-            <wp:extent cx="5290457" cy="2743200"/>
-            <wp:docPr id="383526941" name="Picture 383526941"/>
-            <wp:cNvGraphicFramePr>
-              <a:graphicFrameLocks noChangeAspect="1"/>
-            </wp:cNvGraphicFramePr>
-            <a:graphic>
-              <a:graphicData uri="http://schemas.openxmlformats.org/drawingml/2006/picture">
-                <pic:pic>
-                  <pic:nvPicPr>
-                    <pic:cNvPr id="0" name="q3_recovered_verification.png"/>
-                    <pic:cNvPicPr/>
-                  </pic:nvPicPr>
-                  <pic:blipFill>
-                    <a:blip r:embed="rId48"/>
-                    <a:stretch>
-                      <a:fillRect/>
-                    </a:stretch>
-                  </pic:blipFill>
-                  <pic:spPr>
-                    <a:xfrm>
-                      <a:off x="0" y="0"/>
-                      <a:ext cx="5290457" cy="2743200"/>
-                    </a:xfrm>
-                    <a:prstGeom prst="rect"/>
-                  </pic:spPr>
-                </pic:pic>
-              </a:graphicData>
-            </a:graphic>
-          </wp:inline>
-        </w:drawing>
-      </w:r>
-    </w:p>
-    <w:p>
-      <w:pPr>
-        <w:pStyle w:val="BodyText"/>
-        <w:keepLines/>
-        <w:spacing w:after="100"/>
-        <w:jc w:val="center"/>
-      </w:pPr>
-      <w:r>
-        <w:rPr>
-          <w:sz w:val="2"/>
-        </w:rPr>
-        <w:drawing>
-          <wp:inline xmlns:a="http://schemas.openxmlformats.org/drawingml/2006/main" xmlns:pic="http://schemas.openxmlformats.org/drawingml/2006/picture">
-            <wp:extent cx="6629400" cy="3452812"/>
-            <wp:docPr id="383526942" name="Picture 383526942"/>
-            <wp:cNvGraphicFramePr>
-              <a:graphicFrameLocks noChangeAspect="1"/>
-            </wp:cNvGraphicFramePr>
-            <a:graphic>
-              <a:graphicData uri="http://schemas.openxmlformats.org/drawingml/2006/picture">
-                <pic:pic>
-                  <pic:nvPicPr>
-                    <pic:cNvPr id="0" name="q3_restored.png"/>
-                    <pic:cNvPicPr/>
-                  </pic:nvPicPr>
-                  <pic:blipFill>
-                    <a:blip r:embed="rId49"/>
-                    <a:stretch>
-                      <a:fillRect/>
-                    </a:stretch>
-                  </pic:blipFill>
-                  <pic:spPr>
-                    <a:xfrm>
-                      <a:off x="0" y="0"/>
-                      <a:ext cx="6629400" cy="3452812"/>
-                    </a:xfrm>
-                    <a:prstGeom prst="rect"/>
-                  </pic:spPr>
-                </pic:pic>
-              </a:graphicData>
-            </a:graphic>
-          </wp:inline>
-        </w:drawing>
-      </w:r>
-    </w:p>
-    <w:p>
-      <w:pPr>
-        <w:pStyle w:val="BodyText"/>
-        <w:keepNext w:val="0"/>
-        <w:keepLines/>
-      </w:pPr>
-      <w:r>
-        <w:rPr>
-          <w:rFonts w:ascii="Times New Roman" w:hAnsi="Times New Roman"/>
-          <w:b w:val="0"/>
-          <w:color w:val="000000"/>
-          <w:sz w:val="40"/>
-        </w:rPr>
-        <w:t>Result: Deployment, update and automatic recovery were verified successfully.</w:t>
+        <w:t>Result: The updated application was deployed successfully and verified through its assigned NodePort.</w:t>
       </w:r>
     </w:p>
     <w:sectPr>

</xml_diff>

<commit_message>
Make assignment headings and section labels bold
</commit_message>
<xml_diff>
--- a/report/DA 9.docx
+++ b/report/DA 9.docx
@@ -261,7 +261,7 @@
       <w:r>
         <w:rPr>
           <w:rFonts w:ascii="Times New Roman" w:hAnsi="Times New Roman"/>
-          <w:b w:val="0"/>
+          <w:b/>
           <w:color w:val="000000"/>
           <w:sz w:val="40"/>
         </w:rPr>
@@ -319,6 +319,7 @@
       </w:pPr>
       <w:r>
         <w:rPr>
+          <w:b/>
           <w:sz w:val="40"/>
         </w:rPr>
         <w:t xml:space="preserve">Github Url: </w:t>
@@ -344,26 +345,26 @@
       <w:r>
         <w:rPr>
           <w:rFonts w:ascii="Times New Roman" w:hAnsi="Times New Roman"/>
+          <w:b/>
+          <w:color w:val="000000"/>
+          <w:sz w:val="40"/>
+        </w:rPr>
+        <w:t>Step 1: Writing the code</w:t>
+      </w:r>
+    </w:p>
+    <w:p>
+      <w:pPr>
+        <w:pStyle w:val="BodyText"/>
+        <w:keepNext w:val="0"/>
+        <w:keepLines/>
+      </w:pPr>
+      <w:r>
+        <w:rPr>
+          <w:rFonts w:ascii="Times New Roman" w:hAnsi="Times New Roman"/>
           <w:b w:val="0"/>
           <w:color w:val="000000"/>
           <w:sz w:val="40"/>
         </w:rPr>
-        <w:t>Step 1: Writing the code</w:t>
-      </w:r>
-    </w:p>
-    <w:p>
-      <w:pPr>
-        <w:pStyle w:val="BodyText"/>
-        <w:keepNext w:val="0"/>
-        <w:keepLines/>
-      </w:pPr>
-      <w:r>
-        <w:rPr>
-          <w:rFonts w:ascii="Times New Roman" w:hAnsi="Times New Roman"/>
-          <w:b w:val="0"/>
-          <w:color w:val="000000"/>
-          <w:sz w:val="40"/>
-        </w:rPr>
         <w:t>University Learning Management Portal was created using HTML and CSS. The source, Dockerfile, Kubernetes files and Jenkinsfile are stored in the lms-portal folder.</w:t>
       </w:r>
     </w:p>
@@ -376,7 +377,7 @@
       <w:r>
         <w:rPr>
           <w:rFonts w:ascii="Times New Roman" w:hAnsi="Times New Roman"/>
-          <w:b w:val="0"/>
+          <w:b/>
           <w:color w:val="000000"/>
           <w:sz w:val="40"/>
         </w:rPr>
@@ -482,7 +483,7 @@
       <w:r>
         <w:rPr>
           <w:rFonts w:ascii="Times New Roman" w:hAnsi="Times New Roman"/>
-          <w:b w:val="0"/>
+          <w:b/>
           <w:color w:val="000000"/>
           <w:sz w:val="40"/>
         </w:rPr>
@@ -539,7 +540,7 @@
       <w:r>
         <w:rPr>
           <w:rFonts w:ascii="Times New Roman" w:hAnsi="Times New Roman"/>
-          <w:b w:val="0"/>
+          <w:b/>
           <w:color w:val="000000"/>
           <w:sz w:val="40"/>
         </w:rPr>
@@ -580,7 +581,7 @@
       <w:r>
         <w:rPr>
           <w:rFonts w:ascii="Times New Roman" w:hAnsi="Times New Roman"/>
-          <w:b w:val="0"/>
+          <w:b/>
           <w:color w:val="000000"/>
           <w:sz w:val="40"/>
         </w:rPr>
@@ -658,26 +659,26 @@
       <w:r>
         <w:rPr>
           <w:rFonts w:ascii="Times New Roman" w:hAnsi="Times New Roman"/>
+          <w:b/>
+          <w:color w:val="000000"/>
+          <w:sz w:val="40"/>
+        </w:rPr>
+        <w:t>Step 2: Pushing the code to github</w:t>
+      </w:r>
+    </w:p>
+    <w:p>
+      <w:pPr>
+        <w:pStyle w:val="BodyText"/>
+        <w:keepNext w:val="0"/>
+        <w:keepLines/>
+      </w:pPr>
+      <w:r>
+        <w:rPr>
+          <w:rFonts w:ascii="Times New Roman" w:hAnsi="Times New Roman"/>
           <w:b w:val="0"/>
           <w:color w:val="000000"/>
           <w:sz w:val="40"/>
         </w:rPr>
-        <w:t>Step 2: Pushing the code to github</w:t>
-      </w:r>
-    </w:p>
-    <w:p>
-      <w:pPr>
-        <w:pStyle w:val="BodyText"/>
-        <w:keepNext w:val="0"/>
-        <w:keepLines/>
-      </w:pPr>
-      <w:r>
-        <w:rPr>
-          <w:rFonts w:ascii="Times New Roman" w:hAnsi="Times New Roman"/>
-          <w:b w:val="0"/>
-          <w:color w:val="000000"/>
-          <w:sz w:val="40"/>
-        </w:rPr>
         <w:t>One GitHub repository was used for all three questions. The main branch contains the application files and the complete CI/CD implementation.</w:t>
       </w:r>
     </w:p>
@@ -690,7 +691,7 @@
       <w:r>
         <w:rPr>
           <w:rFonts w:ascii="Times New Roman" w:hAnsi="Times New Roman"/>
-          <w:b w:val="0"/>
+          <w:b/>
           <w:color w:val="000000"/>
           <w:sz w:val="40"/>
         </w:rPr>
@@ -773,7 +774,7 @@
       <w:r>
         <w:rPr>
           <w:rFonts w:ascii="Times New Roman" w:hAnsi="Times New Roman"/>
-          <w:b w:val="0"/>
+          <w:b/>
           <w:color w:val="000000"/>
           <w:sz w:val="40"/>
         </w:rPr>
@@ -912,7 +913,7 @@
       <w:r>
         <w:rPr>
           <w:rFonts w:ascii="Times New Roman" w:hAnsi="Times New Roman"/>
-          <w:b w:val="0"/>
+          <w:b/>
           <w:color w:val="000000"/>
           <w:sz w:val="40"/>
         </w:rPr>
@@ -1050,7 +1051,7 @@
       <w:r>
         <w:rPr>
           <w:rFonts w:ascii="Times New Roman" w:hAnsi="Times New Roman"/>
-          <w:b w:val="0"/>
+          <w:b/>
           <w:color w:val="000000"/>
           <w:sz w:val="40"/>
         </w:rPr>
@@ -1112,7 +1113,7 @@
       <w:r>
         <w:rPr>
           <w:rFonts w:ascii="Times New Roman" w:hAnsi="Times New Roman"/>
-          <w:b w:val="0"/>
+          <w:b/>
           <w:color w:val="000000"/>
           <w:sz w:val="40"/>
         </w:rPr>
@@ -1189,7 +1190,7 @@
       <w:r>
         <w:rPr>
           <w:rFonts w:ascii="Times New Roman" w:hAnsi="Times New Roman"/>
-          <w:b w:val="0"/>
+          <w:b/>
           <w:color w:val="000000"/>
           <w:sz w:val="40"/>
         </w:rPr>
@@ -1251,7 +1252,7 @@
       <w:r>
         <w:rPr>
           <w:rFonts w:ascii="Times New Roman" w:hAnsi="Times New Roman"/>
-          <w:b w:val="0"/>
+          <w:b/>
           <w:color w:val="000000"/>
           <w:sz w:val="40"/>
         </w:rPr>
@@ -1329,7 +1330,7 @@
       <w:r>
         <w:rPr>
           <w:rFonts w:ascii="Times New Roman" w:hAnsi="Times New Roman"/>
-          <w:b w:val="0"/>
+          <w:b/>
           <w:color w:val="000000"/>
           <w:sz w:val="40"/>
         </w:rPr>
@@ -1438,7 +1439,7 @@
       <w:r>
         <w:rPr>
           <w:rFonts w:ascii="Times New Roman" w:hAnsi="Times New Roman"/>
-          <w:b w:val="0"/>
+          <w:b/>
           <w:color w:val="000000"/>
           <w:sz w:val="40"/>
         </w:rPr>
@@ -1499,11 +1500,19 @@
       <w:r>
         <w:rPr>
           <w:rFonts w:ascii="Times New Roman" w:hAnsi="Times New Roman"/>
+          <w:b/>
+          <w:color w:val="000000"/>
+          <w:sz w:val="40"/>
+        </w:rPr>
+        <w:t xml:space="preserve">Result: </w:t>
+      </w:r>
+      <w:r>
+        <w:rPr>
+          <w:rFonts w:ascii="Times New Roman" w:hAnsi="Times New Roman"/>
           <w:b w:val="0"/>
-          <w:color w:val="000000"/>
-          <w:sz w:val="40"/>
-        </w:rPr>
-        <w:t>Result: The updated application was deployed successfully and verified through its assigned NodePort.</w:t>
+          <w:sz w:val="40"/>
+        </w:rPr>
+        <w:t>The updated application was deployed successfully and verified through its assigned NodePort.</w:t>
       </w:r>
     </w:p>
     <w:p>
@@ -1516,7 +1525,7 @@
       <w:r>
         <w:rPr>
           <w:rFonts w:ascii="Times New Roman" w:hAnsi="Times New Roman"/>
-          <w:b w:val="0"/>
+          <w:b/>
           <w:color w:val="000000"/>
           <w:sz w:val="40"/>
         </w:rPr>
@@ -1574,6 +1583,7 @@
       </w:pPr>
       <w:r>
         <w:rPr>
+          <w:b/>
           <w:sz w:val="40"/>
         </w:rPr>
         <w:t xml:space="preserve">Github Url: </w:t>
@@ -1599,26 +1609,26 @@
       <w:r>
         <w:rPr>
           <w:rFonts w:ascii="Times New Roman" w:hAnsi="Times New Roman"/>
+          <w:b/>
+          <w:color w:val="000000"/>
+          <w:sz w:val="40"/>
+        </w:rPr>
+        <w:t>Step 1: Writing the code</w:t>
+      </w:r>
+    </w:p>
+    <w:p>
+      <w:pPr>
+        <w:pStyle w:val="BodyText"/>
+        <w:keepNext w:val="0"/>
+        <w:keepLines/>
+      </w:pPr>
+      <w:r>
+        <w:rPr>
+          <w:rFonts w:ascii="Times New Roman" w:hAnsi="Times New Roman"/>
           <w:b w:val="0"/>
           <w:color w:val="000000"/>
           <w:sz w:val="40"/>
         </w:rPr>
-        <w:t>Step 1: Writing the code</w:t>
-      </w:r>
-    </w:p>
-    <w:p>
-      <w:pPr>
-        <w:pStyle w:val="BodyText"/>
-        <w:keepNext w:val="0"/>
-        <w:keepLines/>
-      </w:pPr>
-      <w:r>
-        <w:rPr>
-          <w:rFonts w:ascii="Times New Roman" w:hAnsi="Times New Roman"/>
-          <w:b w:val="0"/>
-          <w:color w:val="000000"/>
-          <w:sz w:val="40"/>
-        </w:rPr>
         <w:t>Online Food Ordering Portal was created using HTML and CSS. The source, Dockerfile, Kubernetes files and Jenkinsfile are stored in the food-portal folder.</w:t>
       </w:r>
     </w:p>
@@ -1631,7 +1641,7 @@
       <w:r>
         <w:rPr>
           <w:rFonts w:ascii="Times New Roman" w:hAnsi="Times New Roman"/>
-          <w:b w:val="0"/>
+          <w:b/>
           <w:color w:val="000000"/>
           <w:sz w:val="40"/>
         </w:rPr>
@@ -1741,7 +1751,7 @@
       <w:r>
         <w:rPr>
           <w:rFonts w:ascii="Times New Roman" w:hAnsi="Times New Roman"/>
-          <w:b w:val="0"/>
+          <w:b/>
           <w:color w:val="000000"/>
           <w:sz w:val="40"/>
         </w:rPr>
@@ -1800,7 +1810,7 @@
       <w:r>
         <w:rPr>
           <w:rFonts w:ascii="Times New Roman" w:hAnsi="Times New Roman"/>
-          <w:b w:val="0"/>
+          <w:b/>
           <w:color w:val="000000"/>
           <w:sz w:val="40"/>
         </w:rPr>
@@ -1841,7 +1851,7 @@
       <w:r>
         <w:rPr>
           <w:rFonts w:ascii="Times New Roman" w:hAnsi="Times New Roman"/>
-          <w:b w:val="0"/>
+          <w:b/>
           <w:color w:val="000000"/>
           <w:sz w:val="40"/>
         </w:rPr>
@@ -1919,26 +1929,26 @@
       <w:r>
         <w:rPr>
           <w:rFonts w:ascii="Times New Roman" w:hAnsi="Times New Roman"/>
+          <w:b/>
+          <w:color w:val="000000"/>
+          <w:sz w:val="40"/>
+        </w:rPr>
+        <w:t>Step 2: Pushing the code to github</w:t>
+      </w:r>
+    </w:p>
+    <w:p>
+      <w:pPr>
+        <w:pStyle w:val="BodyText"/>
+        <w:keepNext w:val="0"/>
+        <w:keepLines/>
+      </w:pPr>
+      <w:r>
+        <w:rPr>
+          <w:rFonts w:ascii="Times New Roman" w:hAnsi="Times New Roman"/>
           <w:b w:val="0"/>
           <w:color w:val="000000"/>
           <w:sz w:val="40"/>
         </w:rPr>
-        <w:t>Step 2: Pushing the code to github</w:t>
-      </w:r>
-    </w:p>
-    <w:p>
-      <w:pPr>
-        <w:pStyle w:val="BodyText"/>
-        <w:keepNext w:val="0"/>
-        <w:keepLines/>
-      </w:pPr>
-      <w:r>
-        <w:rPr>
-          <w:rFonts w:ascii="Times New Roman" w:hAnsi="Times New Roman"/>
-          <w:b w:val="0"/>
-          <w:color w:val="000000"/>
-          <w:sz w:val="40"/>
-        </w:rPr>
         <w:t>One GitHub repository was used for all three questions. The main branch contains the application files and the complete CI/CD implementation.</w:t>
       </w:r>
     </w:p>
@@ -1951,7 +1961,7 @@
       <w:r>
         <w:rPr>
           <w:rFonts w:ascii="Times New Roman" w:hAnsi="Times New Roman"/>
-          <w:b w:val="0"/>
+          <w:b/>
           <w:color w:val="000000"/>
           <w:sz w:val="40"/>
         </w:rPr>
@@ -2034,7 +2044,7 @@
       <w:r>
         <w:rPr>
           <w:rFonts w:ascii="Times New Roman" w:hAnsi="Times New Roman"/>
-          <w:b w:val="0"/>
+          <w:b/>
           <w:color w:val="000000"/>
           <w:sz w:val="40"/>
         </w:rPr>
@@ -2173,7 +2183,7 @@
       <w:r>
         <w:rPr>
           <w:rFonts w:ascii="Times New Roman" w:hAnsi="Times New Roman"/>
-          <w:b w:val="0"/>
+          <w:b/>
           <w:color w:val="000000"/>
           <w:sz w:val="40"/>
         </w:rPr>
@@ -2311,7 +2321,7 @@
       <w:r>
         <w:rPr>
           <w:rFonts w:ascii="Times New Roman" w:hAnsi="Times New Roman"/>
-          <w:b w:val="0"/>
+          <w:b/>
           <w:color w:val="000000"/>
           <w:sz w:val="40"/>
         </w:rPr>
@@ -2373,7 +2383,7 @@
       <w:r>
         <w:rPr>
           <w:rFonts w:ascii="Times New Roman" w:hAnsi="Times New Roman"/>
-          <w:b w:val="0"/>
+          <w:b/>
           <w:color w:val="000000"/>
           <w:sz w:val="40"/>
         </w:rPr>
@@ -2450,7 +2460,7 @@
       <w:r>
         <w:rPr>
           <w:rFonts w:ascii="Times New Roman" w:hAnsi="Times New Roman"/>
-          <w:b w:val="0"/>
+          <w:b/>
           <w:color w:val="000000"/>
           <w:sz w:val="40"/>
         </w:rPr>
@@ -2512,7 +2522,7 @@
       <w:r>
         <w:rPr>
           <w:rFonts w:ascii="Times New Roman" w:hAnsi="Times New Roman"/>
-          <w:b w:val="0"/>
+          <w:b/>
           <w:color w:val="000000"/>
           <w:sz w:val="40"/>
         </w:rPr>
@@ -2590,7 +2600,7 @@
       <w:r>
         <w:rPr>
           <w:rFonts w:ascii="Times New Roman" w:hAnsi="Times New Roman"/>
-          <w:b w:val="0"/>
+          <w:b/>
           <w:color w:val="000000"/>
           <w:sz w:val="40"/>
         </w:rPr>
@@ -2699,7 +2709,7 @@
       <w:r>
         <w:rPr>
           <w:rFonts w:ascii="Times New Roman" w:hAnsi="Times New Roman"/>
-          <w:b w:val="0"/>
+          <w:b/>
           <w:color w:val="000000"/>
           <w:sz w:val="40"/>
         </w:rPr>
@@ -2760,11 +2770,19 @@
       <w:r>
         <w:rPr>
           <w:rFonts w:ascii="Times New Roman" w:hAnsi="Times New Roman"/>
+          <w:b/>
+          <w:color w:val="000000"/>
+          <w:sz w:val="40"/>
+        </w:rPr>
+        <w:t xml:space="preserve">Result: </w:t>
+      </w:r>
+      <w:r>
+        <w:rPr>
+          <w:rFonts w:ascii="Times New Roman" w:hAnsi="Times New Roman"/>
           <w:b w:val="0"/>
-          <w:color w:val="000000"/>
-          <w:sz w:val="40"/>
-        </w:rPr>
-        <w:t>Result: The updated application was deployed successfully and verified through its assigned NodePort.</w:t>
+          <w:sz w:val="40"/>
+        </w:rPr>
+        <w:t>The updated application was deployed successfully and verified through its assigned NodePort.</w:t>
       </w:r>
     </w:p>
     <w:p>
@@ -2777,7 +2795,7 @@
       <w:r>
         <w:rPr>
           <w:rFonts w:ascii="Times New Roman" w:hAnsi="Times New Roman"/>
-          <w:b w:val="0"/>
+          <w:b/>
           <w:color w:val="000000"/>
           <w:sz w:val="40"/>
         </w:rPr>
@@ -2835,6 +2853,7 @@
       </w:pPr>
       <w:r>
         <w:rPr>
+          <w:b/>
           <w:sz w:val="40"/>
         </w:rPr>
         <w:t xml:space="preserve">Github Url: </w:t>
@@ -2860,26 +2879,26 @@
       <w:r>
         <w:rPr>
           <w:rFonts w:ascii="Times New Roman" w:hAnsi="Times New Roman"/>
+          <w:b/>
+          <w:color w:val="000000"/>
+          <w:sz w:val="40"/>
+        </w:rPr>
+        <w:t>Step 1: Writing the code</w:t>
+      </w:r>
+    </w:p>
+    <w:p>
+      <w:pPr>
+        <w:pStyle w:val="BodyText"/>
+        <w:keepNext w:val="0"/>
+        <w:keepLines/>
+      </w:pPr>
+      <w:r>
+        <w:rPr>
+          <w:rFonts w:ascii="Times New Roman" w:hAnsi="Times New Roman"/>
           <w:b w:val="0"/>
           <w:color w:val="000000"/>
           <w:sz w:val="40"/>
         </w:rPr>
-        <w:t>Step 1: Writing the code</w:t>
-      </w:r>
-    </w:p>
-    <w:p>
-      <w:pPr>
-        <w:pStyle w:val="BodyText"/>
-        <w:keepNext w:val="0"/>
-        <w:keepLines/>
-      </w:pPr>
-      <w:r>
-        <w:rPr>
-          <w:rFonts w:ascii="Times New Roman" w:hAnsi="Times New Roman"/>
-          <w:b w:val="0"/>
-          <w:color w:val="000000"/>
-          <w:sz w:val="40"/>
-        </w:rPr>
         <w:t>Hospital Appointment Portal was created using HTML and CSS. The source, Dockerfile, Kubernetes files and Jenkinsfile are stored in the hospital-portal folder.</w:t>
       </w:r>
     </w:p>
@@ -2892,7 +2911,7 @@
       <w:r>
         <w:rPr>
           <w:rFonts w:ascii="Times New Roman" w:hAnsi="Times New Roman"/>
-          <w:b w:val="0"/>
+          <w:b/>
           <w:color w:val="000000"/>
           <w:sz w:val="40"/>
         </w:rPr>
@@ -2998,7 +3017,7 @@
       <w:r>
         <w:rPr>
           <w:rFonts w:ascii="Times New Roman" w:hAnsi="Times New Roman"/>
-          <w:b w:val="0"/>
+          <w:b/>
           <w:color w:val="000000"/>
           <w:sz w:val="40"/>
         </w:rPr>
@@ -3055,7 +3074,7 @@
       <w:r>
         <w:rPr>
           <w:rFonts w:ascii="Times New Roman" w:hAnsi="Times New Roman"/>
-          <w:b w:val="0"/>
+          <w:b/>
           <w:color w:val="000000"/>
           <w:sz w:val="40"/>
         </w:rPr>
@@ -3096,7 +3115,7 @@
       <w:r>
         <w:rPr>
           <w:rFonts w:ascii="Times New Roman" w:hAnsi="Times New Roman"/>
-          <w:b w:val="0"/>
+          <w:b/>
           <w:color w:val="000000"/>
           <w:sz w:val="40"/>
         </w:rPr>
@@ -3174,26 +3193,26 @@
       <w:r>
         <w:rPr>
           <w:rFonts w:ascii="Times New Roman" w:hAnsi="Times New Roman"/>
+          <w:b/>
+          <w:color w:val="000000"/>
+          <w:sz w:val="40"/>
+        </w:rPr>
+        <w:t>Step 2: Pushing the code to github</w:t>
+      </w:r>
+    </w:p>
+    <w:p>
+      <w:pPr>
+        <w:pStyle w:val="BodyText"/>
+        <w:keepNext w:val="0"/>
+        <w:keepLines/>
+      </w:pPr>
+      <w:r>
+        <w:rPr>
+          <w:rFonts w:ascii="Times New Roman" w:hAnsi="Times New Roman"/>
           <w:b w:val="0"/>
           <w:color w:val="000000"/>
           <w:sz w:val="40"/>
         </w:rPr>
-        <w:t>Step 2: Pushing the code to github</w:t>
-      </w:r>
-    </w:p>
-    <w:p>
-      <w:pPr>
-        <w:pStyle w:val="BodyText"/>
-        <w:keepNext w:val="0"/>
-        <w:keepLines/>
-      </w:pPr>
-      <w:r>
-        <w:rPr>
-          <w:rFonts w:ascii="Times New Roman" w:hAnsi="Times New Roman"/>
-          <w:b w:val="0"/>
-          <w:color w:val="000000"/>
-          <w:sz w:val="40"/>
-        </w:rPr>
         <w:t>One GitHub repository was used for all three questions. The main branch contains the application files and the complete CI/CD implementation.</w:t>
       </w:r>
     </w:p>
@@ -3206,7 +3225,7 @@
       <w:r>
         <w:rPr>
           <w:rFonts w:ascii="Times New Roman" w:hAnsi="Times New Roman"/>
-          <w:b w:val="0"/>
+          <w:b/>
           <w:color w:val="000000"/>
           <w:sz w:val="40"/>
         </w:rPr>
@@ -3289,7 +3308,7 @@
       <w:r>
         <w:rPr>
           <w:rFonts w:ascii="Times New Roman" w:hAnsi="Times New Roman"/>
-          <w:b w:val="0"/>
+          <w:b/>
           <w:color w:val="000000"/>
           <w:sz w:val="40"/>
         </w:rPr>
@@ -3428,7 +3447,7 @@
       <w:r>
         <w:rPr>
           <w:rFonts w:ascii="Times New Roman" w:hAnsi="Times New Roman"/>
-          <w:b w:val="0"/>
+          <w:b/>
           <w:color w:val="000000"/>
           <w:sz w:val="40"/>
         </w:rPr>
@@ -3566,7 +3585,7 @@
       <w:r>
         <w:rPr>
           <w:rFonts w:ascii="Times New Roman" w:hAnsi="Times New Roman"/>
-          <w:b w:val="0"/>
+          <w:b/>
           <w:color w:val="000000"/>
           <w:sz w:val="40"/>
         </w:rPr>
@@ -3628,7 +3647,7 @@
       <w:r>
         <w:rPr>
           <w:rFonts w:ascii="Times New Roman" w:hAnsi="Times New Roman"/>
-          <w:b w:val="0"/>
+          <w:b/>
           <w:color w:val="000000"/>
           <w:sz w:val="40"/>
         </w:rPr>
@@ -3705,7 +3724,7 @@
       <w:r>
         <w:rPr>
           <w:rFonts w:ascii="Times New Roman" w:hAnsi="Times New Roman"/>
-          <w:b w:val="0"/>
+          <w:b/>
           <w:color w:val="000000"/>
           <w:sz w:val="40"/>
         </w:rPr>
@@ -3767,7 +3786,7 @@
       <w:r>
         <w:rPr>
           <w:rFonts w:ascii="Times New Roman" w:hAnsi="Times New Roman"/>
-          <w:b w:val="0"/>
+          <w:b/>
           <w:color w:val="000000"/>
           <w:sz w:val="40"/>
         </w:rPr>
@@ -3845,7 +3864,7 @@
       <w:r>
         <w:rPr>
           <w:rFonts w:ascii="Times New Roman" w:hAnsi="Times New Roman"/>
-          <w:b w:val="0"/>
+          <w:b/>
           <w:color w:val="000000"/>
           <w:sz w:val="40"/>
         </w:rPr>
@@ -3954,7 +3973,7 @@
       <w:r>
         <w:rPr>
           <w:rFonts w:ascii="Times New Roman" w:hAnsi="Times New Roman"/>
-          <w:b w:val="0"/>
+          <w:b/>
           <w:color w:val="000000"/>
           <w:sz w:val="40"/>
         </w:rPr>
@@ -4015,11 +4034,19 @@
       <w:r>
         <w:rPr>
           <w:rFonts w:ascii="Times New Roman" w:hAnsi="Times New Roman"/>
+          <w:b/>
+          <w:color w:val="000000"/>
+          <w:sz w:val="40"/>
+        </w:rPr>
+        <w:t xml:space="preserve">Result: </w:t>
+      </w:r>
+      <w:r>
+        <w:rPr>
+          <w:rFonts w:ascii="Times New Roman" w:hAnsi="Times New Roman"/>
           <w:b w:val="0"/>
-          <w:color w:val="000000"/>
-          <w:sz w:val="40"/>
-        </w:rPr>
-        <w:t>Result: The updated application was deployed successfully and verified through its assigned NodePort.</w:t>
+          <w:sz w:val="40"/>
+        </w:rPr>
+        <w:t>The updated application was deployed successfully and verified through its assigned NodePort.</w:t>
       </w:r>
     </w:p>
     <w:sectPr>

</xml_diff>

<commit_message>
Include complete index.html source in smaller code blocks
</commit_message>
<xml_diff>
--- a/report/DA 9.docx
+++ b/report/DA 9.docx
@@ -396,7 +396,7 @@
           <w:rFonts w:ascii="Consolas" w:hAnsi="Consolas"/>
           <w:b w:val="0"/>
           <w:color w:val="000000"/>
-          <w:sz w:val="24"/>
+          <w:sz w:val="20"/>
         </w:rPr>
         <w:t>apiVersion: apps/v1</w:t>
         <w:br/>
@@ -502,7 +502,7 @@
           <w:rFonts w:ascii="Consolas" w:hAnsi="Consolas"/>
           <w:b w:val="0"/>
           <w:color w:val="000000"/>
-          <w:sz w:val="24"/>
+          <w:sz w:val="20"/>
         </w:rPr>
         <w:t>apiVersion: v1</w:t>
         <w:br/>
@@ -559,7 +559,7 @@
           <w:rFonts w:ascii="Consolas" w:hAnsi="Consolas"/>
           <w:b w:val="0"/>
           <w:color w:val="000000"/>
-          <w:sz w:val="24"/>
+          <w:sz w:val="20"/>
         </w:rPr>
         <w:t>FROM nginx:1.27-alpine</w:t>
         <w:br/>
@@ -663,39 +663,7 @@
           <w:color w:val="000000"/>
           <w:sz w:val="40"/>
         </w:rPr>
-        <w:t>Step 2: Pushing the code to github</w:t>
-      </w:r>
-    </w:p>
-    <w:p>
-      <w:pPr>
-        <w:pStyle w:val="BodyText"/>
-        <w:keepNext w:val="0"/>
-        <w:keepLines/>
-      </w:pPr>
-      <w:r>
-        <w:rPr>
-          <w:rFonts w:ascii="Times New Roman" w:hAnsi="Times New Roman"/>
-          <w:b w:val="0"/>
-          <w:color w:val="000000"/>
-          <w:sz w:val="40"/>
-        </w:rPr>
-        <w:t>One GitHub repository was used for all three questions. The main branch contains the application files and the complete CI/CD implementation.</w:t>
-      </w:r>
-    </w:p>
-    <w:p>
-      <w:pPr>
-        <w:pStyle w:val="BodyText"/>
-        <w:keepNext/>
-        <w:keepLines/>
-      </w:pPr>
-      <w:r>
-        <w:rPr>
-          <w:rFonts w:ascii="Times New Roman" w:hAnsi="Times New Roman"/>
-          <w:b/>
-          <w:color w:val="000000"/>
-          <w:sz w:val="40"/>
-        </w:rPr>
-        <w:t>Commands used:</w:t>
+        <w:t>index.html (full code)</w:t>
       </w:r>
     </w:p>
     <w:p>
@@ -710,7 +678,131 @@
           <w:rFonts w:ascii="Consolas" w:hAnsi="Consolas"/>
           <w:b w:val="0"/>
           <w:color w:val="000000"/>
-          <w:sz w:val="24"/>
+          <w:sz w:val="20"/>
+        </w:rPr>
+        <w:t>&lt;!doctype html&gt;</w:t>
+        <w:br/>
+        <w:t>&lt;html lang="en"&gt;</w:t>
+        <w:br/>
+        <w:t>&lt;head&gt;</w:t>
+        <w:br/>
+        <w:t>&lt;meta charset="utf-8"&gt;&lt;meta name="viewport" content="width=device-width, initial-scale=1"&gt;</w:t>
+        <w:br/>
+        <w:t>&lt;meta name="release" content="v2"&gt;&lt;title&gt;VIT Learn — University Learning Management Portal&lt;/title&gt;</w:t>
+        <w:br/>
+        <w:t>&lt;style&gt;</w:t>
+        <w:br/>
+        <w:t>:root{--ink:#15223b;--muted:#667085;--blue:#2e6ce6;--ice:#edf5ff;--line:#d9e2f0}*{box-sizing:border-box}body{margin:0;font-family:Inter,Segoe UI,Arial,sans-serif;color:var(--ink);background:#f7f9fc}header{background:linear-gradient(135deg,#081a34,#1d4fa3);color:#fff;padding:28px 7vw 34px}nav{display:flex;align-items:center;justify-content:space-between;max-width:1180px;margin:auto}.brand{font-weight:800;letter-spacing:.02em;font-size:22px}nav a{color:#dbe8ff;text-decoration:none;margin-left:24px;font-size:14px}.hero{max-width:1180px;margin:55px auto 0;display:grid;grid-template-columns:1.2fr .8fr;gap:36px;align-items:center}.eyebrow{font-size:12px;color:var(--blue);font-weight:750;letter-spacing:.1em;text-transform:uppercase}header .eyebrow{color:#9fc1ff}h1{font-size:clamp(38px,5vw,68px);line-height:1.02;max-width:650px;margin:10px 0 20px;letter-spacing:-.04em}.hero p{color:#dce8fb;font-size:18px;line-height:1.6;max-width:570px}.hero-card{background:rgba(255,255,255,.1);border:1px solid rgba(255,255,255,.24);border-radius:22px;padding:24px}.hero-card strong{display:block;font-size:16px;margin-bottom:14px}.metric{display:flex;justify-content:space-between;border-top:1px solid rgba(255,255,255,.25);padding:14px 0;color:#e4efff}main{max-width:1180px;margin:0 auto;padding:44px 7vw 70px}.section-head{display:flex;justify-content:space-between;align-items:end;gap:20px;margin-bottom:20px}h2{font-size:27px;margin:7px 0 0;letter-spacing:-.02em}.section-head p{margin:0;color:var(--muted)}.grid{display:grid;grid-template-columns:repeat(3,1fr);gap:18px}.card{background:#fff;border:1px solid var(--line);border-radius:16px;padding:22px;box-shadow:0 8px 22px rgba(25,52,89,.05)}.card h3{margin:8px 0;font-size:18px}.card p{color:var(--muted);line-height:1.5;margin:0}.announcements{margin-top:34px;display:grid;grid-template-columns:1fr 1fr;gap:18px}.announcement{padding:20px;border-left:4px solid var(--blue);background:var(--ice);border-radius:0 14px 14px 0}.announcement p{margin:7px 0 0;color:#42516d;line-height:1.5}footer{text-align:center;padding:22px;color:var(--muted);font-size:13px;border-top:1px solid var(--line)}@media(max-width:760px){nav a{margin-left:10px;font-size:12px}.hero{grid-template-columns:1fr;margin-top:38px}.grid,.announcements{grid-template-columns:1fr}.section-head{display:block}.section-head p{margin-top:8px}}</w:t>
+        <w:br/>
+        <w:t>a:focus-visible{outline:3px solid #cf8b00;outline-offset:5px}html{scroll-behavior:smooth}@media(prefers-reduced-motion:reduce){html{scroll-behavior:auto}}&lt;/style&gt;</w:t>
+        <w:br/>
+        <w:t>&lt;/head&gt;</w:t>
+      </w:r>
+    </w:p>
+    <w:p>
+      <w:pPr>
+        <w:pStyle w:val="BodyText"/>
+        <w:keepNext/>
+        <w:keepLines/>
+        <w:pageBreakBefore/>
+      </w:pPr>
+      <w:r>
+        <w:rPr>
+          <w:rFonts w:ascii="Times New Roman" w:hAnsi="Times New Roman"/>
+          <w:b/>
+          <w:color w:val="000000"/>
+          <w:sz w:val="40"/>
+        </w:rPr>
+        <w:t>index.html (continued)</w:t>
+      </w:r>
+    </w:p>
+    <w:p>
+      <w:pPr>
+        <w:pStyle w:val="BodyText"/>
+        <w:keepNext w:val="0"/>
+        <w:keepLines/>
+        <w:spacing w:before="0" w:after="100" w:line="240" w:lineRule="auto"/>
+      </w:pPr>
+      <w:r>
+        <w:rPr>
+          <w:rFonts w:ascii="Consolas" w:hAnsi="Consolas"/>
+          <w:b w:val="0"/>
+          <w:color w:val="000000"/>
+          <w:sz w:val="20"/>
+        </w:rPr>
+        <w:t>&lt;body&gt;</w:t>
+        <w:br/>
+        <w:t>&lt;header&gt;&lt;nav&gt;&lt;div class="brand"&gt;VIT LEARN&lt;/div&gt;&lt;div&gt;&lt;a href="#courses"&gt;Courses&lt;/a&gt;&lt;a href="#faculty"&gt;Faculty&lt;/a&gt;&lt;a href="#schedule"&gt;Schedule&lt;/a&gt;&lt;/div&gt;&lt;/nav&gt;&lt;div class="hero"&gt;&lt;div&gt;&lt;div class="eyebrow"&gt;University learning, connected&lt;/div&gt;&lt;h1&gt;Your semester, in one clear view.&lt;/h1&gt;&lt;p&gt;Browse active courses, meet your faculty, find resources, and stay ahead of every deadline from one learning workspace.&lt;/p&gt;&lt;/div&gt;&lt;div class="hero-card"&gt;&lt;strong&gt;Semester pulse · Fall 2026&lt;/strong&gt;&lt;div class="metric"&gt;&lt;span&gt;Active courses&lt;/span&gt;&lt;b&gt;06&lt;/b&gt;&lt;/div&gt;&lt;div class="metric"&gt;&lt;span&gt;Learning resources&lt;/span&gt;&lt;b&gt;42&lt;/b&gt;&lt;/div&gt;&lt;div class="metric"&gt;&lt;span&gt;Next assessment&lt;/span&gt;&lt;b&gt;21 Oct&lt;/b&gt;&lt;/div&gt;&lt;/div&gt;&lt;/div&gt;&lt;/header&gt;</w:t>
+        <w:br/>
+        <w:t>&lt;main&gt;&lt;div class="section-head" id="courses"&gt;&lt;div&gt;&lt;div class="eyebrow"&gt;Your curriculum&lt;/div&gt;&lt;h2&gt;Featured courses&lt;/h2&gt;&lt;/div&gt;&lt;p&gt;Updated by the academic office · 15 Oct 2026&lt;/p&gt;&lt;/div&gt;&lt;div class="grid"&gt;&lt;article class="card"&gt;&lt;div class="eyebrow"&gt;ISWE406P&lt;/div&gt;&lt;h3&gt;Agile Development &amp; DevOps&lt;/h3&gt;&lt;p&gt;CI/CD, version control, containers and reliable delivery practices.&lt;/p&gt;&lt;/article&gt;&lt;article class="card"&gt;&lt;div class="eyebrow"&gt;BCSE401L&lt;/div&gt;&lt;h3&gt;Cloud Computing Lab&lt;/h3&gt;&lt;p&gt;Deploy cloud-native services with secure and observable infrastructure.&lt;/p&gt;&lt;/article&gt;&lt;article class="card"&gt;&lt;div class="eyebrow"&gt;BCSE402L&lt;/div&gt;&lt;h3&gt;Software Architecture&lt;/h3&gt;&lt;p&gt;Model systems that stay understandable as teams and products scale.&lt;/p&gt;&lt;/article&gt;&lt;/div&gt;&lt;div class="announcements"&gt;&lt;div class="announcement" id="faculty"&gt;&lt;div class="eyebrow"&gt;Faculty spotlight&lt;/div&gt;&lt;strong&gt;Dr. Sweta Bhattacharya&lt;/strong&gt;&lt;p&gt;DevOps and delivery systems faculty · Office hours Wednesday, 14:00–16:00.&lt;/p&gt;&lt;/div&gt;&lt;div class="announcement" id="schedule"&gt;&lt;div class="eyebrow"&gt;Exam schedule&lt;/div&gt;&lt;strong&gt;Mid-semester examinations&lt;/strong&gt;&lt;p&gt;Assessment week begins 02 November. The final timetable is available in Resources.&lt;/p&gt;&lt;/div&gt;&lt;/div&gt;&lt;section class="announcements"&gt;&lt;div class="announcement"&gt;&lt;h2&gt;Learning resources&lt;/h2&gt;&lt;p&gt;&lt;a href="resources/devops-guide.txt" download&gt;Download the DevOps revision guide&lt;/a&gt;&lt;/p&gt;&lt;p&gt;CI/CD concepts, Docker commands and Kubernetes revision notes.&lt;/p&gt;&lt;/div&gt;&lt;div class="announcement"&gt;&lt;h2&gt;Assignment announcements&lt;/h2&gt;&lt;p&gt;Assessment VIII: submit the three portals, pipeline evidence and rollback demonstration by 21 October.&lt;/p&gt;&lt;/div&gt;&lt;/section&gt;&lt;section id="release-update" class="announcements"&gt;&lt;div class="announcement"&gt;&lt;h2&gt;Version 2 resource update&lt;/h2&gt;&lt;p&gt;The DevOps revision guide and assessment announcement are now available in the learning resources section.&lt;/p&gt;&lt;/div&gt;&lt;/section&gt;&lt;/main&gt;</w:t>
+        <w:br/>
+        <w:t>&lt;footer&gt;VIT Learn · University Learning Management Portal · Version 2.0 stable&lt;/footer&gt;</w:t>
+        <w:br/>
+        <w:t>&lt;/body&gt;&lt;/html&gt;</w:t>
+      </w:r>
+    </w:p>
+    <w:p>
+      <w:pPr>
+        <w:pStyle w:val="BodyText"/>
+        <w:keepNext/>
+        <w:keepLines/>
+        <w:pageBreakBefore/>
+      </w:pPr>
+      <w:r>
+        <w:rPr>
+          <w:rFonts w:ascii="Times New Roman" w:hAnsi="Times New Roman"/>
+          <w:b/>
+          <w:color w:val="000000"/>
+          <w:sz w:val="40"/>
+        </w:rPr>
+        <w:t>Step 2: Pushing the code to github</w:t>
+      </w:r>
+    </w:p>
+    <w:p>
+      <w:pPr>
+        <w:pStyle w:val="BodyText"/>
+        <w:keepNext w:val="0"/>
+        <w:keepLines/>
+      </w:pPr>
+      <w:r>
+        <w:rPr>
+          <w:rFonts w:ascii="Times New Roman" w:hAnsi="Times New Roman"/>
+          <w:b w:val="0"/>
+          <w:color w:val="000000"/>
+          <w:sz w:val="40"/>
+        </w:rPr>
+        <w:t>One GitHub repository was used for all three questions. The main branch contains the application files and the complete CI/CD implementation.</w:t>
+      </w:r>
+    </w:p>
+    <w:p>
+      <w:pPr>
+        <w:pStyle w:val="BodyText"/>
+        <w:keepNext/>
+        <w:keepLines/>
+      </w:pPr>
+      <w:r>
+        <w:rPr>
+          <w:rFonts w:ascii="Times New Roman" w:hAnsi="Times New Roman"/>
+          <w:b/>
+          <w:color w:val="000000"/>
+          <w:sz w:val="40"/>
+        </w:rPr>
+        <w:t>Commands used:</w:t>
+      </w:r>
+    </w:p>
+    <w:p>
+      <w:pPr>
+        <w:pStyle w:val="BodyText"/>
+        <w:keepNext w:val="0"/>
+        <w:keepLines/>
+        <w:spacing w:before="0" w:after="100" w:line="240" w:lineRule="auto"/>
+      </w:pPr>
+      <w:r>
+        <w:rPr>
+          <w:rFonts w:ascii="Consolas" w:hAnsi="Consolas"/>
+          <w:b w:val="0"/>
+          <w:color w:val="000000"/>
+          <w:sz w:val="20"/>
         </w:rPr>
         <w:t>git add .</w:t>
         <w:br/>
@@ -1660,7 +1752,7 @@
           <w:rFonts w:ascii="Consolas" w:hAnsi="Consolas"/>
           <w:b w:val="0"/>
           <w:color w:val="000000"/>
-          <w:sz w:val="24"/>
+          <w:sz w:val="20"/>
         </w:rPr>
         <w:t>apiVersion: apps/v1</w:t>
         <w:br/>
@@ -1770,7 +1862,7 @@
           <w:rFonts w:ascii="Consolas" w:hAnsi="Consolas"/>
           <w:b w:val="0"/>
           <w:color w:val="000000"/>
-          <w:sz w:val="24"/>
+          <w:sz w:val="20"/>
         </w:rPr>
         <w:t>apiVersion: v1</w:t>
         <w:br/>
@@ -1829,7 +1921,7 @@
           <w:rFonts w:ascii="Consolas" w:hAnsi="Consolas"/>
           <w:b w:val="0"/>
           <w:color w:val="000000"/>
-          <w:sz w:val="24"/>
+          <w:sz w:val="20"/>
         </w:rPr>
         <w:t>FROM nginx:1.27-alpine</w:t>
         <w:br/>
@@ -1933,39 +2025,7 @@
           <w:color w:val="000000"/>
           <w:sz w:val="40"/>
         </w:rPr>
-        <w:t>Step 2: Pushing the code to github</w:t>
-      </w:r>
-    </w:p>
-    <w:p>
-      <w:pPr>
-        <w:pStyle w:val="BodyText"/>
-        <w:keepNext w:val="0"/>
-        <w:keepLines/>
-      </w:pPr>
-      <w:r>
-        <w:rPr>
-          <w:rFonts w:ascii="Times New Roman" w:hAnsi="Times New Roman"/>
-          <w:b w:val="0"/>
-          <w:color w:val="000000"/>
-          <w:sz w:val="40"/>
-        </w:rPr>
-        <w:t>One GitHub repository was used for all three questions. The main branch contains the application files and the complete CI/CD implementation.</w:t>
-      </w:r>
-    </w:p>
-    <w:p>
-      <w:pPr>
-        <w:pStyle w:val="BodyText"/>
-        <w:keepNext/>
-        <w:keepLines/>
-      </w:pPr>
-      <w:r>
-        <w:rPr>
-          <w:rFonts w:ascii="Times New Roman" w:hAnsi="Times New Roman"/>
-          <w:b/>
-          <w:color w:val="000000"/>
-          <w:sz w:val="40"/>
-        </w:rPr>
-        <w:t>Commands used:</w:t>
+        <w:t>index.html (full code)</w:t>
       </w:r>
     </w:p>
     <w:p>
@@ -1980,7 +2040,135 @@
           <w:rFonts w:ascii="Consolas" w:hAnsi="Consolas"/>
           <w:b w:val="0"/>
           <w:color w:val="000000"/>
-          <w:sz w:val="24"/>
+          <w:sz w:val="20"/>
+        </w:rPr>
+        <w:t>&lt;!doctype html&gt;</w:t>
+        <w:br/>
+        <w:t>&lt;html lang="en"&gt;</w:t>
+        <w:br/>
+        <w:t>&lt;head&gt;</w:t>
+        <w:br/>
+        <w:t>&lt;meta charset="utf-8"&gt;&lt;meta name="viewport" content="width=device-width, initial-scale=1"&gt;&lt;meta name="release" content="v2"&gt;&lt;title&gt;Plate &amp; Parcel — Online Food Ordering&lt;/title&gt;</w:t>
+        <w:br/>
+        <w:t>&lt;style&gt;</w:t>
+        <w:br/>
+        <w:t>:root{--ink:#271f20;--muted:#746b6a;--tomato:#e94b35;--cream:#fff8f2;--peach:#ffe8dc;--green:#2f7d5b;--line:#ead8d0}*{box-sizing:border-box}body{margin:0;font-family:Inter,Segoe UI,Arial,sans-serif;background:var(--cream);color:var(--ink)}header{padding:24px 7vw 52px;background:#fff3ea}nav{max-width:1180px;margin:auto;display:flex;justify-content:space-between;align-items:center}.brand{font-weight:850;font-size:21px;letter-spacing:-.03em}nav a{color:var(--muted);text-decoration:none;margin-left:22px;font-size:14px}.hero{max-width:1180px;margin:62px auto 0;display:grid;grid-template-columns:1.05fr .95fr;gap:40px;align-items:center}.eyebrow{color:var(--tomato);font-weight:800;text-transform:uppercase;letter-spacing:.11em;font-size:11px}h1{font-size:clamp(40px,5vw,70px);line-height:1;letter-spacing:-.055em;margin:12px 0 19px}.hero p{font-size:18px;line-height:1.6;color:var(--muted);max-width:530px}.hero-art{background:linear-gradient(135deg,#f76b4c,#bc2f45);min-height:330px;border-radius:28px;position:relative;overflow:hidden;box-shadow:0 20px 40px rgba(184,66,44,.2)}.plate{width:220px;height:220px;background:#fff;border-radius:50%;position:absolute;left:50%;top:50%;transform:translate(-50%,-50%);box-shadow:0 12px 0 rgba(255,255,255,.25)}.food{position:absolute;font-size:72px;left:50%;top:50%;transform:translate(-50%,-54%)}.badge{position:absolute;right:22px;top:22px;background:#fff3b7;color:#674318;font-weight:800;padding:10px 13px;border-radius:999px;font-size:12px}.main{max-width:1180px;margin:auto;padding:42px 7vw 70px}.head{display:flex;justify-content:space-between;align-items:end;margin-bottom:18px}.head h2{font-size:28px;margin:6px 0 0}.head p{color:var(--muted);margin:0}.grid{display:grid;grid-template-columns:repeat(3,1fr);gap:18px}.card{background:#fff;border:1px solid var(--line);padding:22px;border-radius:18px}.card-top{display:flex;justify-content:space-between}.card h3{margin:11px 0 7px;font-size:19px}.card p{color:var(--muted);line-height:1.5;margin:0}.price{font-weight:850;color:var(--green)}.tags{margin-top:16px;display:flex;gap:7px;flex-wrap:wrap}.tag{background:var(--peach);color:#8e4634;border-radius:99px;padding:6px 9px;font-size:11px;font-weight:700}.offer{margin-top:34px;display:flex;justify-content:space-between;align-items:center;background:#27201f;color:#fff;padding:26px;border-radius:18px}.offer p{margin:6px 0 0;color:#e5d7d2}.code{background:#f5bd72;color:#48200f;font-weight:900;border-radius:10px;padding:12px 16px}.foot{text-align:center;color:var(--muted);padding:22px;border-top:1px solid var(--line);font-size:13px}@media(max-width:760px){.hero{grid-template-columns:1fr;margin-top:38px}.grid{grid-template-columns:1fr}.offer{display:block}.code{display:inline-block;margin-top:16px}nav a{margin-left:8px;font-size:12px}}</w:t>
+        <w:br/>
+        <w:t>a:focus-visible{outline:3px solid #cf8b00;outline-offset:5px}html{scroll-behavior:smooth}@media(prefers-reduced-motion:reduce){html{scroll-behavior:auto}}&lt;/style&gt;</w:t>
+        <w:br/>
+        <w:t>&lt;/head&gt;</w:t>
+      </w:r>
+    </w:p>
+    <w:p>
+      <w:pPr>
+        <w:pStyle w:val="BodyText"/>
+        <w:keepNext/>
+        <w:keepLines/>
+        <w:pageBreakBefore/>
+      </w:pPr>
+      <w:r>
+        <w:rPr>
+          <w:rFonts w:ascii="Times New Roman" w:hAnsi="Times New Roman"/>
+          <w:b/>
+          <w:color w:val="000000"/>
+          <w:sz w:val="40"/>
+        </w:rPr>
+        <w:t>index.html (continued)</w:t>
+      </w:r>
+    </w:p>
+    <w:p>
+      <w:pPr>
+        <w:pStyle w:val="BodyText"/>
+        <w:keepNext w:val="0"/>
+        <w:keepLines/>
+        <w:spacing w:before="0" w:after="100" w:line="240" w:lineRule="auto"/>
+      </w:pPr>
+      <w:r>
+        <w:rPr>
+          <w:rFonts w:ascii="Consolas" w:hAnsi="Consolas"/>
+          <w:b w:val="0"/>
+          <w:color w:val="000000"/>
+          <w:sz w:val="20"/>
+        </w:rPr>
+        <w:t>&lt;body&gt;</w:t>
+        <w:br/>
+        <w:t>&lt;header&gt;&lt;nav&gt;&lt;div class="brand"&gt;PLATE &amp; PARCEL&lt;/div&gt;&lt;div&gt;&lt;a href="#restaurants"&gt;Restaurants&lt;/a&gt;&lt;a href="#offers"&gt;Offers&lt;/a&gt;&lt;a href="#orders"&gt;My orders&lt;/a&gt;&lt;/div&gt;&lt;/nav&gt;&lt;div class="hero"&gt;&lt;div&gt;&lt;div class="eyebrow"&gt;Dinner, delivered with care&lt;/div&gt;&lt;h1&gt;Good food finds you here.&lt;/h1&gt;&lt;p&gt;Explore neighbourhood kitchens, discover new favourites, and order a meal that arrives exactly when you want it.&lt;/p&gt;&lt;/div&gt;&lt;div class="hero-art"&gt;&lt;div class="badge"&gt;Free delivery today&lt;/div&gt;&lt;div class="plate"&gt;&lt;div class="food"&gt;🍜&lt;/div&gt;&lt;/div&gt;&lt;/div&gt;&lt;/div&gt;&lt;/header&gt;</w:t>
+        <w:br/>
+        <w:t>&lt;main class="main"&gt;&lt;div class="head" id="restaurants"&gt;&lt;div&gt;&lt;div class="eyebrow"&gt;Open now near you&lt;/div&gt;&lt;h2&gt;Popular kitchens&lt;/h2&gt;&lt;/div&gt;&lt;p&gt;Average delivery · 25–35 min&lt;/p&gt;&lt;/div&gt;&lt;div class="grid"&gt;</w:t>
+        <w:br/>
+        <w:t>&lt;article class="card"&gt;&lt;div class="card-top"&gt;&lt;div class="eyebrow"&gt;Japanese · 4.8 ★&lt;/div&gt;&lt;div class="price"&gt;₹₹&lt;/div&gt;&lt;/div&gt;&lt;h3&gt;Umami House&lt;/h3&gt;&lt;p&gt;Ramen, donburi and small plates with a rich, slow-cooked broth.&lt;/p&gt;&lt;div class="tags"&gt;&lt;span class="tag"&gt;Top rated&lt;/span&gt;&lt;span class="tag"&gt;Veg options&lt;/span&gt;&lt;/div&gt;&lt;/article&gt;</w:t>
+        <w:br/>
+        <w:t>&lt;article class="card"&gt;&lt;div class="card-top"&gt;&lt;div class="eyebrow"&gt;Indian · 4.7 ★&lt;/div&gt;&lt;div class="price"&gt;₹₹&lt;/div&gt;&lt;/div&gt;&lt;h3&gt;Spice Route&lt;/h3&gt;&lt;p&gt;Regional comfort food, clay-oven breads and bright seasonal thalis.&lt;/p&gt;&lt;div class="tags"&gt;&lt;span class="tag"&gt;Bestseller&lt;/span&gt;&lt;span class="tag"&gt;Halal&lt;/span&gt;&lt;/div&gt;&lt;/article&gt;</w:t>
+        <w:br/>
+        <w:t>&lt;article class="card"&gt;&lt;div class="card-top"&gt;&lt;div class="eyebrow"&gt;Bakery · 4.9 ★&lt;/div&gt;&lt;div class="price"&gt;₹&lt;/div&gt;&lt;/div&gt;&lt;h3&gt;Crumb &amp; Co.&lt;/h3&gt;&lt;p&gt;Warm sourdough, hand-rolled pastries and coffee for every mood.&lt;/p&gt;&lt;div class="tags"&gt;&lt;span class="tag"&gt;Fresh today&lt;/span&gt;&lt;span class="tag"&gt;Breakfast&lt;/span&gt;&lt;/div&gt;&lt;/article&gt;</w:t>
+        <w:br/>
+        <w:t>&lt;/div&gt;&lt;div class="offer" id="offers"&gt;&lt;div&gt;&lt;div class="eyebrow" style="color:#f5bd72"&gt;A little extra&lt;/div&gt;&lt;strong&gt;20% off your first order&lt;/strong&gt;&lt;p&gt;Use the code at checkout before 31 October.&lt;/p&gt;&lt;/div&gt;&lt;div class="code"&gt;WELCOME20&lt;/div&gt;&lt;/div&gt;&lt;section class="offer" style="background:#fff;color:#271f20;border:1px solid #ead8d0"&gt;&lt;div&gt;&lt;div class="eyebrow"&gt;Today’s menu · available now&lt;/div&gt;&lt;h2&gt;Choose your next favourite&lt;/h2&gt;&lt;p style="color:#746b6a"&gt;Miso ramen · Japanese · ₹280 · Available&lt;br&gt;Paneer thali · Indian · ₹220 · Available&lt;br&gt;Butter croissant · Bakery · ₹120 · Available&lt;/p&gt;&lt;/div&gt;&lt;/section&gt;&lt;section id="release-update" class="offer" style="background:#f0e4d9;color:#271f20"&gt;&lt;div&gt;&lt;div class="eyebrow"&gt;New in version 2&lt;/div&gt;&lt;h2&gt;Thank you for ordering with us.&lt;/h2&gt;&lt;p style="color:#574d49"&gt;Restaurant rating summary: 4.8 / 5 across our three featured kitchens. Your next favourite is only an order away.&lt;/p&gt;&lt;/div&gt;&lt;/section&gt;&lt;/main&gt;&lt;footer id="orders" class="foot"&gt;Plate &amp; Parcel · Online Food Ordering Portal · Menu refreshed 15 Oct 2026&lt;/footer&gt;</w:t>
+        <w:br/>
+        <w:t>&lt;/body&gt;&lt;/html&gt;</w:t>
+      </w:r>
+    </w:p>
+    <w:p>
+      <w:pPr>
+        <w:pStyle w:val="BodyText"/>
+        <w:keepNext/>
+        <w:keepLines/>
+        <w:pageBreakBefore/>
+      </w:pPr>
+      <w:r>
+        <w:rPr>
+          <w:rFonts w:ascii="Times New Roman" w:hAnsi="Times New Roman"/>
+          <w:b/>
+          <w:color w:val="000000"/>
+          <w:sz w:val="40"/>
+        </w:rPr>
+        <w:t>Step 2: Pushing the code to github</w:t>
+      </w:r>
+    </w:p>
+    <w:p>
+      <w:pPr>
+        <w:pStyle w:val="BodyText"/>
+        <w:keepNext w:val="0"/>
+        <w:keepLines/>
+      </w:pPr>
+      <w:r>
+        <w:rPr>
+          <w:rFonts w:ascii="Times New Roman" w:hAnsi="Times New Roman"/>
+          <w:b w:val="0"/>
+          <w:color w:val="000000"/>
+          <w:sz w:val="40"/>
+        </w:rPr>
+        <w:t>One GitHub repository was used for all three questions. The main branch contains the application files and the complete CI/CD implementation.</w:t>
+      </w:r>
+    </w:p>
+    <w:p>
+      <w:pPr>
+        <w:pStyle w:val="BodyText"/>
+        <w:keepNext/>
+        <w:keepLines/>
+      </w:pPr>
+      <w:r>
+        <w:rPr>
+          <w:rFonts w:ascii="Times New Roman" w:hAnsi="Times New Roman"/>
+          <w:b/>
+          <w:color w:val="000000"/>
+          <w:sz w:val="40"/>
+        </w:rPr>
+        <w:t>Commands used:</w:t>
+      </w:r>
+    </w:p>
+    <w:p>
+      <w:pPr>
+        <w:pStyle w:val="BodyText"/>
+        <w:keepNext w:val="0"/>
+        <w:keepLines/>
+        <w:spacing w:before="0" w:after="100" w:line="240" w:lineRule="auto"/>
+      </w:pPr>
+      <w:r>
+        <w:rPr>
+          <w:rFonts w:ascii="Consolas" w:hAnsi="Consolas"/>
+          <w:b w:val="0"/>
+          <w:color w:val="000000"/>
+          <w:sz w:val="20"/>
         </w:rPr>
         <w:t>git add .</w:t>
         <w:br/>
@@ -2930,7 +3118,7 @@
           <w:rFonts w:ascii="Consolas" w:hAnsi="Consolas"/>
           <w:b w:val="0"/>
           <w:color w:val="000000"/>
-          <w:sz w:val="24"/>
+          <w:sz w:val="20"/>
         </w:rPr>
         <w:t>apiVersion: apps/v1</w:t>
         <w:br/>
@@ -3036,7 +3224,7 @@
           <w:rFonts w:ascii="Consolas" w:hAnsi="Consolas"/>
           <w:b w:val="0"/>
           <w:color w:val="000000"/>
-          <w:sz w:val="24"/>
+          <w:sz w:val="20"/>
         </w:rPr>
         <w:t>apiVersion: v1</w:t>
         <w:br/>
@@ -3093,7 +3281,7 @@
           <w:rFonts w:ascii="Consolas" w:hAnsi="Consolas"/>
           <w:b w:val="0"/>
           <w:color w:val="000000"/>
-          <w:sz w:val="24"/>
+          <w:sz w:val="20"/>
         </w:rPr>
         <w:t>FROM nginx:1.27-alpine</w:t>
         <w:br/>
@@ -3197,39 +3385,7 @@
           <w:color w:val="000000"/>
           <w:sz w:val="40"/>
         </w:rPr>
-        <w:t>Step 2: Pushing the code to github</w:t>
-      </w:r>
-    </w:p>
-    <w:p>
-      <w:pPr>
-        <w:pStyle w:val="BodyText"/>
-        <w:keepNext w:val="0"/>
-        <w:keepLines/>
-      </w:pPr>
-      <w:r>
-        <w:rPr>
-          <w:rFonts w:ascii="Times New Roman" w:hAnsi="Times New Roman"/>
-          <w:b w:val="0"/>
-          <w:color w:val="000000"/>
-          <w:sz w:val="40"/>
-        </w:rPr>
-        <w:t>One GitHub repository was used for all three questions. The main branch contains the application files and the complete CI/CD implementation.</w:t>
-      </w:r>
-    </w:p>
-    <w:p>
-      <w:pPr>
-        <w:pStyle w:val="BodyText"/>
-        <w:keepNext/>
-        <w:keepLines/>
-      </w:pPr>
-      <w:r>
-        <w:rPr>
-          <w:rFonts w:ascii="Times New Roman" w:hAnsi="Times New Roman"/>
-          <w:b/>
-          <w:color w:val="000000"/>
-          <w:sz w:val="40"/>
-        </w:rPr>
-        <w:t>Commands used:</w:t>
+        <w:t>index.html (full code)</w:t>
       </w:r>
     </w:p>
     <w:p>
@@ -3244,7 +3400,121 @@
           <w:rFonts w:ascii="Consolas" w:hAnsi="Consolas"/>
           <w:b w:val="0"/>
           <w:color w:val="000000"/>
-          <w:sz w:val="24"/>
+          <w:sz w:val="20"/>
+        </w:rPr>
+        <w:t>&lt;!doctype html&gt;</w:t>
+        <w:br/>
+        <w:t>&lt;html lang="en"&gt;</w:t>
+        <w:br/>
+        <w:t>&lt;head&gt;</w:t>
+        <w:br/>
+        <w:t>&lt;meta charset="utf-8"&gt;&lt;meta name="viewport" content="width=device-width, initial-scale=1"&gt;&lt;meta name="release" content="v2"&gt;&lt;title&gt;Northstar Health — Hospital Appointment Portal&lt;/title&gt;</w:t>
+        <w:br/>
+        <w:t>&lt;style&gt;</w:t>
+        <w:br/>
+        <w:t>:root{--ink:#172a31;--muted:#64747a;--teal:#1e7c78;--mint:#e6f4f1;--line:#d9e6e4;--white:#fff}*{box-sizing:border-box}body{margin:0;font-family:Inter,Segoe UI,Arial,sans-serif;color:var(--ink);background:#f7fbfa}header{background:#ecf7f4;padding:24px 7vw 50px}nav{max-width:1180px;margin:auto;display:flex;justify-content:space-between;align-items:center}.brand{font-weight:850;letter-spacing:-.03em;font-size:21px}nav a{font-size:14px;color:var(--muted);text-decoration:none;margin-left:22px}.hero{max-width:1180px;margin:58px auto 0;display:grid;grid-template-columns:1fr 1fr;gap:50px;align-items:center}.eyebrow{text-transform:uppercase;letter-spacing:.12em;font-size:11px;font-weight:800;color:var(--teal)}h1{font-size:clamp(40px,5vw,68px);line-height:1;letter-spacing:-.055em;margin:12px 0 18px}.hero p{color:var(--muted);font-size:18px;line-height:1.6;max-width:530px}.hero-panel{background:#fff;border:1px solid var(--line);border-radius:20px;padding:26px;box-shadow:0 18px 35px rgba(40,90,84,.08)}.panel-title{display:flex;justify-content:space-between;align-items:center;margin-bottom:18px}.panel-title strong{font-size:18px}.status{font-size:11px;background:#dff4e8;color:#267049;padding:7px 10px;border-radius:99px;font-weight:800}.slot{display:flex;justify-content:space-between;align-items:center;padding:15px 0;border-top:1px solid var(--line);font-size:14px}.slot span{color:var(--muted)}.slot b{color:var(--teal)}main{max-width:1180px;margin:auto;padding:42px 7vw 72px}.head{display:flex;justify-content:space-between;align-items:end;margin-bottom:18px}.head h2{font-size:28px;margin:6px 0 0}.head p{color:var(--muted);margin:0}.grid{display:grid;grid-template-columns:repeat(3,1fr);gap:18px}.card{background:#fff;border:1px solid var(--line);border-radius:17px;padding:22px}.card .initial{width:44px;height:44px;border-radius:12px;background:var(--mint);color:var(--teal);display:grid;place-items:center;font-weight:850;font-size:18px}.card h3{margin:16px 0 5px;font-size:18px}.card p{color:var(--muted);line-height:1.5;margin:0}.specialty{margin-top:14px;color:var(--teal);font-size:12px;font-weight:800}.notice{margin-top:32px;background:#153f43;color:#fff;border-radius:18px;padding:25px;display:flex;justify-content:space-between;align-items:center}.notice p{color:#cbe4df;margin:7px 0 0}.notice strong{font-size:19px}.pill{background:#a6e1d2;color:#154f48;padding:10px 14px;border-radius:999px;font-weight:800;font-size:12px}.foot{text-align:center;color:var(--muted);padding:22px;border-top:1px solid var(--line);font-size:13px}@media(max-width:760px){.hero,.grid{grid-template-columns:1fr}.head{display:block}.head p{margin-top:8px}.notice{display:block}.pill{display:inline-block;margin-top:16px}nav a{margin-left:8px;font-size:12px}}</w:t>
+        <w:br/>
+        <w:t>a:focus-visible{outline:3px solid #cf8b00;outline-offset:5px}html{scroll-behavior:smooth}@media(prefers-reduced-motion:reduce){html{scroll-behavior:auto}}&lt;/style&gt;</w:t>
+        <w:br/>
+        <w:t>&lt;/head&gt;</w:t>
+      </w:r>
+    </w:p>
+    <w:p>
+      <w:pPr>
+        <w:pStyle w:val="BodyText"/>
+        <w:keepNext/>
+        <w:keepLines/>
+        <w:pageBreakBefore/>
+      </w:pPr>
+      <w:r>
+        <w:rPr>
+          <w:rFonts w:ascii="Times New Roman" w:hAnsi="Times New Roman"/>
+          <w:b/>
+          <w:color w:val="000000"/>
+          <w:sz w:val="40"/>
+        </w:rPr>
+        <w:t>index.html (continued)</w:t>
+      </w:r>
+    </w:p>
+    <w:p>
+      <w:pPr>
+        <w:pStyle w:val="BodyText"/>
+        <w:keepNext w:val="0"/>
+        <w:keepLines/>
+        <w:spacing w:before="0" w:after="100" w:line="240" w:lineRule="auto"/>
+      </w:pPr>
+      <w:r>
+        <w:rPr>
+          <w:rFonts w:ascii="Consolas" w:hAnsi="Consolas"/>
+          <w:b w:val="0"/>
+          <w:color w:val="000000"/>
+          <w:sz w:val="20"/>
+        </w:rPr>
+        <w:t>&lt;body&gt;&lt;header&gt;&lt;nav&gt;&lt;div class="brand"&gt;NORTHSTAR HEALTH&lt;/div&gt;&lt;div&gt;&lt;a href="#doctors"&gt;Doctors&lt;/a&gt;&lt;a href="#slots"&gt;Appointments&lt;/a&gt;&lt;a href="#notices"&gt;Notices&lt;/a&gt;&lt;/div&gt;&lt;/nav&gt;&lt;div class="hero"&gt;&lt;div&gt;&lt;div class="eyebrow"&gt;Care that fits your day&lt;/div&gt;&lt;h1&gt;Find the right care, at the right time.&lt;/h1&gt;&lt;p&gt;Browse trusted specialists, view live appointment slots, and book a consultation with confidence.&lt;/p&gt;&lt;/div&gt;&lt;div class="hero-panel" id="slots"&gt;&lt;div class="panel-title"&gt;&lt;strong&gt;Today's availability&lt;/strong&gt;&lt;span class="status"&gt;Live&lt;/span&gt;&lt;/div&gt;&lt;div class="slot"&gt;&lt;span&gt;General medicine&lt;/span&gt;&lt;b&gt;12 slots&lt;/b&gt;&lt;/div&gt;&lt;div class="slot"&gt;&lt;span&gt;Cardiology&lt;/span&gt;&lt;b&gt;04 slots&lt;/b&gt;&lt;/div&gt;&lt;div class="slot"&gt;&lt;span&gt;Dermatology&lt;/span&gt;&lt;b&gt;07 slots&lt;/b&gt;&lt;/div&gt;&lt;div class="slot"&gt;&lt;span&gt;Paediatrics&lt;/span&gt;&lt;b&gt;09 slots&lt;/b&gt;&lt;/div&gt;&lt;/div&gt;&lt;/div&gt;&lt;/header&gt;&lt;main&gt;&lt;div class="head" id="doctors"&gt;&lt;div&gt;&lt;div class="eyebrow"&gt;Meet the team&lt;/div&gt;&lt;h2&gt;Specialists you can trust&lt;/h2&gt;&lt;/div&gt;&lt;p&gt;Consultations available · 15 Oct 2026&lt;/p&gt;&lt;/div&gt;&lt;div class="grid"&gt;&lt;article class="card"&gt;&lt;div class="initial"&gt;AM&lt;/div&gt;&lt;h3&gt;Dr. Aanya Menon&lt;/h3&gt;&lt;p&gt;Consultant cardiologist · 12 years of experience&lt;/p&gt;&lt;div class="specialty"&gt;Next slot · Today, 16:30&lt;/div&gt;&lt;/article&gt;&lt;article class="card"&gt;&lt;div class="initial"&gt;RK&lt;/div&gt;&lt;h3&gt;Dr. Rohan Kapoor&lt;/h3&gt;&lt;p&gt;Senior dermatologist · 9 years of experience&lt;/p&gt;&lt;div class="specialty"&gt;Next slot · Tomorrow, 09:15&lt;/div&gt;&lt;/article&gt;&lt;article class="card"&gt;&lt;div class="initial"&gt;SI&lt;/div&gt;&lt;h3&gt;Dr. Sara Iqbal&lt;/h3&gt;&lt;p&gt;Consultant paediatrician · 14 years of experience&lt;/p&gt;&lt;div class="specialty"&gt;Next slot · Today, 18:00&lt;/div&gt;&lt;/article&gt;&lt;/div&gt;&lt;div class="notice" id="notices"&gt;&lt;div&gt;&lt;div class="eyebrow" style="color:#a6e1d2"&gt;Hospital announcement&lt;/div&gt;&lt;strong&gt;Flu clinic appointments are now open&lt;/strong&gt;&lt;p&gt;Reserve a same-week slot through the appointment desk.&lt;/p&gt;&lt;/div&gt;&lt;div class="pill"&gt;Book a slot&lt;/div&gt;&lt;/div&gt;&lt;section id="release-update" class="notice" style="background:#e0f1ec;color:#172a31"&gt;&lt;div&gt;&lt;div class="eyebrow"&gt;New appointment opportunity ? Version 2&lt;/div&gt;&lt;h2&gt;Vaccination clinic with Dr. Maya Rao&lt;/h2&gt;&lt;p style="color:#3c625b"&gt;Family medicine and immunisation ? 16 years of experience&lt;br&gt;New slots: Monday 09:00, 09:30 and 10:00 ? Consultation: 09:00?12:00&lt;/p&gt;&lt;/div&gt;&lt;/section&gt;&lt;/main&gt;&lt;footer class="foot"&gt;Northstar Health · Hospital Appointment Portal · Secure care scheduling&lt;/footer&gt;&lt;/body&gt;&lt;/html&gt;</w:t>
+      </w:r>
+    </w:p>
+    <w:p>
+      <w:pPr>
+        <w:pStyle w:val="BodyText"/>
+        <w:keepNext/>
+        <w:keepLines/>
+        <w:pageBreakBefore/>
+      </w:pPr>
+      <w:r>
+        <w:rPr>
+          <w:rFonts w:ascii="Times New Roman" w:hAnsi="Times New Roman"/>
+          <w:b/>
+          <w:color w:val="000000"/>
+          <w:sz w:val="40"/>
+        </w:rPr>
+        <w:t>Step 2: Pushing the code to github</w:t>
+      </w:r>
+    </w:p>
+    <w:p>
+      <w:pPr>
+        <w:pStyle w:val="BodyText"/>
+        <w:keepNext w:val="0"/>
+        <w:keepLines/>
+      </w:pPr>
+      <w:r>
+        <w:rPr>
+          <w:rFonts w:ascii="Times New Roman" w:hAnsi="Times New Roman"/>
+          <w:b w:val="0"/>
+          <w:color w:val="000000"/>
+          <w:sz w:val="40"/>
+        </w:rPr>
+        <w:t>One GitHub repository was used for all three questions. The main branch contains the application files and the complete CI/CD implementation.</w:t>
+      </w:r>
+    </w:p>
+    <w:p>
+      <w:pPr>
+        <w:pStyle w:val="BodyText"/>
+        <w:keepNext/>
+        <w:keepLines/>
+      </w:pPr>
+      <w:r>
+        <w:rPr>
+          <w:rFonts w:ascii="Times New Roman" w:hAnsi="Times New Roman"/>
+          <w:b/>
+          <w:color w:val="000000"/>
+          <w:sz w:val="40"/>
+        </w:rPr>
+        <w:t>Commands used:</w:t>
+      </w:r>
+    </w:p>
+    <w:p>
+      <w:pPr>
+        <w:pStyle w:val="BodyText"/>
+        <w:keepNext w:val="0"/>
+        <w:keepLines/>
+        <w:spacing w:before="0" w:after="100" w:line="240" w:lineRule="auto"/>
+      </w:pPr>
+      <w:r>
+        <w:rPr>
+          <w:rFonts w:ascii="Consolas" w:hAnsi="Consolas"/>
+          <w:b w:val="0"/>
+          <w:color w:val="000000"/>
+          <w:sz w:val="20"/>
         </w:rPr>
         <w:t>git add .</w:t>
         <w:br/>

</xml_diff>

<commit_message>
Format complete HTML and CSS in the assignment report
</commit_message>
<xml_diff>
--- a/report/DA 9.docx
+++ b/report/DA 9.docx
@@ -671,7 +671,7 @@
         <w:pStyle w:val="BodyText"/>
         <w:keepNext w:val="0"/>
         <w:keepLines/>
-        <w:spacing w:before="0" w:after="100" w:line="240" w:lineRule="auto"/>
+        <w:spacing w:before="0" w:after="0" w:line="230" w:lineRule="exact"/>
       </w:pPr>
       <w:r>
         <w:rPr>
@@ -684,19 +684,103 @@
         <w:br/>
         <w:t>&lt;html lang="en"&gt;</w:t>
         <w:br/>
-        <w:t>&lt;head&gt;</w:t>
-        <w:br/>
-        <w:t>&lt;meta charset="utf-8"&gt;&lt;meta name="viewport" content="width=device-width, initial-scale=1"&gt;</w:t>
-        <w:br/>
-        <w:t>&lt;meta name="release" content="v2"&gt;&lt;title&gt;VIT Learn — University Learning Management Portal&lt;/title&gt;</w:t>
-        <w:br/>
-        <w:t>&lt;style&gt;</w:t>
-        <w:br/>
-        <w:t>:root{--ink:#15223b;--muted:#667085;--blue:#2e6ce6;--ice:#edf5ff;--line:#d9e2f0}*{box-sizing:border-box}body{margin:0;font-family:Inter,Segoe UI,Arial,sans-serif;color:var(--ink);background:#f7f9fc}header{background:linear-gradient(135deg,#081a34,#1d4fa3);color:#fff;padding:28px 7vw 34px}nav{display:flex;align-items:center;justify-content:space-between;max-width:1180px;margin:auto}.brand{font-weight:800;letter-spacing:.02em;font-size:22px}nav a{color:#dbe8ff;text-decoration:none;margin-left:24px;font-size:14px}.hero{max-width:1180px;margin:55px auto 0;display:grid;grid-template-columns:1.2fr .8fr;gap:36px;align-items:center}.eyebrow{font-size:12px;color:var(--blue);font-weight:750;letter-spacing:.1em;text-transform:uppercase}header .eyebrow{color:#9fc1ff}h1{font-size:clamp(38px,5vw,68px);line-height:1.02;max-width:650px;margin:10px 0 20px;letter-spacing:-.04em}.hero p{color:#dce8fb;font-size:18px;line-height:1.6;max-width:570px}.hero-card{background:rgba(255,255,255,.1);border:1px solid rgba(255,255,255,.24);border-radius:22px;padding:24px}.hero-card strong{display:block;font-size:16px;margin-bottom:14px}.metric{display:flex;justify-content:space-between;border-top:1px solid rgba(255,255,255,.25);padding:14px 0;color:#e4efff}main{max-width:1180px;margin:0 auto;padding:44px 7vw 70px}.section-head{display:flex;justify-content:space-between;align-items:end;gap:20px;margin-bottom:20px}h2{font-size:27px;margin:7px 0 0;letter-spacing:-.02em}.section-head p{margin:0;color:var(--muted)}.grid{display:grid;grid-template-columns:repeat(3,1fr);gap:18px}.card{background:#fff;border:1px solid var(--line);border-radius:16px;padding:22px;box-shadow:0 8px 22px rgba(25,52,89,.05)}.card h3{margin:8px 0;font-size:18px}.card p{color:var(--muted);line-height:1.5;margin:0}.announcements{margin-top:34px;display:grid;grid-template-columns:1fr 1fr;gap:18px}.announcement{padding:20px;border-left:4px solid var(--blue);background:var(--ice);border-radius:0 14px 14px 0}.announcement p{margin:7px 0 0;color:#42516d;line-height:1.5}footer{text-align:center;padding:22px;color:var(--muted);font-size:13px;border-top:1px solid var(--line)}@media(max-width:760px){nav a{margin-left:10px;font-size:12px}.hero{grid-template-columns:1fr;margin-top:38px}.grid,.announcements{grid-template-columns:1fr}.section-head{display:block}.section-head p{margin-top:8px}}</w:t>
-        <w:br/>
-        <w:t>a:focus-visible{outline:3px solid #cf8b00;outline-offset:5px}html{scroll-behavior:smooth}@media(prefers-reduced-motion:reduce){html{scroll-behavior:auto}}&lt;/style&gt;</w:t>
-        <w:br/>
-        <w:t>&lt;/head&gt;</w:t>
+        <w:t xml:space="preserve">  &lt;head&gt;</w:t>
+        <w:br/>
+        <w:t xml:space="preserve">    &lt;meta charset="utf-8" /&gt;</w:t>
+        <w:br/>
+        <w:t xml:space="preserve">    &lt;meta name="viewport" content="width=device-width, initial-scale=1" /&gt;</w:t>
+        <w:br/>
+        <w:t xml:space="preserve">    &lt;meta name="release" content="v2" /&gt;</w:t>
+        <w:br/>
+        <w:t xml:space="preserve">    &lt;title&gt;VIT Learn — University Learning Management Portal&lt;/title&gt;</w:t>
+        <w:br/>
+        <w:t xml:space="preserve">    &lt;style&gt;</w:t>
+        <w:br/>
+        <w:t xml:space="preserve">      :root {</w:t>
+        <w:br/>
+        <w:t xml:space="preserve">        --ink: #15223b;</w:t>
+        <w:br/>
+        <w:t xml:space="preserve">        --muted: #667085;</w:t>
+        <w:br/>
+        <w:t xml:space="preserve">        --blue: #2e6ce6;</w:t>
+        <w:br/>
+        <w:t xml:space="preserve">        --ice: #edf5ff;</w:t>
+        <w:br/>
+        <w:t xml:space="preserve">        --line: #d9e2f0;</w:t>
+        <w:br/>
+        <w:t xml:space="preserve">      }</w:t>
+        <w:br/>
+        <w:t xml:space="preserve">      * {</w:t>
+        <w:br/>
+        <w:t xml:space="preserve">        box-sizing: border-box;</w:t>
+        <w:br/>
+        <w:t xml:space="preserve">      }</w:t>
+        <w:br/>
+        <w:t xml:space="preserve">      body {</w:t>
+        <w:br/>
+        <w:t xml:space="preserve">        margin: 0;</w:t>
+        <w:br/>
+        <w:t xml:space="preserve">        font-family:</w:t>
+        <w:br/>
+        <w:t xml:space="preserve">          Inter,</w:t>
+        <w:br/>
+        <w:t xml:space="preserve">          Segoe UI,</w:t>
+        <w:br/>
+        <w:t xml:space="preserve">          Arial,</w:t>
+        <w:br/>
+        <w:t xml:space="preserve">          sans-serif;</w:t>
+        <w:br/>
+        <w:t xml:space="preserve">        color: var(--ink);</w:t>
+        <w:br/>
+        <w:t xml:space="preserve">        background: #f7f9fc;</w:t>
+        <w:br/>
+        <w:t xml:space="preserve">      }</w:t>
+        <w:br/>
+        <w:t xml:space="preserve">      header {</w:t>
+        <w:br/>
+        <w:t xml:space="preserve">        background: linear-gradient(135deg, #081a34, #1d4fa3);</w:t>
+        <w:br/>
+        <w:t xml:space="preserve">        color: #fff;</w:t>
+        <w:br/>
+        <w:t xml:space="preserve">        padding: 28px 7vw 34px;</w:t>
+        <w:br/>
+        <w:t xml:space="preserve">      }</w:t>
+        <w:br/>
+        <w:t xml:space="preserve">      nav {</w:t>
+        <w:br/>
+        <w:t xml:space="preserve">        display: flex;</w:t>
+        <w:br/>
+        <w:t xml:space="preserve">        align-items: center;</w:t>
+        <w:br/>
+        <w:t xml:space="preserve">        justify-content: space-between;</w:t>
+        <w:br/>
+        <w:t xml:space="preserve">        max-width: 1180px;</w:t>
+        <w:br/>
+        <w:t xml:space="preserve">        margin: auto;</w:t>
+        <w:br/>
+        <w:t xml:space="preserve">      }</w:t>
+        <w:br/>
+        <w:t xml:space="preserve">      .brand {</w:t>
+        <w:br/>
+        <w:t xml:space="preserve">        font-weight: 800;</w:t>
+        <w:br/>
+        <w:t xml:space="preserve">        letter-spacing: 0.02em;</w:t>
+        <w:br/>
+        <w:t xml:space="preserve">        font-size: 22px;</w:t>
+        <w:br/>
+        <w:t xml:space="preserve">      }</w:t>
+        <w:br/>
+        <w:t xml:space="preserve">      nav a {</w:t>
+        <w:br/>
+        <w:t xml:space="preserve">        color: #dbe8ff;</w:t>
+        <w:br/>
+        <w:t xml:space="preserve">        text-decoration: none;</w:t>
+        <w:br/>
+        <w:t xml:space="preserve">        margin-left: 24px;</w:t>
+        <w:br/>
+        <w:t xml:space="preserve">        font-size: 14px;</w:t>
+        <w:br/>
+        <w:t xml:space="preserve">      }</w:t>
       </w:r>
     </w:p>
     <w:p>
@@ -721,7 +805,7 @@
         <w:pStyle w:val="BodyText"/>
         <w:keepNext w:val="0"/>
         <w:keepLines/>
-        <w:spacing w:before="0" w:after="100" w:line="240" w:lineRule="auto"/>
+        <w:spacing w:before="0" w:after="0" w:line="230" w:lineRule="exact"/>
       </w:pPr>
       <w:r>
         <w:rPr>
@@ -730,15 +814,633 @@
           <w:color w:val="000000"/>
           <w:sz w:val="20"/>
         </w:rPr>
-        <w:t>&lt;body&gt;</w:t>
-        <w:br/>
-        <w:t>&lt;header&gt;&lt;nav&gt;&lt;div class="brand"&gt;VIT LEARN&lt;/div&gt;&lt;div&gt;&lt;a href="#courses"&gt;Courses&lt;/a&gt;&lt;a href="#faculty"&gt;Faculty&lt;/a&gt;&lt;a href="#schedule"&gt;Schedule&lt;/a&gt;&lt;/div&gt;&lt;/nav&gt;&lt;div class="hero"&gt;&lt;div&gt;&lt;div class="eyebrow"&gt;University learning, connected&lt;/div&gt;&lt;h1&gt;Your semester, in one clear view.&lt;/h1&gt;&lt;p&gt;Browse active courses, meet your faculty, find resources, and stay ahead of every deadline from one learning workspace.&lt;/p&gt;&lt;/div&gt;&lt;div class="hero-card"&gt;&lt;strong&gt;Semester pulse · Fall 2026&lt;/strong&gt;&lt;div class="metric"&gt;&lt;span&gt;Active courses&lt;/span&gt;&lt;b&gt;06&lt;/b&gt;&lt;/div&gt;&lt;div class="metric"&gt;&lt;span&gt;Learning resources&lt;/span&gt;&lt;b&gt;42&lt;/b&gt;&lt;/div&gt;&lt;div class="metric"&gt;&lt;span&gt;Next assessment&lt;/span&gt;&lt;b&gt;21 Oct&lt;/b&gt;&lt;/div&gt;&lt;/div&gt;&lt;/div&gt;&lt;/header&gt;</w:t>
-        <w:br/>
-        <w:t>&lt;main&gt;&lt;div class="section-head" id="courses"&gt;&lt;div&gt;&lt;div class="eyebrow"&gt;Your curriculum&lt;/div&gt;&lt;h2&gt;Featured courses&lt;/h2&gt;&lt;/div&gt;&lt;p&gt;Updated by the academic office · 15 Oct 2026&lt;/p&gt;&lt;/div&gt;&lt;div class="grid"&gt;&lt;article class="card"&gt;&lt;div class="eyebrow"&gt;ISWE406P&lt;/div&gt;&lt;h3&gt;Agile Development &amp; DevOps&lt;/h3&gt;&lt;p&gt;CI/CD, version control, containers and reliable delivery practices.&lt;/p&gt;&lt;/article&gt;&lt;article class="card"&gt;&lt;div class="eyebrow"&gt;BCSE401L&lt;/div&gt;&lt;h3&gt;Cloud Computing Lab&lt;/h3&gt;&lt;p&gt;Deploy cloud-native services with secure and observable infrastructure.&lt;/p&gt;&lt;/article&gt;&lt;article class="card"&gt;&lt;div class="eyebrow"&gt;BCSE402L&lt;/div&gt;&lt;h3&gt;Software Architecture&lt;/h3&gt;&lt;p&gt;Model systems that stay understandable as teams and products scale.&lt;/p&gt;&lt;/article&gt;&lt;/div&gt;&lt;div class="announcements"&gt;&lt;div class="announcement" id="faculty"&gt;&lt;div class="eyebrow"&gt;Faculty spotlight&lt;/div&gt;&lt;strong&gt;Dr. Sweta Bhattacharya&lt;/strong&gt;&lt;p&gt;DevOps and delivery systems faculty · Office hours Wednesday, 14:00–16:00.&lt;/p&gt;&lt;/div&gt;&lt;div class="announcement" id="schedule"&gt;&lt;div class="eyebrow"&gt;Exam schedule&lt;/div&gt;&lt;strong&gt;Mid-semester examinations&lt;/strong&gt;&lt;p&gt;Assessment week begins 02 November. The final timetable is available in Resources.&lt;/p&gt;&lt;/div&gt;&lt;/div&gt;&lt;section class="announcements"&gt;&lt;div class="announcement"&gt;&lt;h2&gt;Learning resources&lt;/h2&gt;&lt;p&gt;&lt;a href="resources/devops-guide.txt" download&gt;Download the DevOps revision guide&lt;/a&gt;&lt;/p&gt;&lt;p&gt;CI/CD concepts, Docker commands and Kubernetes revision notes.&lt;/p&gt;&lt;/div&gt;&lt;div class="announcement"&gt;&lt;h2&gt;Assignment announcements&lt;/h2&gt;&lt;p&gt;Assessment VIII: submit the three portals, pipeline evidence and rollback demonstration by 21 October.&lt;/p&gt;&lt;/div&gt;&lt;/section&gt;&lt;section id="release-update" class="announcements"&gt;&lt;div class="announcement"&gt;&lt;h2&gt;Version 2 resource update&lt;/h2&gt;&lt;p&gt;The DevOps revision guide and assessment announcement are now available in the learning resources section.&lt;/p&gt;&lt;/div&gt;&lt;/section&gt;&lt;/main&gt;</w:t>
-        <w:br/>
-        <w:t>&lt;footer&gt;VIT Learn · University Learning Management Portal · Version 2.0 stable&lt;/footer&gt;</w:t>
-        <w:br/>
-        <w:t>&lt;/body&gt;&lt;/html&gt;</w:t>
+        <w:t xml:space="preserve">      .hero {</w:t>
+        <w:br/>
+        <w:t xml:space="preserve">        max-width: 1180px;</w:t>
+        <w:br/>
+        <w:t xml:space="preserve">        margin: 55px auto 0;</w:t>
+        <w:br/>
+        <w:t xml:space="preserve">        display: grid;</w:t>
+        <w:br/>
+        <w:t xml:space="preserve">        grid-template-columns: 1.2fr 0.8fr;</w:t>
+        <w:br/>
+        <w:t xml:space="preserve">        gap: 36px;</w:t>
+        <w:br/>
+        <w:t xml:space="preserve">        align-items: center;</w:t>
+        <w:br/>
+        <w:t xml:space="preserve">      }</w:t>
+        <w:br/>
+        <w:t xml:space="preserve">      .eyebrow {</w:t>
+        <w:br/>
+        <w:t xml:space="preserve">        font-size: 12px;</w:t>
+        <w:br/>
+        <w:t xml:space="preserve">        color: var(--blue);</w:t>
+        <w:br/>
+        <w:t xml:space="preserve">        font-weight: 750;</w:t>
+        <w:br/>
+        <w:t xml:space="preserve">        letter-spacing: 0.1em;</w:t>
+        <w:br/>
+        <w:t xml:space="preserve">        text-transform: uppercase;</w:t>
+        <w:br/>
+        <w:t xml:space="preserve">      }</w:t>
+        <w:br/>
+        <w:t xml:space="preserve">      header .eyebrow {</w:t>
+        <w:br/>
+        <w:t xml:space="preserve">        color: #9fc1ff;</w:t>
+        <w:br/>
+        <w:t xml:space="preserve">      }</w:t>
+        <w:br/>
+        <w:t xml:space="preserve">      h1 {</w:t>
+        <w:br/>
+        <w:t xml:space="preserve">        font-size: clamp(38px, 5vw, 68px);</w:t>
+        <w:br/>
+        <w:t xml:space="preserve">        line-height: 1.02;</w:t>
+        <w:br/>
+        <w:t xml:space="preserve">        max-width: 650px;</w:t>
+        <w:br/>
+        <w:t xml:space="preserve">        margin: 10px 0 20px;</w:t>
+        <w:br/>
+        <w:t xml:space="preserve">        letter-spacing: -0.04em;</w:t>
+        <w:br/>
+        <w:t xml:space="preserve">      }</w:t>
+        <w:br/>
+        <w:t xml:space="preserve">      .hero p {</w:t>
+        <w:br/>
+        <w:t xml:space="preserve">        color: #dce8fb;</w:t>
+        <w:br/>
+        <w:t xml:space="preserve">        font-size: 18px;</w:t>
+        <w:br/>
+        <w:t xml:space="preserve">        line-height: 1.6;</w:t>
+        <w:br/>
+        <w:t xml:space="preserve">        max-width: 570px;</w:t>
+        <w:br/>
+        <w:t xml:space="preserve">      }</w:t>
+        <w:br/>
+        <w:t xml:space="preserve">      .hero-card {</w:t>
+        <w:br/>
+        <w:t xml:space="preserve">        background: rgba(255, 255, 255, 0.1);</w:t>
+        <w:br/>
+        <w:t xml:space="preserve">        border: 1px solid rgba(255, 255, 255, 0.24);</w:t>
+        <w:br/>
+        <w:t xml:space="preserve">        border-radius: 22px;</w:t>
+        <w:br/>
+        <w:t xml:space="preserve">        padding: 24px;</w:t>
+        <w:br/>
+        <w:t xml:space="preserve">      }</w:t>
+        <w:br/>
+        <w:t xml:space="preserve">      .hero-card strong {</w:t>
+        <w:br/>
+        <w:t xml:space="preserve">        display: block;</w:t>
+        <w:br/>
+        <w:t xml:space="preserve">        font-size: 16px;</w:t>
+        <w:br/>
+        <w:t xml:space="preserve">        margin-bottom: 14px;</w:t>
+        <w:br/>
+        <w:t xml:space="preserve">      }</w:t>
+        <w:br/>
+        <w:t xml:space="preserve">      .metric {</w:t>
+        <w:br/>
+        <w:t xml:space="preserve">        display: flex;</w:t>
+        <w:br/>
+        <w:t xml:space="preserve">        justify-content: space-between;</w:t>
+        <w:br/>
+        <w:t xml:space="preserve">        border-top: 1px solid rgba(255, 255, 255, 0.25);</w:t>
+        <w:br/>
+        <w:t xml:space="preserve">        padding: 14px 0;</w:t>
+        <w:br/>
+        <w:t xml:space="preserve">        color: #e4efff;</w:t>
+        <w:br/>
+        <w:t xml:space="preserve">      }</w:t>
+      </w:r>
+    </w:p>
+    <w:p>
+      <w:pPr>
+        <w:pStyle w:val="BodyText"/>
+        <w:keepNext/>
+        <w:keepLines/>
+        <w:pageBreakBefore/>
+      </w:pPr>
+      <w:r>
+        <w:rPr>
+          <w:rFonts w:ascii="Times New Roman" w:hAnsi="Times New Roman"/>
+          <w:b/>
+          <w:color w:val="000000"/>
+          <w:sz w:val="40"/>
+        </w:rPr>
+        <w:t>index.html (continued)</w:t>
+      </w:r>
+    </w:p>
+    <w:p>
+      <w:pPr>
+        <w:pStyle w:val="BodyText"/>
+        <w:keepNext w:val="0"/>
+        <w:keepLines/>
+        <w:spacing w:before="0" w:after="0" w:line="230" w:lineRule="exact"/>
+      </w:pPr>
+      <w:r>
+        <w:rPr>
+          <w:rFonts w:ascii="Consolas" w:hAnsi="Consolas"/>
+          <w:b w:val="0"/>
+          <w:color w:val="000000"/>
+          <w:sz w:val="20"/>
+        </w:rPr>
+        <w:t xml:space="preserve">      main {</w:t>
+        <w:br/>
+        <w:t xml:space="preserve">        max-width: 1180px;</w:t>
+        <w:br/>
+        <w:t xml:space="preserve">        margin: 0 auto;</w:t>
+        <w:br/>
+        <w:t xml:space="preserve">        padding: 44px 7vw 70px;</w:t>
+        <w:br/>
+        <w:t xml:space="preserve">      }</w:t>
+        <w:br/>
+        <w:t xml:space="preserve">      .section-head {</w:t>
+        <w:br/>
+        <w:t xml:space="preserve">        display: flex;</w:t>
+        <w:br/>
+        <w:t xml:space="preserve">        justify-content: space-between;</w:t>
+        <w:br/>
+        <w:t xml:space="preserve">        align-items: end;</w:t>
+        <w:br/>
+        <w:t xml:space="preserve">        gap: 20px;</w:t>
+        <w:br/>
+        <w:t xml:space="preserve">        margin-bottom: 20px;</w:t>
+        <w:br/>
+        <w:t xml:space="preserve">      }</w:t>
+        <w:br/>
+        <w:t xml:space="preserve">      h2 {</w:t>
+        <w:br/>
+        <w:t xml:space="preserve">        font-size: 27px;</w:t>
+        <w:br/>
+        <w:t xml:space="preserve">        margin: 7px 0 0;</w:t>
+        <w:br/>
+        <w:t xml:space="preserve">        letter-spacing: -0.02em;</w:t>
+        <w:br/>
+        <w:t xml:space="preserve">      }</w:t>
+        <w:br/>
+        <w:t xml:space="preserve">      .section-head p {</w:t>
+        <w:br/>
+        <w:t xml:space="preserve">        margin: 0;</w:t>
+        <w:br/>
+        <w:t xml:space="preserve">        color: var(--muted);</w:t>
+        <w:br/>
+        <w:t xml:space="preserve">      }</w:t>
+        <w:br/>
+        <w:t xml:space="preserve">      .grid {</w:t>
+        <w:br/>
+        <w:t xml:space="preserve">        display: grid;</w:t>
+        <w:br/>
+        <w:t xml:space="preserve">        grid-template-columns: repeat(3, 1fr);</w:t>
+        <w:br/>
+        <w:t xml:space="preserve">        gap: 18px;</w:t>
+        <w:br/>
+        <w:t xml:space="preserve">      }</w:t>
+        <w:br/>
+        <w:t xml:space="preserve">      .card {</w:t>
+        <w:br/>
+        <w:t xml:space="preserve">        background: #fff;</w:t>
+        <w:br/>
+        <w:t xml:space="preserve">        border: 1px solid var(--line);</w:t>
+        <w:br/>
+        <w:t xml:space="preserve">        border-radius: 16px;</w:t>
+        <w:br/>
+        <w:t xml:space="preserve">        padding: 22px;</w:t>
+        <w:br/>
+        <w:t xml:space="preserve">        box-shadow: 0 8px 22px rgba(25, 52, 89, 0.05);</w:t>
+        <w:br/>
+        <w:t xml:space="preserve">      }</w:t>
+        <w:br/>
+        <w:t xml:space="preserve">      .card h3 {</w:t>
+        <w:br/>
+        <w:t xml:space="preserve">        margin: 8px 0;</w:t>
+        <w:br/>
+        <w:t xml:space="preserve">        font-size: 18px;</w:t>
+        <w:br/>
+        <w:t xml:space="preserve">      }</w:t>
+        <w:br/>
+        <w:t xml:space="preserve">      .card p {</w:t>
+        <w:br/>
+        <w:t xml:space="preserve">        color: var(--muted);</w:t>
+        <w:br/>
+        <w:t xml:space="preserve">        line-height: 1.5;</w:t>
+        <w:br/>
+        <w:t xml:space="preserve">        margin: 0;</w:t>
+        <w:br/>
+        <w:t xml:space="preserve">      }</w:t>
+        <w:br/>
+        <w:t xml:space="preserve">      .announcements {</w:t>
+        <w:br/>
+        <w:t xml:space="preserve">        margin-top: 34px;</w:t>
+        <w:br/>
+        <w:t xml:space="preserve">        display: grid;</w:t>
+        <w:br/>
+        <w:t xml:space="preserve">        grid-template-columns: 1fr 1fr;</w:t>
+        <w:br/>
+        <w:t xml:space="preserve">        gap: 18px;</w:t>
+        <w:br/>
+        <w:t xml:space="preserve">      }</w:t>
+      </w:r>
+    </w:p>
+    <w:p>
+      <w:pPr>
+        <w:pStyle w:val="BodyText"/>
+        <w:keepNext/>
+        <w:keepLines/>
+        <w:pageBreakBefore/>
+      </w:pPr>
+      <w:r>
+        <w:rPr>
+          <w:rFonts w:ascii="Times New Roman" w:hAnsi="Times New Roman"/>
+          <w:b/>
+          <w:color w:val="000000"/>
+          <w:sz w:val="40"/>
+        </w:rPr>
+        <w:t>index.html (continued)</w:t>
+      </w:r>
+    </w:p>
+    <w:p>
+      <w:pPr>
+        <w:pStyle w:val="BodyText"/>
+        <w:keepNext w:val="0"/>
+        <w:keepLines/>
+        <w:spacing w:before="0" w:after="0" w:line="230" w:lineRule="exact"/>
+      </w:pPr>
+      <w:r>
+        <w:rPr>
+          <w:rFonts w:ascii="Consolas" w:hAnsi="Consolas"/>
+          <w:b w:val="0"/>
+          <w:color w:val="000000"/>
+          <w:sz w:val="20"/>
+        </w:rPr>
+        <w:t xml:space="preserve">      .announcement {</w:t>
+        <w:br/>
+        <w:t xml:space="preserve">        padding: 20px;</w:t>
+        <w:br/>
+        <w:t xml:space="preserve">        border-left: 4px solid var(--blue);</w:t>
+        <w:br/>
+        <w:t xml:space="preserve">        background: var(--ice);</w:t>
+        <w:br/>
+        <w:t xml:space="preserve">        border-radius: 0 14px 14px 0;</w:t>
+        <w:br/>
+        <w:t xml:space="preserve">      }</w:t>
+        <w:br/>
+        <w:t xml:space="preserve">      .announcement p {</w:t>
+        <w:br/>
+        <w:t xml:space="preserve">        margin: 7px 0 0;</w:t>
+        <w:br/>
+        <w:t xml:space="preserve">        color: #42516d;</w:t>
+        <w:br/>
+        <w:t xml:space="preserve">        line-height: 1.5;</w:t>
+        <w:br/>
+        <w:t xml:space="preserve">      }</w:t>
+        <w:br/>
+        <w:t xml:space="preserve">      footer {</w:t>
+        <w:br/>
+        <w:t xml:space="preserve">        text-align: center;</w:t>
+        <w:br/>
+        <w:t xml:space="preserve">        padding: 22px;</w:t>
+        <w:br/>
+        <w:t xml:space="preserve">        color: var(--muted);</w:t>
+        <w:br/>
+        <w:t xml:space="preserve">        font-size: 13px;</w:t>
+        <w:br/>
+        <w:t xml:space="preserve">        border-top: 1px solid var(--line);</w:t>
+        <w:br/>
+        <w:t xml:space="preserve">      }</w:t>
+        <w:br/>
+        <w:t xml:space="preserve">      @media (max-width: 760px) {</w:t>
+        <w:br/>
+        <w:t xml:space="preserve">        nav a {</w:t>
+        <w:br/>
+        <w:t xml:space="preserve">          margin-left: 10px;</w:t>
+        <w:br/>
+        <w:t xml:space="preserve">          font-size: 12px;</w:t>
+        <w:br/>
+        <w:t xml:space="preserve">        }</w:t>
+        <w:br/>
+        <w:t xml:space="preserve">        .hero {</w:t>
+        <w:br/>
+        <w:t xml:space="preserve">          grid-template-columns: 1fr;</w:t>
+        <w:br/>
+        <w:t xml:space="preserve">          margin-top: 38px;</w:t>
+        <w:br/>
+        <w:t xml:space="preserve">        }</w:t>
+        <w:br/>
+        <w:t xml:space="preserve">        .grid,</w:t>
+        <w:br/>
+        <w:t xml:space="preserve">        .announcements {</w:t>
+        <w:br/>
+        <w:t xml:space="preserve">          grid-template-columns: 1fr;</w:t>
+        <w:br/>
+        <w:t xml:space="preserve">        }</w:t>
+        <w:br/>
+        <w:t xml:space="preserve">        .section-head {</w:t>
+        <w:br/>
+        <w:t xml:space="preserve">          display: block;</w:t>
+        <w:br/>
+        <w:t xml:space="preserve">        }</w:t>
+        <w:br/>
+        <w:t xml:space="preserve">        .section-head p {</w:t>
+        <w:br/>
+        <w:t xml:space="preserve">          margin-top: 8px;</w:t>
+        <w:br/>
+        <w:t xml:space="preserve">        }</w:t>
+        <w:br/>
+        <w:t xml:space="preserve">      }</w:t>
+        <w:br/>
+        <w:t xml:space="preserve">      a:focus-visible {</w:t>
+        <w:br/>
+        <w:t xml:space="preserve">        outline: 3px solid #cf8b00;</w:t>
+        <w:br/>
+        <w:t xml:space="preserve">        outline-offset: 5px;</w:t>
+        <w:br/>
+        <w:t xml:space="preserve">      }</w:t>
+        <w:br/>
+        <w:t xml:space="preserve">      html {</w:t>
+        <w:br/>
+        <w:t xml:space="preserve">        scroll-behavior: smooth;</w:t>
+        <w:br/>
+        <w:t xml:space="preserve">      }</w:t>
+        <w:br/>
+        <w:t xml:space="preserve">      @media (prefers-reduced-motion: reduce) {</w:t>
+        <w:br/>
+        <w:t xml:space="preserve">        html {</w:t>
+        <w:br/>
+        <w:t xml:space="preserve">          scroll-behavior: auto;</w:t>
+        <w:br/>
+        <w:t xml:space="preserve">        }</w:t>
+        <w:br/>
+        <w:t xml:space="preserve">      }</w:t>
+        <w:br/>
+        <w:t xml:space="preserve">    &lt;/style&gt;</w:t>
+      </w:r>
+    </w:p>
+    <w:p>
+      <w:pPr>
+        <w:pStyle w:val="BodyText"/>
+        <w:keepNext/>
+        <w:keepLines/>
+        <w:pageBreakBefore/>
+      </w:pPr>
+      <w:r>
+        <w:rPr>
+          <w:rFonts w:ascii="Times New Roman" w:hAnsi="Times New Roman"/>
+          <w:b/>
+          <w:color w:val="000000"/>
+          <w:sz w:val="40"/>
+        </w:rPr>
+        <w:t>index.html (continued)</w:t>
+      </w:r>
+    </w:p>
+    <w:p>
+      <w:pPr>
+        <w:pStyle w:val="BodyText"/>
+        <w:keepNext w:val="0"/>
+        <w:keepLines/>
+        <w:spacing w:before="0" w:after="0" w:line="230" w:lineRule="exact"/>
+      </w:pPr>
+      <w:r>
+        <w:rPr>
+          <w:rFonts w:ascii="Consolas" w:hAnsi="Consolas"/>
+          <w:b w:val="0"/>
+          <w:color w:val="000000"/>
+          <w:sz w:val="20"/>
+        </w:rPr>
+        <w:t xml:space="preserve">  &lt;/head&gt;</w:t>
+        <w:br/>
+        <w:t xml:space="preserve">  &lt;body&gt;</w:t>
+        <w:br/>
+        <w:t xml:space="preserve">    &lt;header&gt;</w:t>
+        <w:br/>
+        <w:t xml:space="preserve">      &lt;nav&gt;</w:t>
+        <w:br/>
+        <w:t xml:space="preserve">        &lt;div class="brand"&gt;VIT LEARN&lt;/div&gt;</w:t>
+        <w:br/>
+        <w:t xml:space="preserve">        &lt;div&gt;</w:t>
+        <w:br/>
+        <w:t xml:space="preserve">          &lt;a href="#courses"&gt;Courses&lt;/a&gt;&lt;a href="#faculty"&gt;Faculty&lt;/a</w:t>
+        <w:br/>
+        <w:t xml:space="preserve">          &gt;&lt;a href="#schedule"&gt;Schedule&lt;/a&gt;</w:t>
+        <w:br/>
+        <w:t xml:space="preserve">        &lt;/div&gt;</w:t>
+        <w:br/>
+        <w:t xml:space="preserve">      &lt;/nav&gt;</w:t>
+        <w:br/>
+        <w:t xml:space="preserve">      &lt;div class="hero"&gt;</w:t>
+        <w:br/>
+        <w:t xml:space="preserve">        &lt;div&gt;</w:t>
+        <w:br/>
+        <w:t xml:space="preserve">          &lt;div class="eyebrow"&gt;University learning, connected&lt;/div&gt;</w:t>
+        <w:br/>
+        <w:t xml:space="preserve">          &lt;h1&gt;Your semester, in one clear view.&lt;/h1&gt;</w:t>
+        <w:br/>
+        <w:t xml:space="preserve">          &lt;p&gt;</w:t>
+        <w:br/>
+        <w:t xml:space="preserve">            Browse active courses, meet your faculty, find resources, and stay ahead of</w:t>
+        <w:br/>
+        <w:t xml:space="preserve">            every deadline from one learning workspace.</w:t>
+        <w:br/>
+        <w:t xml:space="preserve">          &lt;/p&gt;</w:t>
+        <w:br/>
+        <w:t xml:space="preserve">        &lt;/div&gt;</w:t>
+        <w:br/>
+        <w:t xml:space="preserve">        &lt;div class="hero-card"&gt;</w:t>
+        <w:br/>
+        <w:t xml:space="preserve">          &lt;strong&gt;Semester pulse · Fall 2026&lt;/strong&gt;</w:t>
+        <w:br/>
+        <w:t xml:space="preserve">          &lt;div class="metric"&gt;&lt;span&gt;Active courses&lt;/span&gt;&lt;b&gt;06&lt;/b&gt;&lt;/div&gt;</w:t>
+        <w:br/>
+        <w:t xml:space="preserve">          &lt;div class="metric"&gt;&lt;span&gt;Learning resources&lt;/span&gt;&lt;b&gt;42&lt;/b&gt;&lt;/div&gt;</w:t>
+        <w:br/>
+        <w:t xml:space="preserve">          &lt;div class="metric"&gt;&lt;span&gt;Next assessment&lt;/span&gt;&lt;b&gt;21 Oct&lt;/b&gt;&lt;/div&gt;</w:t>
+        <w:br/>
+        <w:t xml:space="preserve">        &lt;/div&gt;</w:t>
+        <w:br/>
+        <w:t xml:space="preserve">      &lt;/div&gt;</w:t>
+        <w:br/>
+        <w:t xml:space="preserve">    &lt;/header&gt;</w:t>
+        <w:br/>
+        <w:t xml:space="preserve">    &lt;main&gt;</w:t>
+        <w:br/>
+        <w:t xml:space="preserve">      &lt;div class="section-head" id="courses"&gt;</w:t>
+        <w:br/>
+        <w:t xml:space="preserve">        &lt;div&gt;</w:t>
+        <w:br/>
+        <w:t xml:space="preserve">          &lt;div class="eyebrow"&gt;Your curriculum&lt;/div&gt;</w:t>
+        <w:br/>
+        <w:t xml:space="preserve">          &lt;h2&gt;Featured courses&lt;/h2&gt;</w:t>
+        <w:br/>
+        <w:t xml:space="preserve">        &lt;/div&gt;</w:t>
+        <w:br/>
+        <w:t xml:space="preserve">        &lt;p&gt;Updated by the academic office · 15 Oct 2026&lt;/p&gt;</w:t>
+        <w:br/>
+        <w:t xml:space="preserve">      &lt;/div&gt;</w:t>
+        <w:br/>
+        <w:t xml:space="preserve">      &lt;div class="grid"&gt;</w:t>
+        <w:br/>
+        <w:t xml:space="preserve">        &lt;article class="card"&gt;</w:t>
+        <w:br/>
+        <w:t xml:space="preserve">          &lt;div class="eyebrow"&gt;ISWE406P&lt;/div&gt;</w:t>
+        <w:br/>
+        <w:t xml:space="preserve">          &lt;h3&gt;Agile Development &amp; DevOps&lt;/h3&gt;</w:t>
+        <w:br/>
+        <w:t xml:space="preserve">          &lt;p&gt;CI/CD, version control, containers and reliable delivery practices.&lt;/p&gt;</w:t>
+        <w:br/>
+        <w:t xml:space="preserve">        &lt;/article&gt;</w:t>
+        <w:br/>
+        <w:t xml:space="preserve">        &lt;article class="card"&gt;</w:t>
+        <w:br/>
+        <w:t xml:space="preserve">          &lt;div class="eyebrow"&gt;BCSE401L&lt;/div&gt;</w:t>
+        <w:br/>
+        <w:t xml:space="preserve">          &lt;h3&gt;Cloud Computing Lab&lt;/h3&gt;</w:t>
+        <w:br/>
+        <w:t xml:space="preserve">          &lt;p&gt;Deploy cloud-native services with secure and observable infrastructure.&lt;/p&gt;</w:t>
+        <w:br/>
+        <w:t xml:space="preserve">        &lt;/article&gt;</w:t>
+        <w:br/>
+        <w:t xml:space="preserve">        &lt;article class="card"&gt;</w:t>
+        <w:br/>
+        <w:t xml:space="preserve">          &lt;div class="eyebrow"&gt;BCSE402L&lt;/div&gt;</w:t>
+        <w:br/>
+        <w:t xml:space="preserve">          &lt;h3&gt;Software Architecture&lt;/h3&gt;</w:t>
+        <w:br/>
+        <w:t xml:space="preserve">          &lt;p&gt;Model systems that stay understandable as teams and products scale.&lt;/p&gt;</w:t>
+        <w:br/>
+        <w:t xml:space="preserve">        &lt;/article&gt;</w:t>
+      </w:r>
+    </w:p>
+    <w:p>
+      <w:pPr>
+        <w:pStyle w:val="BodyText"/>
+        <w:keepNext/>
+        <w:keepLines/>
+        <w:pageBreakBefore/>
+      </w:pPr>
+      <w:r>
+        <w:rPr>
+          <w:rFonts w:ascii="Times New Roman" w:hAnsi="Times New Roman"/>
+          <w:b/>
+          <w:color w:val="000000"/>
+          <w:sz w:val="40"/>
+        </w:rPr>
+        <w:t>index.html (continued)</w:t>
+      </w:r>
+    </w:p>
+    <w:p>
+      <w:pPr>
+        <w:pStyle w:val="BodyText"/>
+        <w:keepNext w:val="0"/>
+        <w:keepLines/>
+        <w:spacing w:before="0" w:after="0" w:line="230" w:lineRule="exact"/>
+      </w:pPr>
+      <w:r>
+        <w:rPr>
+          <w:rFonts w:ascii="Consolas" w:hAnsi="Consolas"/>
+          <w:b w:val="0"/>
+          <w:color w:val="000000"/>
+          <w:sz w:val="20"/>
+        </w:rPr>
+        <w:t xml:space="preserve">      &lt;/div&gt;</w:t>
+        <w:br/>
+        <w:t xml:space="preserve">      &lt;div class="announcements"&gt;</w:t>
+        <w:br/>
+        <w:t xml:space="preserve">        &lt;div class="announcement" id="faculty"&gt;</w:t>
+        <w:br/>
+        <w:t xml:space="preserve">          &lt;div class="eyebrow"&gt;Faculty spotlight&lt;/div&gt;</w:t>
+        <w:br/>
+        <w:t xml:space="preserve">          &lt;strong&gt;Dr. Sweta Bhattacharya&lt;/strong&gt;</w:t>
+        <w:br/>
+        <w:t xml:space="preserve">          &lt;p&gt;</w:t>
+        <w:br/>
+        <w:t xml:space="preserve">            DevOps and delivery systems faculty · Office hours Wednesday, 14:00–16:00.</w:t>
+        <w:br/>
+        <w:t xml:space="preserve">          &lt;/p&gt;</w:t>
+        <w:br/>
+        <w:t xml:space="preserve">        &lt;/div&gt;</w:t>
+        <w:br/>
+        <w:t xml:space="preserve">        &lt;div class="announcement" id="schedule"&gt;</w:t>
+        <w:br/>
+        <w:t xml:space="preserve">          &lt;div class="eyebrow"&gt;Exam schedule&lt;/div&gt;</w:t>
+        <w:br/>
+        <w:t xml:space="preserve">          &lt;strong&gt;Mid-semester examinations&lt;/strong&gt;</w:t>
+        <w:br/>
+        <w:t xml:space="preserve">          &lt;p&gt;</w:t>
+        <w:br/>
+        <w:t xml:space="preserve">            Assessment week begins 02 November. The final timetable is available in</w:t>
+        <w:br/>
+        <w:t xml:space="preserve">            Resources.</w:t>
+        <w:br/>
+        <w:t xml:space="preserve">          &lt;/p&gt;</w:t>
+        <w:br/>
+        <w:t xml:space="preserve">        &lt;/div&gt;</w:t>
+        <w:br/>
+        <w:t xml:space="preserve">      &lt;/div&gt;</w:t>
+        <w:br/>
+        <w:t xml:space="preserve">      &lt;section class="announcements"&gt;</w:t>
+        <w:br/>
+        <w:t xml:space="preserve">        &lt;div class="announcement"&gt;</w:t>
+        <w:br/>
+        <w:t xml:space="preserve">          &lt;h2&gt;Learning resources&lt;/h2&gt;</w:t>
+        <w:br/>
+        <w:t xml:space="preserve">          &lt;p&gt;</w:t>
+        <w:br/>
+        <w:t xml:space="preserve">            &lt;a href="resources/devops-guide.txt" download</w:t>
+        <w:br/>
+        <w:t xml:space="preserve">              &gt;Download the DevOps revision guide&lt;/a</w:t>
+        <w:br/>
+        <w:t xml:space="preserve">            &gt;</w:t>
+        <w:br/>
+        <w:t xml:space="preserve">          &lt;/p&gt;</w:t>
+        <w:br/>
+        <w:t xml:space="preserve">          &lt;p&gt;CI/CD concepts, Docker commands and Kubernetes revision notes.&lt;/p&gt;</w:t>
+        <w:br/>
+        <w:t xml:space="preserve">        &lt;/div&gt;</w:t>
+        <w:br/>
+        <w:t xml:space="preserve">        &lt;div class="announcement"&gt;</w:t>
+        <w:br/>
+        <w:t xml:space="preserve">          &lt;h2&gt;Assignment announcements&lt;/h2&gt;</w:t>
+        <w:br/>
+        <w:t xml:space="preserve">          &lt;p&gt;</w:t>
+        <w:br/>
+        <w:t xml:space="preserve">            Assessment VIII: submit the three portals, pipeline evidence and rollback</w:t>
+        <w:br/>
+        <w:t xml:space="preserve">            demonstration by 21 October.</w:t>
+        <w:br/>
+        <w:t xml:space="preserve">          &lt;/p&gt;</w:t>
+        <w:br/>
+        <w:t xml:space="preserve">        &lt;/div&gt;</w:t>
+        <w:br/>
+        <w:t xml:space="preserve">      &lt;/section&gt;</w:t>
+        <w:br/>
+        <w:t xml:space="preserve">      &lt;section id="release-update" class="announcements"&gt;</w:t>
+        <w:br/>
+        <w:t xml:space="preserve">        &lt;div class="announcement"&gt;</w:t>
+        <w:br/>
+        <w:t xml:space="preserve">          &lt;h2&gt;Version 2 resource update&lt;/h2&gt;</w:t>
+        <w:br/>
+        <w:t xml:space="preserve">          &lt;p&gt;</w:t>
+        <w:br/>
+        <w:t xml:space="preserve">            The DevOps revision guide and assessment announcement are now available in</w:t>
+        <w:br/>
+        <w:t xml:space="preserve">            the learning resources section.</w:t>
+        <w:br/>
+        <w:t xml:space="preserve">          &lt;/p&gt;</w:t>
+        <w:br/>
+        <w:t xml:space="preserve">        &lt;/div&gt;</w:t>
+        <w:br/>
+        <w:t xml:space="preserve">      &lt;/section&gt;</w:t>
+        <w:br/>
+        <w:t xml:space="preserve">    &lt;/main&gt;</w:t>
+        <w:br/>
+        <w:t xml:space="preserve">    &lt;footer&gt;</w:t>
+        <w:br/>
+        <w:t xml:space="preserve">      VIT Learn · University Learning Management Portal · Version 2.0 stable</w:t>
+        <w:br/>
+        <w:t xml:space="preserve">    &lt;/footer&gt;</w:t>
+        <w:br/>
+        <w:t xml:space="preserve">  &lt;/body&gt;</w:t>
+        <w:br/>
+        <w:t>&lt;/html&gt;</w:t>
       </w:r>
     </w:p>
     <w:p>
@@ -2033,7 +2735,7 @@
         <w:pStyle w:val="BodyText"/>
         <w:keepNext w:val="0"/>
         <w:keepLines/>
-        <w:spacing w:before="0" w:after="100" w:line="240" w:lineRule="auto"/>
+        <w:spacing w:before="0" w:after="0" w:line="230" w:lineRule="exact"/>
       </w:pPr>
       <w:r>
         <w:rPr>
@@ -2046,17 +2748,105 @@
         <w:br/>
         <w:t>&lt;html lang="en"&gt;</w:t>
         <w:br/>
-        <w:t>&lt;head&gt;</w:t>
-        <w:br/>
-        <w:t>&lt;meta charset="utf-8"&gt;&lt;meta name="viewport" content="width=device-width, initial-scale=1"&gt;&lt;meta name="release" content="v2"&gt;&lt;title&gt;Plate &amp; Parcel — Online Food Ordering&lt;/title&gt;</w:t>
-        <w:br/>
-        <w:t>&lt;style&gt;</w:t>
-        <w:br/>
-        <w:t>:root{--ink:#271f20;--muted:#746b6a;--tomato:#e94b35;--cream:#fff8f2;--peach:#ffe8dc;--green:#2f7d5b;--line:#ead8d0}*{box-sizing:border-box}body{margin:0;font-family:Inter,Segoe UI,Arial,sans-serif;background:var(--cream);color:var(--ink)}header{padding:24px 7vw 52px;background:#fff3ea}nav{max-width:1180px;margin:auto;display:flex;justify-content:space-between;align-items:center}.brand{font-weight:850;font-size:21px;letter-spacing:-.03em}nav a{color:var(--muted);text-decoration:none;margin-left:22px;font-size:14px}.hero{max-width:1180px;margin:62px auto 0;display:grid;grid-template-columns:1.05fr .95fr;gap:40px;align-items:center}.eyebrow{color:var(--tomato);font-weight:800;text-transform:uppercase;letter-spacing:.11em;font-size:11px}h1{font-size:clamp(40px,5vw,70px);line-height:1;letter-spacing:-.055em;margin:12px 0 19px}.hero p{font-size:18px;line-height:1.6;color:var(--muted);max-width:530px}.hero-art{background:linear-gradient(135deg,#f76b4c,#bc2f45);min-height:330px;border-radius:28px;position:relative;overflow:hidden;box-shadow:0 20px 40px rgba(184,66,44,.2)}.plate{width:220px;height:220px;background:#fff;border-radius:50%;position:absolute;left:50%;top:50%;transform:translate(-50%,-50%);box-shadow:0 12px 0 rgba(255,255,255,.25)}.food{position:absolute;font-size:72px;left:50%;top:50%;transform:translate(-50%,-54%)}.badge{position:absolute;right:22px;top:22px;background:#fff3b7;color:#674318;font-weight:800;padding:10px 13px;border-radius:999px;font-size:12px}.main{max-width:1180px;margin:auto;padding:42px 7vw 70px}.head{display:flex;justify-content:space-between;align-items:end;margin-bottom:18px}.head h2{font-size:28px;margin:6px 0 0}.head p{color:var(--muted);margin:0}.grid{display:grid;grid-template-columns:repeat(3,1fr);gap:18px}.card{background:#fff;border:1px solid var(--line);padding:22px;border-radius:18px}.card-top{display:flex;justify-content:space-between}.card h3{margin:11px 0 7px;font-size:19px}.card p{color:var(--muted);line-height:1.5;margin:0}.price{font-weight:850;color:var(--green)}.tags{margin-top:16px;display:flex;gap:7px;flex-wrap:wrap}.tag{background:var(--peach);color:#8e4634;border-radius:99px;padding:6px 9px;font-size:11px;font-weight:700}.offer{margin-top:34px;display:flex;justify-content:space-between;align-items:center;background:#27201f;color:#fff;padding:26px;border-radius:18px}.offer p{margin:6px 0 0;color:#e5d7d2}.code{background:#f5bd72;color:#48200f;font-weight:900;border-radius:10px;padding:12px 16px}.foot{text-align:center;color:var(--muted);padding:22px;border-top:1px solid var(--line);font-size:13px}@media(max-width:760px){.hero{grid-template-columns:1fr;margin-top:38px}.grid{grid-template-columns:1fr}.offer{display:block}.code{display:inline-block;margin-top:16px}nav a{margin-left:8px;font-size:12px}}</w:t>
-        <w:br/>
-        <w:t>a:focus-visible{outline:3px solid #cf8b00;outline-offset:5px}html{scroll-behavior:smooth}@media(prefers-reduced-motion:reduce){html{scroll-behavior:auto}}&lt;/style&gt;</w:t>
-        <w:br/>
-        <w:t>&lt;/head&gt;</w:t>
+        <w:t xml:space="preserve">  &lt;head&gt;</w:t>
+        <w:br/>
+        <w:t xml:space="preserve">    &lt;meta charset="utf-8" /&gt;</w:t>
+        <w:br/>
+        <w:t xml:space="preserve">    &lt;meta name="viewport" content="width=device-width, initial-scale=1" /&gt;</w:t>
+        <w:br/>
+        <w:t xml:space="preserve">    &lt;meta name="release" content="v2" /&gt;</w:t>
+        <w:br/>
+        <w:t xml:space="preserve">    &lt;title&gt;Plate &amp; Parcel — Online Food Ordering&lt;/title&gt;</w:t>
+        <w:br/>
+        <w:t xml:space="preserve">    &lt;style&gt;</w:t>
+        <w:br/>
+        <w:t xml:space="preserve">      :root {</w:t>
+        <w:br/>
+        <w:t xml:space="preserve">        --ink: #271f20;</w:t>
+        <w:br/>
+        <w:t xml:space="preserve">        --muted: #746b6a;</w:t>
+        <w:br/>
+        <w:t xml:space="preserve">        --tomato: #e94b35;</w:t>
+        <w:br/>
+        <w:t xml:space="preserve">        --cream: #fff8f2;</w:t>
+        <w:br/>
+        <w:t xml:space="preserve">        --peach: #ffe8dc;</w:t>
+        <w:br/>
+        <w:t xml:space="preserve">        --green: #2f7d5b;</w:t>
+        <w:br/>
+        <w:t xml:space="preserve">        --line: #ead8d0;</w:t>
+        <w:br/>
+        <w:t xml:space="preserve">      }</w:t>
+        <w:br/>
+        <w:t xml:space="preserve">      * {</w:t>
+        <w:br/>
+        <w:t xml:space="preserve">        box-sizing: border-box;</w:t>
+        <w:br/>
+        <w:t xml:space="preserve">      }</w:t>
+        <w:br/>
+        <w:t xml:space="preserve">      body {</w:t>
+        <w:br/>
+        <w:t xml:space="preserve">        margin: 0;</w:t>
+        <w:br/>
+        <w:t xml:space="preserve">        font-family:</w:t>
+        <w:br/>
+        <w:t xml:space="preserve">          Inter,</w:t>
+        <w:br/>
+        <w:t xml:space="preserve">          Segoe UI,</w:t>
+        <w:br/>
+        <w:t xml:space="preserve">          Arial,</w:t>
+        <w:br/>
+        <w:t xml:space="preserve">          sans-serif;</w:t>
+        <w:br/>
+        <w:t xml:space="preserve">        background: var(--cream);</w:t>
+        <w:br/>
+        <w:t xml:space="preserve">        color: var(--ink);</w:t>
+        <w:br/>
+        <w:t xml:space="preserve">      }</w:t>
+        <w:br/>
+        <w:t xml:space="preserve">      header {</w:t>
+        <w:br/>
+        <w:t xml:space="preserve">        padding: 24px 7vw 52px;</w:t>
+        <w:br/>
+        <w:t xml:space="preserve">        background: #fff3ea;</w:t>
+        <w:br/>
+        <w:t xml:space="preserve">      }</w:t>
+        <w:br/>
+        <w:t xml:space="preserve">      nav {</w:t>
+        <w:br/>
+        <w:t xml:space="preserve">        max-width: 1180px;</w:t>
+        <w:br/>
+        <w:t xml:space="preserve">        margin: auto;</w:t>
+        <w:br/>
+        <w:t xml:space="preserve">        display: flex;</w:t>
+        <w:br/>
+        <w:t xml:space="preserve">        justify-content: space-between;</w:t>
+        <w:br/>
+        <w:t xml:space="preserve">        align-items: center;</w:t>
+        <w:br/>
+        <w:t xml:space="preserve">      }</w:t>
+        <w:br/>
+        <w:t xml:space="preserve">      .brand {</w:t>
+        <w:br/>
+        <w:t xml:space="preserve">        font-weight: 850;</w:t>
+        <w:br/>
+        <w:t xml:space="preserve">        font-size: 21px;</w:t>
+        <w:br/>
+        <w:t xml:space="preserve">        letter-spacing: -0.03em;</w:t>
+        <w:br/>
+        <w:t xml:space="preserve">      }</w:t>
+        <w:br/>
+        <w:t xml:space="preserve">      nav a {</w:t>
+        <w:br/>
+        <w:t xml:space="preserve">        color: var(--muted);</w:t>
+        <w:br/>
+        <w:t xml:space="preserve">        text-decoration: none;</w:t>
+        <w:br/>
+        <w:t xml:space="preserve">        margin-left: 22px;</w:t>
+        <w:br/>
+        <w:t xml:space="preserve">        font-size: 14px;</w:t>
+        <w:br/>
+        <w:t xml:space="preserve">      }</w:t>
       </w:r>
     </w:p>
     <w:p>
@@ -2081,7 +2871,7 @@
         <w:pStyle w:val="BodyText"/>
         <w:keepNext w:val="0"/>
         <w:keepLines/>
-        <w:spacing w:before="0" w:after="100" w:line="240" w:lineRule="auto"/>
+        <w:spacing w:before="0" w:after="0" w:line="230" w:lineRule="exact"/>
       </w:pPr>
       <w:r>
         <w:rPr>
@@ -2090,21 +2880,755 @@
           <w:color w:val="000000"/>
           <w:sz w:val="20"/>
         </w:rPr>
-        <w:t>&lt;body&gt;</w:t>
-        <w:br/>
-        <w:t>&lt;header&gt;&lt;nav&gt;&lt;div class="brand"&gt;PLATE &amp; PARCEL&lt;/div&gt;&lt;div&gt;&lt;a href="#restaurants"&gt;Restaurants&lt;/a&gt;&lt;a href="#offers"&gt;Offers&lt;/a&gt;&lt;a href="#orders"&gt;My orders&lt;/a&gt;&lt;/div&gt;&lt;/nav&gt;&lt;div class="hero"&gt;&lt;div&gt;&lt;div class="eyebrow"&gt;Dinner, delivered with care&lt;/div&gt;&lt;h1&gt;Good food finds you here.&lt;/h1&gt;&lt;p&gt;Explore neighbourhood kitchens, discover new favourites, and order a meal that arrives exactly when you want it.&lt;/p&gt;&lt;/div&gt;&lt;div class="hero-art"&gt;&lt;div class="badge"&gt;Free delivery today&lt;/div&gt;&lt;div class="plate"&gt;&lt;div class="food"&gt;🍜&lt;/div&gt;&lt;/div&gt;&lt;/div&gt;&lt;/div&gt;&lt;/header&gt;</w:t>
-        <w:br/>
-        <w:t>&lt;main class="main"&gt;&lt;div class="head" id="restaurants"&gt;&lt;div&gt;&lt;div class="eyebrow"&gt;Open now near you&lt;/div&gt;&lt;h2&gt;Popular kitchens&lt;/h2&gt;&lt;/div&gt;&lt;p&gt;Average delivery · 25–35 min&lt;/p&gt;&lt;/div&gt;&lt;div class="grid"&gt;</w:t>
-        <w:br/>
-        <w:t>&lt;article class="card"&gt;&lt;div class="card-top"&gt;&lt;div class="eyebrow"&gt;Japanese · 4.8 ★&lt;/div&gt;&lt;div class="price"&gt;₹₹&lt;/div&gt;&lt;/div&gt;&lt;h3&gt;Umami House&lt;/h3&gt;&lt;p&gt;Ramen, donburi and small plates with a rich, slow-cooked broth.&lt;/p&gt;&lt;div class="tags"&gt;&lt;span class="tag"&gt;Top rated&lt;/span&gt;&lt;span class="tag"&gt;Veg options&lt;/span&gt;&lt;/div&gt;&lt;/article&gt;</w:t>
-        <w:br/>
-        <w:t>&lt;article class="card"&gt;&lt;div class="card-top"&gt;&lt;div class="eyebrow"&gt;Indian · 4.7 ★&lt;/div&gt;&lt;div class="price"&gt;₹₹&lt;/div&gt;&lt;/div&gt;&lt;h3&gt;Spice Route&lt;/h3&gt;&lt;p&gt;Regional comfort food, clay-oven breads and bright seasonal thalis.&lt;/p&gt;&lt;div class="tags"&gt;&lt;span class="tag"&gt;Bestseller&lt;/span&gt;&lt;span class="tag"&gt;Halal&lt;/span&gt;&lt;/div&gt;&lt;/article&gt;</w:t>
-        <w:br/>
-        <w:t>&lt;article class="card"&gt;&lt;div class="card-top"&gt;&lt;div class="eyebrow"&gt;Bakery · 4.9 ★&lt;/div&gt;&lt;div class="price"&gt;₹&lt;/div&gt;&lt;/div&gt;&lt;h3&gt;Crumb &amp; Co.&lt;/h3&gt;&lt;p&gt;Warm sourdough, hand-rolled pastries and coffee for every mood.&lt;/p&gt;&lt;div class="tags"&gt;&lt;span class="tag"&gt;Fresh today&lt;/span&gt;&lt;span class="tag"&gt;Breakfast&lt;/span&gt;&lt;/div&gt;&lt;/article&gt;</w:t>
-        <w:br/>
-        <w:t>&lt;/div&gt;&lt;div class="offer" id="offers"&gt;&lt;div&gt;&lt;div class="eyebrow" style="color:#f5bd72"&gt;A little extra&lt;/div&gt;&lt;strong&gt;20% off your first order&lt;/strong&gt;&lt;p&gt;Use the code at checkout before 31 October.&lt;/p&gt;&lt;/div&gt;&lt;div class="code"&gt;WELCOME20&lt;/div&gt;&lt;/div&gt;&lt;section class="offer" style="background:#fff;color:#271f20;border:1px solid #ead8d0"&gt;&lt;div&gt;&lt;div class="eyebrow"&gt;Today’s menu · available now&lt;/div&gt;&lt;h2&gt;Choose your next favourite&lt;/h2&gt;&lt;p style="color:#746b6a"&gt;Miso ramen · Japanese · ₹280 · Available&lt;br&gt;Paneer thali · Indian · ₹220 · Available&lt;br&gt;Butter croissant · Bakery · ₹120 · Available&lt;/p&gt;&lt;/div&gt;&lt;/section&gt;&lt;section id="release-update" class="offer" style="background:#f0e4d9;color:#271f20"&gt;&lt;div&gt;&lt;div class="eyebrow"&gt;New in version 2&lt;/div&gt;&lt;h2&gt;Thank you for ordering with us.&lt;/h2&gt;&lt;p style="color:#574d49"&gt;Restaurant rating summary: 4.8 / 5 across our three featured kitchens. Your next favourite is only an order away.&lt;/p&gt;&lt;/div&gt;&lt;/section&gt;&lt;/main&gt;&lt;footer id="orders" class="foot"&gt;Plate &amp; Parcel · Online Food Ordering Portal · Menu refreshed 15 Oct 2026&lt;/footer&gt;</w:t>
-        <w:br/>
-        <w:t>&lt;/body&gt;&lt;/html&gt;</w:t>
+        <w:t xml:space="preserve">      .hero {</w:t>
+        <w:br/>
+        <w:t xml:space="preserve">        max-width: 1180px;</w:t>
+        <w:br/>
+        <w:t xml:space="preserve">        margin: 62px auto 0;</w:t>
+        <w:br/>
+        <w:t xml:space="preserve">        display: grid;</w:t>
+        <w:br/>
+        <w:t xml:space="preserve">        grid-template-columns: 1.05fr 0.95fr;</w:t>
+        <w:br/>
+        <w:t xml:space="preserve">        gap: 40px;</w:t>
+        <w:br/>
+        <w:t xml:space="preserve">        align-items: center;</w:t>
+        <w:br/>
+        <w:t xml:space="preserve">      }</w:t>
+        <w:br/>
+        <w:t xml:space="preserve">      .eyebrow {</w:t>
+        <w:br/>
+        <w:t xml:space="preserve">        color: var(--tomato);</w:t>
+        <w:br/>
+        <w:t xml:space="preserve">        font-weight: 800;</w:t>
+        <w:br/>
+        <w:t xml:space="preserve">        text-transform: uppercase;</w:t>
+        <w:br/>
+        <w:t xml:space="preserve">        letter-spacing: 0.11em;</w:t>
+        <w:br/>
+        <w:t xml:space="preserve">        font-size: 11px;</w:t>
+        <w:br/>
+        <w:t xml:space="preserve">      }</w:t>
+        <w:br/>
+        <w:t xml:space="preserve">      h1 {</w:t>
+        <w:br/>
+        <w:t xml:space="preserve">        font-size: clamp(40px, 5vw, 70px);</w:t>
+        <w:br/>
+        <w:t xml:space="preserve">        line-height: 1;</w:t>
+        <w:br/>
+        <w:t xml:space="preserve">        letter-spacing: -0.055em;</w:t>
+        <w:br/>
+        <w:t xml:space="preserve">        margin: 12px 0 19px;</w:t>
+        <w:br/>
+        <w:t xml:space="preserve">      }</w:t>
+        <w:br/>
+        <w:t xml:space="preserve">      .hero p {</w:t>
+        <w:br/>
+        <w:t xml:space="preserve">        font-size: 18px;</w:t>
+        <w:br/>
+        <w:t xml:space="preserve">        line-height: 1.6;</w:t>
+        <w:br/>
+        <w:t xml:space="preserve">        color: var(--muted);</w:t>
+        <w:br/>
+        <w:t xml:space="preserve">        max-width: 530px;</w:t>
+        <w:br/>
+        <w:t xml:space="preserve">      }</w:t>
+        <w:br/>
+        <w:t xml:space="preserve">      .hero-art {</w:t>
+        <w:br/>
+        <w:t xml:space="preserve">        background: linear-gradient(135deg, #f76b4c, #bc2f45);</w:t>
+        <w:br/>
+        <w:t xml:space="preserve">        min-height: 330px;</w:t>
+        <w:br/>
+        <w:t xml:space="preserve">        border-radius: 28px;</w:t>
+        <w:br/>
+        <w:t xml:space="preserve">        position: relative;</w:t>
+        <w:br/>
+        <w:t xml:space="preserve">        overflow: hidden;</w:t>
+        <w:br/>
+        <w:t xml:space="preserve">        box-shadow: 0 20px 40px rgba(184, 66, 44, 0.2);</w:t>
+        <w:br/>
+        <w:t xml:space="preserve">      }</w:t>
+        <w:br/>
+        <w:t xml:space="preserve">      .plate {</w:t>
+        <w:br/>
+        <w:t xml:space="preserve">        width: 220px;</w:t>
+        <w:br/>
+        <w:t xml:space="preserve">        height: 220px;</w:t>
+        <w:br/>
+        <w:t xml:space="preserve">        background: #fff;</w:t>
+        <w:br/>
+        <w:t xml:space="preserve">        border-radius: 50%;</w:t>
+        <w:br/>
+        <w:t xml:space="preserve">        position: absolute;</w:t>
+        <w:br/>
+        <w:t xml:space="preserve">        left: 50%;</w:t>
+        <w:br/>
+        <w:t xml:space="preserve">        top: 50%;</w:t>
+        <w:br/>
+        <w:t xml:space="preserve">        transform: translate(-50%, -50%);</w:t>
+        <w:br/>
+        <w:t xml:space="preserve">        box-shadow: 0 12px 0 rgba(255, 255, 255, 0.25);</w:t>
+        <w:br/>
+        <w:t xml:space="preserve">      }</w:t>
+        <w:br/>
+        <w:t xml:space="preserve">      .food {</w:t>
+        <w:br/>
+        <w:t xml:space="preserve">        position: absolute;</w:t>
+        <w:br/>
+        <w:t xml:space="preserve">        font-size: 72px;</w:t>
+        <w:br/>
+        <w:t xml:space="preserve">        left: 50%;</w:t>
+      </w:r>
+    </w:p>
+    <w:p>
+      <w:pPr>
+        <w:pStyle w:val="BodyText"/>
+        <w:keepNext/>
+        <w:keepLines/>
+        <w:pageBreakBefore/>
+      </w:pPr>
+      <w:r>
+        <w:rPr>
+          <w:rFonts w:ascii="Times New Roman" w:hAnsi="Times New Roman"/>
+          <w:b/>
+          <w:color w:val="000000"/>
+          <w:sz w:val="40"/>
+        </w:rPr>
+        <w:t>index.html (continued)</w:t>
+      </w:r>
+    </w:p>
+    <w:p>
+      <w:pPr>
+        <w:pStyle w:val="BodyText"/>
+        <w:keepNext w:val="0"/>
+        <w:keepLines/>
+        <w:spacing w:before="0" w:after="0" w:line="230" w:lineRule="exact"/>
+      </w:pPr>
+      <w:r>
+        <w:rPr>
+          <w:rFonts w:ascii="Consolas" w:hAnsi="Consolas"/>
+          <w:b w:val="0"/>
+          <w:color w:val="000000"/>
+          <w:sz w:val="20"/>
+        </w:rPr>
+        <w:t xml:space="preserve">        top: 50%;</w:t>
+        <w:br/>
+        <w:t xml:space="preserve">        transform: translate(-50%, -54%);</w:t>
+        <w:br/>
+        <w:t xml:space="preserve">      }</w:t>
+        <w:br/>
+        <w:t xml:space="preserve">      .badge {</w:t>
+        <w:br/>
+        <w:t xml:space="preserve">        position: absolute;</w:t>
+        <w:br/>
+        <w:t xml:space="preserve">        right: 22px;</w:t>
+        <w:br/>
+        <w:t xml:space="preserve">        top: 22px;</w:t>
+        <w:br/>
+        <w:t xml:space="preserve">        background: #fff3b7;</w:t>
+        <w:br/>
+        <w:t xml:space="preserve">        color: #674318;</w:t>
+        <w:br/>
+        <w:t xml:space="preserve">        font-weight: 800;</w:t>
+        <w:br/>
+        <w:t xml:space="preserve">        padding: 10px 13px;</w:t>
+        <w:br/>
+        <w:t xml:space="preserve">        border-radius: 999px;</w:t>
+        <w:br/>
+        <w:t xml:space="preserve">        font-size: 12px;</w:t>
+        <w:br/>
+        <w:t xml:space="preserve">      }</w:t>
+        <w:br/>
+        <w:t xml:space="preserve">      .main {</w:t>
+        <w:br/>
+        <w:t xml:space="preserve">        max-width: 1180px;</w:t>
+        <w:br/>
+        <w:t xml:space="preserve">        margin: auto;</w:t>
+        <w:br/>
+        <w:t xml:space="preserve">        padding: 42px 7vw 70px;</w:t>
+        <w:br/>
+        <w:t xml:space="preserve">      }</w:t>
+        <w:br/>
+        <w:t xml:space="preserve">      .head {</w:t>
+        <w:br/>
+        <w:t xml:space="preserve">        display: flex;</w:t>
+        <w:br/>
+        <w:t xml:space="preserve">        justify-content: space-between;</w:t>
+        <w:br/>
+        <w:t xml:space="preserve">        align-items: end;</w:t>
+        <w:br/>
+        <w:t xml:space="preserve">        margin-bottom: 18px;</w:t>
+        <w:br/>
+        <w:t xml:space="preserve">      }</w:t>
+        <w:br/>
+        <w:t xml:space="preserve">      .head h2 {</w:t>
+        <w:br/>
+        <w:t xml:space="preserve">        font-size: 28px;</w:t>
+        <w:br/>
+        <w:t xml:space="preserve">        margin: 6px 0 0;</w:t>
+        <w:br/>
+        <w:t xml:space="preserve">      }</w:t>
+        <w:br/>
+        <w:t xml:space="preserve">      .head p {</w:t>
+        <w:br/>
+        <w:t xml:space="preserve">        color: var(--muted);</w:t>
+        <w:br/>
+        <w:t xml:space="preserve">        margin: 0;</w:t>
+        <w:br/>
+        <w:t xml:space="preserve">      }</w:t>
+        <w:br/>
+        <w:t xml:space="preserve">      .grid {</w:t>
+        <w:br/>
+        <w:t xml:space="preserve">        display: grid;</w:t>
+        <w:br/>
+        <w:t xml:space="preserve">        grid-template-columns: repeat(3, 1fr);</w:t>
+        <w:br/>
+        <w:t xml:space="preserve">        gap: 18px;</w:t>
+        <w:br/>
+        <w:t xml:space="preserve">      }</w:t>
+        <w:br/>
+        <w:t xml:space="preserve">      .card {</w:t>
+        <w:br/>
+        <w:t xml:space="preserve">        background: #fff;</w:t>
+        <w:br/>
+        <w:t xml:space="preserve">        border: 1px solid var(--line);</w:t>
+        <w:br/>
+        <w:t xml:space="preserve">        padding: 22px;</w:t>
+        <w:br/>
+        <w:t xml:space="preserve">        border-radius: 18px;</w:t>
+        <w:br/>
+        <w:t xml:space="preserve">      }</w:t>
+        <w:br/>
+        <w:t xml:space="preserve">      .card-top {</w:t>
+        <w:br/>
+        <w:t xml:space="preserve">        display: flex;</w:t>
+        <w:br/>
+        <w:t xml:space="preserve">        justify-content: space-between;</w:t>
+        <w:br/>
+        <w:t xml:space="preserve">      }</w:t>
+      </w:r>
+    </w:p>
+    <w:p>
+      <w:pPr>
+        <w:pStyle w:val="BodyText"/>
+        <w:keepNext/>
+        <w:keepLines/>
+        <w:pageBreakBefore/>
+      </w:pPr>
+      <w:r>
+        <w:rPr>
+          <w:rFonts w:ascii="Times New Roman" w:hAnsi="Times New Roman"/>
+          <w:b/>
+          <w:color w:val="000000"/>
+          <w:sz w:val="40"/>
+        </w:rPr>
+        <w:t>index.html (continued)</w:t>
+      </w:r>
+    </w:p>
+    <w:p>
+      <w:pPr>
+        <w:pStyle w:val="BodyText"/>
+        <w:keepNext w:val="0"/>
+        <w:keepLines/>
+        <w:spacing w:before="0" w:after="0" w:line="230" w:lineRule="exact"/>
+      </w:pPr>
+      <w:r>
+        <w:rPr>
+          <w:rFonts w:ascii="Consolas" w:hAnsi="Consolas"/>
+          <w:b w:val="0"/>
+          <w:color w:val="000000"/>
+          <w:sz w:val="20"/>
+        </w:rPr>
+        <w:t xml:space="preserve">      .card h3 {</w:t>
+        <w:br/>
+        <w:t xml:space="preserve">        margin: 11px 0 7px;</w:t>
+        <w:br/>
+        <w:t xml:space="preserve">        font-size: 19px;</w:t>
+        <w:br/>
+        <w:t xml:space="preserve">      }</w:t>
+        <w:br/>
+        <w:t xml:space="preserve">      .card p {</w:t>
+        <w:br/>
+        <w:t xml:space="preserve">        color: var(--muted);</w:t>
+        <w:br/>
+        <w:t xml:space="preserve">        line-height: 1.5;</w:t>
+        <w:br/>
+        <w:t xml:space="preserve">        margin: 0;</w:t>
+        <w:br/>
+        <w:t xml:space="preserve">      }</w:t>
+        <w:br/>
+        <w:t xml:space="preserve">      .price {</w:t>
+        <w:br/>
+        <w:t xml:space="preserve">        font-weight: 850;</w:t>
+        <w:br/>
+        <w:t xml:space="preserve">        color: var(--green);</w:t>
+        <w:br/>
+        <w:t xml:space="preserve">      }</w:t>
+        <w:br/>
+        <w:t xml:space="preserve">      .tags {</w:t>
+        <w:br/>
+        <w:t xml:space="preserve">        margin-top: 16px;</w:t>
+        <w:br/>
+        <w:t xml:space="preserve">        display: flex;</w:t>
+        <w:br/>
+        <w:t xml:space="preserve">        gap: 7px;</w:t>
+        <w:br/>
+        <w:t xml:space="preserve">        flex-wrap: wrap;</w:t>
+        <w:br/>
+        <w:t xml:space="preserve">      }</w:t>
+        <w:br/>
+        <w:t xml:space="preserve">      .tag {</w:t>
+        <w:br/>
+        <w:t xml:space="preserve">        background: var(--peach);</w:t>
+        <w:br/>
+        <w:t xml:space="preserve">        color: #8e4634;</w:t>
+        <w:br/>
+        <w:t xml:space="preserve">        border-radius: 99px;</w:t>
+        <w:br/>
+        <w:t xml:space="preserve">        padding: 6px 9px;</w:t>
+        <w:br/>
+        <w:t xml:space="preserve">        font-size: 11px;</w:t>
+        <w:br/>
+        <w:t xml:space="preserve">        font-weight: 700;</w:t>
+        <w:br/>
+        <w:t xml:space="preserve">      }</w:t>
+        <w:br/>
+        <w:t xml:space="preserve">      .offer {</w:t>
+        <w:br/>
+        <w:t xml:space="preserve">        margin-top: 34px;</w:t>
+        <w:br/>
+        <w:t xml:space="preserve">        display: flex;</w:t>
+        <w:br/>
+        <w:t xml:space="preserve">        justify-content: space-between;</w:t>
+        <w:br/>
+        <w:t xml:space="preserve">        align-items: center;</w:t>
+        <w:br/>
+        <w:t xml:space="preserve">        background: #27201f;</w:t>
+        <w:br/>
+        <w:t xml:space="preserve">        color: #fff;</w:t>
+        <w:br/>
+        <w:t xml:space="preserve">        padding: 26px;</w:t>
+        <w:br/>
+        <w:t xml:space="preserve">        border-radius: 18px;</w:t>
+        <w:br/>
+        <w:t xml:space="preserve">      }</w:t>
+        <w:br/>
+        <w:t xml:space="preserve">      .offer p {</w:t>
+        <w:br/>
+        <w:t xml:space="preserve">        margin: 6px 0 0;</w:t>
+        <w:br/>
+        <w:t xml:space="preserve">        color: #e5d7d2;</w:t>
+        <w:br/>
+        <w:t xml:space="preserve">      }</w:t>
+        <w:br/>
+        <w:t xml:space="preserve">      .code {</w:t>
+        <w:br/>
+        <w:t xml:space="preserve">        background: #f5bd72;</w:t>
+        <w:br/>
+        <w:t xml:space="preserve">        color: #48200f;</w:t>
+        <w:br/>
+        <w:t xml:space="preserve">        font-weight: 900;</w:t>
+        <w:br/>
+        <w:t xml:space="preserve">        border-radius: 10px;</w:t>
+        <w:br/>
+        <w:t xml:space="preserve">        padding: 12px 16px;</w:t>
+        <w:br/>
+        <w:t xml:space="preserve">      }</w:t>
+      </w:r>
+    </w:p>
+    <w:p>
+      <w:pPr>
+        <w:pStyle w:val="BodyText"/>
+        <w:keepNext/>
+        <w:keepLines/>
+        <w:pageBreakBefore/>
+      </w:pPr>
+      <w:r>
+        <w:rPr>
+          <w:rFonts w:ascii="Times New Roman" w:hAnsi="Times New Roman"/>
+          <w:b/>
+          <w:color w:val="000000"/>
+          <w:sz w:val="40"/>
+        </w:rPr>
+        <w:t>index.html (continued)</w:t>
+      </w:r>
+    </w:p>
+    <w:p>
+      <w:pPr>
+        <w:pStyle w:val="BodyText"/>
+        <w:keepNext w:val="0"/>
+        <w:keepLines/>
+        <w:spacing w:before="0" w:after="0" w:line="230" w:lineRule="exact"/>
+      </w:pPr>
+      <w:r>
+        <w:rPr>
+          <w:rFonts w:ascii="Consolas" w:hAnsi="Consolas"/>
+          <w:b w:val="0"/>
+          <w:color w:val="000000"/>
+          <w:sz w:val="20"/>
+        </w:rPr>
+        <w:t xml:space="preserve">      .foot {</w:t>
+        <w:br/>
+        <w:t xml:space="preserve">        text-align: center;</w:t>
+        <w:br/>
+        <w:t xml:space="preserve">        color: var(--muted);</w:t>
+        <w:br/>
+        <w:t xml:space="preserve">        padding: 22px;</w:t>
+        <w:br/>
+        <w:t xml:space="preserve">        border-top: 1px solid var(--line);</w:t>
+        <w:br/>
+        <w:t xml:space="preserve">        font-size: 13px;</w:t>
+        <w:br/>
+        <w:t xml:space="preserve">      }</w:t>
+        <w:br/>
+        <w:t xml:space="preserve">      @media (max-width: 760px) {</w:t>
+        <w:br/>
+        <w:t xml:space="preserve">        .hero {</w:t>
+        <w:br/>
+        <w:t xml:space="preserve">          grid-template-columns: 1fr;</w:t>
+        <w:br/>
+        <w:t xml:space="preserve">          margin-top: 38px;</w:t>
+        <w:br/>
+        <w:t xml:space="preserve">        }</w:t>
+        <w:br/>
+        <w:t xml:space="preserve">        .grid {</w:t>
+        <w:br/>
+        <w:t xml:space="preserve">          grid-template-columns: 1fr;</w:t>
+        <w:br/>
+        <w:t xml:space="preserve">        }</w:t>
+        <w:br/>
+        <w:t xml:space="preserve">        .offer {</w:t>
+        <w:br/>
+        <w:t xml:space="preserve">          display: block;</w:t>
+        <w:br/>
+        <w:t xml:space="preserve">        }</w:t>
+        <w:br/>
+        <w:t xml:space="preserve">        .code {</w:t>
+        <w:br/>
+        <w:t xml:space="preserve">          display: inline-block;</w:t>
+        <w:br/>
+        <w:t xml:space="preserve">          margin-top: 16px;</w:t>
+        <w:br/>
+        <w:t xml:space="preserve">        }</w:t>
+        <w:br/>
+        <w:t xml:space="preserve">        nav a {</w:t>
+        <w:br/>
+        <w:t xml:space="preserve">          margin-left: 8px;</w:t>
+        <w:br/>
+        <w:t xml:space="preserve">          font-size: 12px;</w:t>
+        <w:br/>
+        <w:t xml:space="preserve">        }</w:t>
+        <w:br/>
+        <w:t xml:space="preserve">      }</w:t>
+        <w:br/>
+        <w:t xml:space="preserve">      a:focus-visible {</w:t>
+        <w:br/>
+        <w:t xml:space="preserve">        outline: 3px solid #cf8b00;</w:t>
+        <w:br/>
+        <w:t xml:space="preserve">        outline-offset: 5px;</w:t>
+        <w:br/>
+        <w:t xml:space="preserve">      }</w:t>
+        <w:br/>
+        <w:t xml:space="preserve">      html {</w:t>
+        <w:br/>
+        <w:t xml:space="preserve">        scroll-behavior: smooth;</w:t>
+        <w:br/>
+        <w:t xml:space="preserve">      }</w:t>
+        <w:br/>
+        <w:t xml:space="preserve">      @media (prefers-reduced-motion: reduce) {</w:t>
+        <w:br/>
+        <w:t xml:space="preserve">        html {</w:t>
+        <w:br/>
+        <w:t xml:space="preserve">          scroll-behavior: auto;</w:t>
+        <w:br/>
+        <w:t xml:space="preserve">        }</w:t>
+        <w:br/>
+        <w:t xml:space="preserve">      }</w:t>
+        <w:br/>
+        <w:t xml:space="preserve">    &lt;/style&gt;</w:t>
+        <w:br/>
+        <w:t xml:space="preserve">  &lt;/head&gt;</w:t>
+        <w:br/>
+        <w:t xml:space="preserve">  &lt;body&gt;</w:t>
+        <w:br/>
+        <w:t xml:space="preserve">    &lt;header&gt;</w:t>
+        <w:br/>
+        <w:t xml:space="preserve">      &lt;nav&gt;</w:t>
+        <w:br/>
+        <w:t xml:space="preserve">        &lt;div class="brand"&gt;PLATE &amp; PARCEL&lt;/div&gt;</w:t>
+        <w:br/>
+        <w:t xml:space="preserve">        &lt;div&gt;</w:t>
+        <w:br/>
+        <w:t xml:space="preserve">          &lt;a href="#restaurants"&gt;Restaurants&lt;/a&gt;&lt;a href="#offers"&gt;Offers&lt;/a</w:t>
+        <w:br/>
+        <w:t xml:space="preserve">          &gt;&lt;a href="#orders"&gt;My orders&lt;/a&gt;</w:t>
+        <w:br/>
+        <w:t xml:space="preserve">        &lt;/div&gt;</w:t>
+        <w:br/>
+        <w:t xml:space="preserve">      &lt;/nav&gt;</w:t>
+      </w:r>
+    </w:p>
+    <w:p>
+      <w:pPr>
+        <w:pStyle w:val="BodyText"/>
+        <w:keepNext/>
+        <w:keepLines/>
+        <w:pageBreakBefore/>
+      </w:pPr>
+      <w:r>
+        <w:rPr>
+          <w:rFonts w:ascii="Times New Roman" w:hAnsi="Times New Roman"/>
+          <w:b/>
+          <w:color w:val="000000"/>
+          <w:sz w:val="40"/>
+        </w:rPr>
+        <w:t>index.html (continued)</w:t>
+      </w:r>
+    </w:p>
+    <w:p>
+      <w:pPr>
+        <w:pStyle w:val="BodyText"/>
+        <w:keepNext w:val="0"/>
+        <w:keepLines/>
+        <w:spacing w:before="0" w:after="0" w:line="230" w:lineRule="exact"/>
+      </w:pPr>
+      <w:r>
+        <w:rPr>
+          <w:rFonts w:ascii="Consolas" w:hAnsi="Consolas"/>
+          <w:b w:val="0"/>
+          <w:color w:val="000000"/>
+          <w:sz w:val="20"/>
+        </w:rPr>
+        <w:t xml:space="preserve">      &lt;div class="hero"&gt;</w:t>
+        <w:br/>
+        <w:t xml:space="preserve">        &lt;div&gt;</w:t>
+        <w:br/>
+        <w:t xml:space="preserve">          &lt;div class="eyebrow"&gt;Dinner, delivered with care&lt;/div&gt;</w:t>
+        <w:br/>
+        <w:t xml:space="preserve">          &lt;h1&gt;Good food finds you here.&lt;/h1&gt;</w:t>
+        <w:br/>
+        <w:t xml:space="preserve">          &lt;p&gt;</w:t>
+        <w:br/>
+        <w:t xml:space="preserve">            Explore neighbourhood kitchens, discover new favourites, and order a meal</w:t>
+        <w:br/>
+        <w:t xml:space="preserve">            that arrives exactly when you want it.</w:t>
+        <w:br/>
+        <w:t xml:space="preserve">          &lt;/p&gt;</w:t>
+        <w:br/>
+        <w:t xml:space="preserve">        &lt;/div&gt;</w:t>
+        <w:br/>
+        <w:t xml:space="preserve">        &lt;div class="hero-art"&gt;</w:t>
+        <w:br/>
+        <w:t xml:space="preserve">          &lt;div class="badge"&gt;Free delivery today&lt;/div&gt;</w:t>
+        <w:br/>
+        <w:t xml:space="preserve">          &lt;div class="plate"&gt;&lt;div class="food"&gt;🍜&lt;/div&gt;&lt;/div&gt;</w:t>
+        <w:br/>
+        <w:t xml:space="preserve">        &lt;/div&gt;</w:t>
+        <w:br/>
+        <w:t xml:space="preserve">      &lt;/div&gt;</w:t>
+        <w:br/>
+        <w:t xml:space="preserve">    &lt;/header&gt;</w:t>
+        <w:br/>
+        <w:t xml:space="preserve">    &lt;main class="main"&gt;</w:t>
+        <w:br/>
+        <w:t xml:space="preserve">      &lt;div class="head" id="restaurants"&gt;</w:t>
+        <w:br/>
+        <w:t xml:space="preserve">        &lt;div&gt;</w:t>
+        <w:br/>
+        <w:t xml:space="preserve">          &lt;div class="eyebrow"&gt;Open now near you&lt;/div&gt;</w:t>
+        <w:br/>
+        <w:t xml:space="preserve">          &lt;h2&gt;Popular kitchens&lt;/h2&gt;</w:t>
+        <w:br/>
+        <w:t xml:space="preserve">        &lt;/div&gt;</w:t>
+        <w:br/>
+        <w:t xml:space="preserve">        &lt;p&gt;Average delivery · 25–35 min&lt;/p&gt;</w:t>
+        <w:br/>
+        <w:t xml:space="preserve">      &lt;/div&gt;</w:t>
+        <w:br/>
+        <w:t xml:space="preserve">      &lt;div class="grid"&gt;</w:t>
+        <w:br/>
+        <w:t xml:space="preserve">        &lt;article class="card"&gt;</w:t>
+        <w:br/>
+        <w:t xml:space="preserve">          &lt;div class="card-top"&gt;</w:t>
+        <w:br/>
+        <w:t xml:space="preserve">            &lt;div class="eyebrow"&gt;Japanese · 4.8 ★&lt;/div&gt;</w:t>
+        <w:br/>
+        <w:t xml:space="preserve">            &lt;div class="price"&gt;₹₹&lt;/div&gt;</w:t>
+        <w:br/>
+        <w:t xml:space="preserve">          &lt;/div&gt;</w:t>
+        <w:br/>
+        <w:t xml:space="preserve">          &lt;h3&gt;Umami House&lt;/h3&gt;</w:t>
+        <w:br/>
+        <w:t xml:space="preserve">          &lt;p&gt;Ramen, donburi and small plates with a rich, slow-cooked broth.&lt;/p&gt;</w:t>
+        <w:br/>
+        <w:t xml:space="preserve">          &lt;div class="tags"&gt;</w:t>
+        <w:br/>
+        <w:t xml:space="preserve">            &lt;span class="tag"&gt;Top rated&lt;/span&gt;&lt;span class="tag"&gt;Veg options&lt;/span&gt;</w:t>
+        <w:br/>
+        <w:t xml:space="preserve">          &lt;/div&gt;</w:t>
+        <w:br/>
+        <w:t xml:space="preserve">        &lt;/article&gt;</w:t>
+        <w:br/>
+        <w:t xml:space="preserve">        &lt;article class="card"&gt;</w:t>
+        <w:br/>
+        <w:t xml:space="preserve">          &lt;div class="card-top"&gt;</w:t>
+        <w:br/>
+        <w:t xml:space="preserve">            &lt;div class="eyebrow"&gt;Indian · 4.7 ★&lt;/div&gt;</w:t>
+        <w:br/>
+        <w:t xml:space="preserve">            &lt;div class="price"&gt;₹₹&lt;/div&gt;</w:t>
+        <w:br/>
+        <w:t xml:space="preserve">          &lt;/div&gt;</w:t>
+        <w:br/>
+        <w:t xml:space="preserve">          &lt;h3&gt;Spice Route&lt;/h3&gt;</w:t>
+        <w:br/>
+        <w:t xml:space="preserve">          &lt;p&gt;Regional comfort food, clay-oven breads and bright seasonal thalis.&lt;/p&gt;</w:t>
+        <w:br/>
+        <w:t xml:space="preserve">          &lt;div class="tags"&gt;</w:t>
+        <w:br/>
+        <w:t xml:space="preserve">            &lt;span class="tag"&gt;Bestseller&lt;/span&gt;&lt;span class="tag"&gt;Halal&lt;/span&gt;</w:t>
+        <w:br/>
+        <w:t xml:space="preserve">          &lt;/div&gt;</w:t>
+        <w:br/>
+        <w:t xml:space="preserve">        &lt;/article&gt;</w:t>
+        <w:br/>
+        <w:t xml:space="preserve">        &lt;article class="card"&gt;</w:t>
+        <w:br/>
+        <w:t xml:space="preserve">          &lt;div class="card-top"&gt;</w:t>
+        <w:br/>
+        <w:t xml:space="preserve">            &lt;div class="eyebrow"&gt;Bakery · 4.9 ★&lt;/div&gt;</w:t>
+        <w:br/>
+        <w:t xml:space="preserve">            &lt;div class="price"&gt;₹&lt;/div&gt;</w:t>
+        <w:br/>
+        <w:t xml:space="preserve">          &lt;/div&gt;</w:t>
+      </w:r>
+    </w:p>
+    <w:p>
+      <w:pPr>
+        <w:pStyle w:val="BodyText"/>
+        <w:keepNext/>
+        <w:keepLines/>
+        <w:pageBreakBefore/>
+      </w:pPr>
+      <w:r>
+        <w:rPr>
+          <w:rFonts w:ascii="Times New Roman" w:hAnsi="Times New Roman"/>
+          <w:b/>
+          <w:color w:val="000000"/>
+          <w:sz w:val="40"/>
+        </w:rPr>
+        <w:t>index.html (continued)</w:t>
+      </w:r>
+    </w:p>
+    <w:p>
+      <w:pPr>
+        <w:pStyle w:val="BodyText"/>
+        <w:keepNext w:val="0"/>
+        <w:keepLines/>
+        <w:spacing w:before="0" w:after="0" w:line="230" w:lineRule="exact"/>
+      </w:pPr>
+      <w:r>
+        <w:rPr>
+          <w:rFonts w:ascii="Consolas" w:hAnsi="Consolas"/>
+          <w:b w:val="0"/>
+          <w:color w:val="000000"/>
+          <w:sz w:val="20"/>
+        </w:rPr>
+        <w:t xml:space="preserve">          &lt;h3&gt;Crumb &amp; Co.&lt;/h3&gt;</w:t>
+        <w:br/>
+        <w:t xml:space="preserve">          &lt;p&gt;Warm sourdough, hand-rolled pastries and coffee for every mood.&lt;/p&gt;</w:t>
+        <w:br/>
+        <w:t xml:space="preserve">          &lt;div class="tags"&gt;</w:t>
+        <w:br/>
+        <w:t xml:space="preserve">            &lt;span class="tag"&gt;Fresh today&lt;/span&gt;&lt;span class="tag"&gt;Breakfast&lt;/span&gt;</w:t>
+        <w:br/>
+        <w:t xml:space="preserve">          &lt;/div&gt;</w:t>
+        <w:br/>
+        <w:t xml:space="preserve">        &lt;/article&gt;</w:t>
+        <w:br/>
+        <w:t xml:space="preserve">      &lt;/div&gt;</w:t>
+        <w:br/>
+        <w:t xml:space="preserve">      &lt;div class="offer" id="offers"&gt;</w:t>
+        <w:br/>
+        <w:t xml:space="preserve">        &lt;div&gt;</w:t>
+        <w:br/>
+        <w:t xml:space="preserve">          &lt;div class="eyebrow" style="color: #f5bd72"&gt;A little extra&lt;/div&gt;</w:t>
+        <w:br/>
+        <w:t xml:space="preserve">          &lt;strong&gt;20% off your first order&lt;/strong&gt;</w:t>
+        <w:br/>
+        <w:t xml:space="preserve">          &lt;p&gt;Use the code at checkout before 31 October.&lt;/p&gt;</w:t>
+        <w:br/>
+        <w:t xml:space="preserve">        &lt;/div&gt;</w:t>
+        <w:br/>
+        <w:t xml:space="preserve">        &lt;div class="code"&gt;WELCOME20&lt;/div&gt;</w:t>
+        <w:br/>
+        <w:t xml:space="preserve">      &lt;/div&gt;</w:t>
+        <w:br/>
+        <w:t xml:space="preserve">      &lt;section</w:t>
+        <w:br/>
+        <w:t xml:space="preserve">        class="offer"</w:t>
+        <w:br/>
+        <w:t xml:space="preserve">        style="background: #fff; color: #271f20; border: 1px solid #ead8d0"</w:t>
+        <w:br/>
+        <w:t xml:space="preserve">      &gt;</w:t>
+        <w:br/>
+        <w:t xml:space="preserve">        &lt;div&gt;</w:t>
+        <w:br/>
+        <w:t xml:space="preserve">          &lt;div class="eyebrow"&gt;Today’s menu · available now&lt;/div&gt;</w:t>
+        <w:br/>
+        <w:t xml:space="preserve">          &lt;h2&gt;Choose your next favourite&lt;/h2&gt;</w:t>
+        <w:br/>
+        <w:t xml:space="preserve">          &lt;p style="color: #746b6a"&gt;</w:t>
+        <w:br/>
+        <w:t xml:space="preserve">            Miso ramen · Japanese · ₹280 · Available&lt;br /&gt;Paneer thali · Indian · ₹220 ·</w:t>
+        <w:br/>
+        <w:t xml:space="preserve">            Available&lt;br /&gt;Butter croissant · Bakery · ₹120 · Available</w:t>
+        <w:br/>
+        <w:t xml:space="preserve">          &lt;/p&gt;</w:t>
+        <w:br/>
+        <w:t xml:space="preserve">        &lt;/div&gt;</w:t>
+        <w:br/>
+        <w:t xml:space="preserve">      &lt;/section&gt;</w:t>
+        <w:br/>
+        <w:t xml:space="preserve">      &lt;section</w:t>
+        <w:br/>
+        <w:t xml:space="preserve">        id="release-update"</w:t>
+        <w:br/>
+        <w:t xml:space="preserve">        class="offer"</w:t>
+        <w:br/>
+        <w:t xml:space="preserve">        style="background: #f0e4d9; color: #271f20"</w:t>
+        <w:br/>
+        <w:t xml:space="preserve">      &gt;</w:t>
+        <w:br/>
+        <w:t xml:space="preserve">        &lt;div&gt;</w:t>
+        <w:br/>
+        <w:t xml:space="preserve">          &lt;div class="eyebrow"&gt;New in version 2&lt;/div&gt;</w:t>
+        <w:br/>
+        <w:t xml:space="preserve">          &lt;h2&gt;Thank you for ordering with us.&lt;/h2&gt;</w:t>
+        <w:br/>
+        <w:t xml:space="preserve">          &lt;p style="color: #574d49"&gt;</w:t>
+        <w:br/>
+        <w:t xml:space="preserve">            Restaurant rating summary: 4.8 / 5 across our three featured kitchens. Your</w:t>
+        <w:br/>
+        <w:t xml:space="preserve">            next favourite is only an order away.</w:t>
+        <w:br/>
+        <w:t xml:space="preserve">          &lt;/p&gt;</w:t>
+        <w:br/>
+        <w:t xml:space="preserve">        &lt;/div&gt;</w:t>
+        <w:br/>
+        <w:t xml:space="preserve">      &lt;/section&gt;</w:t>
+        <w:br/>
+        <w:t xml:space="preserve">    &lt;/main&gt;</w:t>
+        <w:br/>
+        <w:t xml:space="preserve">    &lt;footer id="orders" class="foot"&gt;</w:t>
+        <w:br/>
+        <w:t xml:space="preserve">      Plate &amp; Parcel · Online Food Ordering Portal · Menu refreshed 15 Oct 2026</w:t>
+        <w:br/>
+        <w:t xml:space="preserve">    &lt;/footer&gt;</w:t>
+        <w:br/>
+        <w:t xml:space="preserve">  &lt;/body&gt;</w:t>
+        <w:br/>
+        <w:t>&lt;/html&gt;</w:t>
       </w:r>
     </w:p>
     <w:p>
@@ -3393,7 +4917,7 @@
         <w:pStyle w:val="BodyText"/>
         <w:keepNext w:val="0"/>
         <w:keepLines/>
-        <w:spacing w:before="0" w:after="100" w:line="240" w:lineRule="auto"/>
+        <w:spacing w:before="0" w:after="0" w:line="230" w:lineRule="exact"/>
       </w:pPr>
       <w:r>
         <w:rPr>
@@ -3406,17 +4930,111 @@
         <w:br/>
         <w:t>&lt;html lang="en"&gt;</w:t>
         <w:br/>
-        <w:t>&lt;head&gt;</w:t>
-        <w:br/>
-        <w:t>&lt;meta charset="utf-8"&gt;&lt;meta name="viewport" content="width=device-width, initial-scale=1"&gt;&lt;meta name="release" content="v2"&gt;&lt;title&gt;Northstar Health — Hospital Appointment Portal&lt;/title&gt;</w:t>
-        <w:br/>
-        <w:t>&lt;style&gt;</w:t>
-        <w:br/>
-        <w:t>:root{--ink:#172a31;--muted:#64747a;--teal:#1e7c78;--mint:#e6f4f1;--line:#d9e6e4;--white:#fff}*{box-sizing:border-box}body{margin:0;font-family:Inter,Segoe UI,Arial,sans-serif;color:var(--ink);background:#f7fbfa}header{background:#ecf7f4;padding:24px 7vw 50px}nav{max-width:1180px;margin:auto;display:flex;justify-content:space-between;align-items:center}.brand{font-weight:850;letter-spacing:-.03em;font-size:21px}nav a{font-size:14px;color:var(--muted);text-decoration:none;margin-left:22px}.hero{max-width:1180px;margin:58px auto 0;display:grid;grid-template-columns:1fr 1fr;gap:50px;align-items:center}.eyebrow{text-transform:uppercase;letter-spacing:.12em;font-size:11px;font-weight:800;color:var(--teal)}h1{font-size:clamp(40px,5vw,68px);line-height:1;letter-spacing:-.055em;margin:12px 0 18px}.hero p{color:var(--muted);font-size:18px;line-height:1.6;max-width:530px}.hero-panel{background:#fff;border:1px solid var(--line);border-radius:20px;padding:26px;box-shadow:0 18px 35px rgba(40,90,84,.08)}.panel-title{display:flex;justify-content:space-between;align-items:center;margin-bottom:18px}.panel-title strong{font-size:18px}.status{font-size:11px;background:#dff4e8;color:#267049;padding:7px 10px;border-radius:99px;font-weight:800}.slot{display:flex;justify-content:space-between;align-items:center;padding:15px 0;border-top:1px solid var(--line);font-size:14px}.slot span{color:var(--muted)}.slot b{color:var(--teal)}main{max-width:1180px;margin:auto;padding:42px 7vw 72px}.head{display:flex;justify-content:space-between;align-items:end;margin-bottom:18px}.head h2{font-size:28px;margin:6px 0 0}.head p{color:var(--muted);margin:0}.grid{display:grid;grid-template-columns:repeat(3,1fr);gap:18px}.card{background:#fff;border:1px solid var(--line);border-radius:17px;padding:22px}.card .initial{width:44px;height:44px;border-radius:12px;background:var(--mint);color:var(--teal);display:grid;place-items:center;font-weight:850;font-size:18px}.card h3{margin:16px 0 5px;font-size:18px}.card p{color:var(--muted);line-height:1.5;margin:0}.specialty{margin-top:14px;color:var(--teal);font-size:12px;font-weight:800}.notice{margin-top:32px;background:#153f43;color:#fff;border-radius:18px;padding:25px;display:flex;justify-content:space-between;align-items:center}.notice p{color:#cbe4df;margin:7px 0 0}.notice strong{font-size:19px}.pill{background:#a6e1d2;color:#154f48;padding:10px 14px;border-radius:999px;font-weight:800;font-size:12px}.foot{text-align:center;color:var(--muted);padding:22px;border-top:1px solid var(--line);font-size:13px}@media(max-width:760px){.hero,.grid{grid-template-columns:1fr}.head{display:block}.head p{margin-top:8px}.notice{display:block}.pill{display:inline-block;margin-top:16px}nav a{margin-left:8px;font-size:12px}}</w:t>
-        <w:br/>
-        <w:t>a:focus-visible{outline:3px solid #cf8b00;outline-offset:5px}html{scroll-behavior:smooth}@media(prefers-reduced-motion:reduce){html{scroll-behavior:auto}}&lt;/style&gt;</w:t>
-        <w:br/>
-        <w:t>&lt;/head&gt;</w:t>
+        <w:t xml:space="preserve">  &lt;head&gt;</w:t>
+        <w:br/>
+        <w:t xml:space="preserve">    &lt;meta charset="utf-8" /&gt;</w:t>
+        <w:br/>
+        <w:t xml:space="preserve">    &lt;meta name="viewport" content="width=device-width, initial-scale=1" /&gt;</w:t>
+        <w:br/>
+        <w:t xml:space="preserve">    &lt;meta name="release" content="v2" /&gt;</w:t>
+        <w:br/>
+        <w:t xml:space="preserve">    &lt;title&gt;Northstar Health — Hospital Appointment Portal&lt;/title&gt;</w:t>
+        <w:br/>
+        <w:t xml:space="preserve">    &lt;style&gt;</w:t>
+        <w:br/>
+        <w:t xml:space="preserve">      :root {</w:t>
+        <w:br/>
+        <w:t xml:space="preserve">        --ink: #172a31;</w:t>
+        <w:br/>
+        <w:t xml:space="preserve">        --muted: #64747a;</w:t>
+        <w:br/>
+        <w:t xml:space="preserve">        --teal: #1e7c78;</w:t>
+        <w:br/>
+        <w:t xml:space="preserve">        --mint: #e6f4f1;</w:t>
+        <w:br/>
+        <w:t xml:space="preserve">        --line: #d9e6e4;</w:t>
+        <w:br/>
+        <w:t xml:space="preserve">        --white: #fff;</w:t>
+        <w:br/>
+        <w:t xml:space="preserve">      }</w:t>
+        <w:br/>
+        <w:t xml:space="preserve">      * {</w:t>
+        <w:br/>
+        <w:t xml:space="preserve">        box-sizing: border-box;</w:t>
+        <w:br/>
+        <w:t xml:space="preserve">      }</w:t>
+        <w:br/>
+        <w:t xml:space="preserve">      body {</w:t>
+        <w:br/>
+        <w:t xml:space="preserve">        margin: 0;</w:t>
+        <w:br/>
+        <w:t xml:space="preserve">        font-family:</w:t>
+        <w:br/>
+        <w:t xml:space="preserve">          Inter,</w:t>
+        <w:br/>
+        <w:t xml:space="preserve">          Segoe UI,</w:t>
+        <w:br/>
+        <w:t xml:space="preserve">          Arial,</w:t>
+        <w:br/>
+        <w:t xml:space="preserve">          sans-serif;</w:t>
+        <w:br/>
+        <w:t xml:space="preserve">        color: var(--ink);</w:t>
+        <w:br/>
+        <w:t xml:space="preserve">        background: #f7fbfa;</w:t>
+        <w:br/>
+        <w:t xml:space="preserve">      }</w:t>
+        <w:br/>
+        <w:t xml:space="preserve">      header {</w:t>
+        <w:br/>
+        <w:t xml:space="preserve">        background: #ecf7f4;</w:t>
+        <w:br/>
+        <w:t xml:space="preserve">        padding: 24px 7vw 50px;</w:t>
+        <w:br/>
+        <w:t xml:space="preserve">      }</w:t>
+        <w:br/>
+        <w:t xml:space="preserve">      nav {</w:t>
+        <w:br/>
+        <w:t xml:space="preserve">        max-width: 1180px;</w:t>
+        <w:br/>
+        <w:t xml:space="preserve">        margin: auto;</w:t>
+        <w:br/>
+        <w:t xml:space="preserve">        display: flex;</w:t>
+        <w:br/>
+        <w:t xml:space="preserve">        justify-content: space-between;</w:t>
+        <w:br/>
+        <w:t xml:space="preserve">        align-items: center;</w:t>
+        <w:br/>
+        <w:t xml:space="preserve">      }</w:t>
+        <w:br/>
+        <w:t xml:space="preserve">      .brand {</w:t>
+        <w:br/>
+        <w:t xml:space="preserve">        font-weight: 850;</w:t>
+        <w:br/>
+        <w:t xml:space="preserve">        letter-spacing: -0.03em;</w:t>
+        <w:br/>
+        <w:t xml:space="preserve">        font-size: 21px;</w:t>
+        <w:br/>
+        <w:t xml:space="preserve">      }</w:t>
+        <w:br/>
+        <w:t xml:space="preserve">      nav a {</w:t>
+        <w:br/>
+        <w:t xml:space="preserve">        font-size: 14px;</w:t>
+        <w:br/>
+        <w:t xml:space="preserve">        color: var(--muted);</w:t>
+        <w:br/>
+        <w:t xml:space="preserve">        text-decoration: none;</w:t>
+        <w:br/>
+        <w:t xml:space="preserve">        margin-left: 22px;</w:t>
+        <w:br/>
+        <w:t xml:space="preserve">      }</w:t>
+        <w:br/>
+        <w:t xml:space="preserve">      .hero {</w:t>
+        <w:br/>
+        <w:t xml:space="preserve">        max-width: 1180px;</w:t>
+        <w:br/>
+        <w:t xml:space="preserve">        margin: 58px auto 0;</w:t>
+        <w:br/>
+        <w:t xml:space="preserve">        display: grid;</w:t>
       </w:r>
     </w:p>
     <w:p>
@@ -3441,7 +5059,7 @@
         <w:pStyle w:val="BodyText"/>
         <w:keepNext w:val="0"/>
         <w:keepLines/>
-        <w:spacing w:before="0" w:after="100" w:line="240" w:lineRule="auto"/>
+        <w:spacing w:before="0" w:after="0" w:line="230" w:lineRule="exact"/>
       </w:pPr>
       <w:r>
         <w:rPr>
@@ -3450,7 +5068,675 @@
           <w:color w:val="000000"/>
           <w:sz w:val="20"/>
         </w:rPr>
-        <w:t>&lt;body&gt;&lt;header&gt;&lt;nav&gt;&lt;div class="brand"&gt;NORTHSTAR HEALTH&lt;/div&gt;&lt;div&gt;&lt;a href="#doctors"&gt;Doctors&lt;/a&gt;&lt;a href="#slots"&gt;Appointments&lt;/a&gt;&lt;a href="#notices"&gt;Notices&lt;/a&gt;&lt;/div&gt;&lt;/nav&gt;&lt;div class="hero"&gt;&lt;div&gt;&lt;div class="eyebrow"&gt;Care that fits your day&lt;/div&gt;&lt;h1&gt;Find the right care, at the right time.&lt;/h1&gt;&lt;p&gt;Browse trusted specialists, view live appointment slots, and book a consultation with confidence.&lt;/p&gt;&lt;/div&gt;&lt;div class="hero-panel" id="slots"&gt;&lt;div class="panel-title"&gt;&lt;strong&gt;Today's availability&lt;/strong&gt;&lt;span class="status"&gt;Live&lt;/span&gt;&lt;/div&gt;&lt;div class="slot"&gt;&lt;span&gt;General medicine&lt;/span&gt;&lt;b&gt;12 slots&lt;/b&gt;&lt;/div&gt;&lt;div class="slot"&gt;&lt;span&gt;Cardiology&lt;/span&gt;&lt;b&gt;04 slots&lt;/b&gt;&lt;/div&gt;&lt;div class="slot"&gt;&lt;span&gt;Dermatology&lt;/span&gt;&lt;b&gt;07 slots&lt;/b&gt;&lt;/div&gt;&lt;div class="slot"&gt;&lt;span&gt;Paediatrics&lt;/span&gt;&lt;b&gt;09 slots&lt;/b&gt;&lt;/div&gt;&lt;/div&gt;&lt;/div&gt;&lt;/header&gt;&lt;main&gt;&lt;div class="head" id="doctors"&gt;&lt;div&gt;&lt;div class="eyebrow"&gt;Meet the team&lt;/div&gt;&lt;h2&gt;Specialists you can trust&lt;/h2&gt;&lt;/div&gt;&lt;p&gt;Consultations available · 15 Oct 2026&lt;/p&gt;&lt;/div&gt;&lt;div class="grid"&gt;&lt;article class="card"&gt;&lt;div class="initial"&gt;AM&lt;/div&gt;&lt;h3&gt;Dr. Aanya Menon&lt;/h3&gt;&lt;p&gt;Consultant cardiologist · 12 years of experience&lt;/p&gt;&lt;div class="specialty"&gt;Next slot · Today, 16:30&lt;/div&gt;&lt;/article&gt;&lt;article class="card"&gt;&lt;div class="initial"&gt;RK&lt;/div&gt;&lt;h3&gt;Dr. Rohan Kapoor&lt;/h3&gt;&lt;p&gt;Senior dermatologist · 9 years of experience&lt;/p&gt;&lt;div class="specialty"&gt;Next slot · Tomorrow, 09:15&lt;/div&gt;&lt;/article&gt;&lt;article class="card"&gt;&lt;div class="initial"&gt;SI&lt;/div&gt;&lt;h3&gt;Dr. Sara Iqbal&lt;/h3&gt;&lt;p&gt;Consultant paediatrician · 14 years of experience&lt;/p&gt;&lt;div class="specialty"&gt;Next slot · Today, 18:00&lt;/div&gt;&lt;/article&gt;&lt;/div&gt;&lt;div class="notice" id="notices"&gt;&lt;div&gt;&lt;div class="eyebrow" style="color:#a6e1d2"&gt;Hospital announcement&lt;/div&gt;&lt;strong&gt;Flu clinic appointments are now open&lt;/strong&gt;&lt;p&gt;Reserve a same-week slot through the appointment desk.&lt;/p&gt;&lt;/div&gt;&lt;div class="pill"&gt;Book a slot&lt;/div&gt;&lt;/div&gt;&lt;section id="release-update" class="notice" style="background:#e0f1ec;color:#172a31"&gt;&lt;div&gt;&lt;div class="eyebrow"&gt;New appointment opportunity ? Version 2&lt;/div&gt;&lt;h2&gt;Vaccination clinic with Dr. Maya Rao&lt;/h2&gt;&lt;p style="color:#3c625b"&gt;Family medicine and immunisation ? 16 years of experience&lt;br&gt;New slots: Monday 09:00, 09:30 and 10:00 ? Consultation: 09:00?12:00&lt;/p&gt;&lt;/div&gt;&lt;/section&gt;&lt;/main&gt;&lt;footer class="foot"&gt;Northstar Health · Hospital Appointment Portal · Secure care scheduling&lt;/footer&gt;&lt;/body&gt;&lt;/html&gt;</w:t>
+        <w:t xml:space="preserve">        grid-template-columns: 1fr 1fr;</w:t>
+        <w:br/>
+        <w:t xml:space="preserve">        gap: 50px;</w:t>
+        <w:br/>
+        <w:t xml:space="preserve">        align-items: center;</w:t>
+        <w:br/>
+        <w:t xml:space="preserve">      }</w:t>
+        <w:br/>
+        <w:t xml:space="preserve">      .eyebrow {</w:t>
+        <w:br/>
+        <w:t xml:space="preserve">        text-transform: uppercase;</w:t>
+        <w:br/>
+        <w:t xml:space="preserve">        letter-spacing: 0.12em;</w:t>
+        <w:br/>
+        <w:t xml:space="preserve">        font-size: 11px;</w:t>
+        <w:br/>
+        <w:t xml:space="preserve">        font-weight: 800;</w:t>
+        <w:br/>
+        <w:t xml:space="preserve">        color: var(--teal);</w:t>
+        <w:br/>
+        <w:t xml:space="preserve">      }</w:t>
+        <w:br/>
+        <w:t xml:space="preserve">      h1 {</w:t>
+        <w:br/>
+        <w:t xml:space="preserve">        font-size: clamp(40px, 5vw, 68px);</w:t>
+        <w:br/>
+        <w:t xml:space="preserve">        line-height: 1;</w:t>
+        <w:br/>
+        <w:t xml:space="preserve">        letter-spacing: -0.055em;</w:t>
+        <w:br/>
+        <w:t xml:space="preserve">        margin: 12px 0 18px;</w:t>
+        <w:br/>
+        <w:t xml:space="preserve">      }</w:t>
+        <w:br/>
+        <w:t xml:space="preserve">      .hero p {</w:t>
+        <w:br/>
+        <w:t xml:space="preserve">        color: var(--muted);</w:t>
+        <w:br/>
+        <w:t xml:space="preserve">        font-size: 18px;</w:t>
+        <w:br/>
+        <w:t xml:space="preserve">        line-height: 1.6;</w:t>
+        <w:br/>
+        <w:t xml:space="preserve">        max-width: 530px;</w:t>
+        <w:br/>
+        <w:t xml:space="preserve">      }</w:t>
+        <w:br/>
+        <w:t xml:space="preserve">      .hero-panel {</w:t>
+        <w:br/>
+        <w:t xml:space="preserve">        background: #fff;</w:t>
+        <w:br/>
+        <w:t xml:space="preserve">        border: 1px solid var(--line);</w:t>
+        <w:br/>
+        <w:t xml:space="preserve">        border-radius: 20px;</w:t>
+        <w:br/>
+        <w:t xml:space="preserve">        padding: 26px;</w:t>
+        <w:br/>
+        <w:t xml:space="preserve">        box-shadow: 0 18px 35px rgba(40, 90, 84, 0.08);</w:t>
+        <w:br/>
+        <w:t xml:space="preserve">      }</w:t>
+        <w:br/>
+        <w:t xml:space="preserve">      .panel-title {</w:t>
+        <w:br/>
+        <w:t xml:space="preserve">        display: flex;</w:t>
+        <w:br/>
+        <w:t xml:space="preserve">        justify-content: space-between;</w:t>
+        <w:br/>
+        <w:t xml:space="preserve">        align-items: center;</w:t>
+        <w:br/>
+        <w:t xml:space="preserve">        margin-bottom: 18px;</w:t>
+        <w:br/>
+        <w:t xml:space="preserve">      }</w:t>
+        <w:br/>
+        <w:t xml:space="preserve">      .panel-title strong {</w:t>
+        <w:br/>
+        <w:t xml:space="preserve">        font-size: 18px;</w:t>
+        <w:br/>
+        <w:t xml:space="preserve">      }</w:t>
+        <w:br/>
+        <w:t xml:space="preserve">      .status {</w:t>
+        <w:br/>
+        <w:t xml:space="preserve">        font-size: 11px;</w:t>
+        <w:br/>
+        <w:t xml:space="preserve">        background: #dff4e8;</w:t>
+        <w:br/>
+        <w:t xml:space="preserve">        color: #267049;</w:t>
+        <w:br/>
+        <w:t xml:space="preserve">        padding: 7px 10px;</w:t>
+        <w:br/>
+        <w:t xml:space="preserve">        border-radius: 99px;</w:t>
+        <w:br/>
+        <w:t xml:space="preserve">        font-weight: 800;</w:t>
+        <w:br/>
+        <w:t xml:space="preserve">      }</w:t>
+        <w:br/>
+        <w:t xml:space="preserve">      .slot {</w:t>
+        <w:br/>
+        <w:t xml:space="preserve">        display: flex;</w:t>
+        <w:br/>
+        <w:t xml:space="preserve">        justify-content: space-between;</w:t>
+        <w:br/>
+        <w:t xml:space="preserve">        align-items: center;</w:t>
+        <w:br/>
+        <w:t xml:space="preserve">        padding: 15px 0;</w:t>
+        <w:br/>
+        <w:t xml:space="preserve">        border-top: 1px solid var(--line);</w:t>
+        <w:br/>
+        <w:t xml:space="preserve">        font-size: 14px;</w:t>
+        <w:br/>
+        <w:t xml:space="preserve">      }</w:t>
+      </w:r>
+    </w:p>
+    <w:p>
+      <w:pPr>
+        <w:pStyle w:val="BodyText"/>
+        <w:keepNext/>
+        <w:keepLines/>
+        <w:pageBreakBefore/>
+      </w:pPr>
+      <w:r>
+        <w:rPr>
+          <w:rFonts w:ascii="Times New Roman" w:hAnsi="Times New Roman"/>
+          <w:b/>
+          <w:color w:val="000000"/>
+          <w:sz w:val="40"/>
+        </w:rPr>
+        <w:t>index.html (continued)</w:t>
+      </w:r>
+    </w:p>
+    <w:p>
+      <w:pPr>
+        <w:pStyle w:val="BodyText"/>
+        <w:keepNext w:val="0"/>
+        <w:keepLines/>
+        <w:spacing w:before="0" w:after="0" w:line="230" w:lineRule="exact"/>
+      </w:pPr>
+      <w:r>
+        <w:rPr>
+          <w:rFonts w:ascii="Consolas" w:hAnsi="Consolas"/>
+          <w:b w:val="0"/>
+          <w:color w:val="000000"/>
+          <w:sz w:val="20"/>
+        </w:rPr>
+        <w:t xml:space="preserve">      .slot span {</w:t>
+        <w:br/>
+        <w:t xml:space="preserve">        color: var(--muted);</w:t>
+        <w:br/>
+        <w:t xml:space="preserve">      }</w:t>
+        <w:br/>
+        <w:t xml:space="preserve">      .slot b {</w:t>
+        <w:br/>
+        <w:t xml:space="preserve">        color: var(--teal);</w:t>
+        <w:br/>
+        <w:t xml:space="preserve">      }</w:t>
+        <w:br/>
+        <w:t xml:space="preserve">      main {</w:t>
+        <w:br/>
+        <w:t xml:space="preserve">        max-width: 1180px;</w:t>
+        <w:br/>
+        <w:t xml:space="preserve">        margin: auto;</w:t>
+        <w:br/>
+        <w:t xml:space="preserve">        padding: 42px 7vw 72px;</w:t>
+        <w:br/>
+        <w:t xml:space="preserve">      }</w:t>
+        <w:br/>
+        <w:t xml:space="preserve">      .head {</w:t>
+        <w:br/>
+        <w:t xml:space="preserve">        display: flex;</w:t>
+        <w:br/>
+        <w:t xml:space="preserve">        justify-content: space-between;</w:t>
+        <w:br/>
+        <w:t xml:space="preserve">        align-items: end;</w:t>
+        <w:br/>
+        <w:t xml:space="preserve">        margin-bottom: 18px;</w:t>
+        <w:br/>
+        <w:t xml:space="preserve">      }</w:t>
+        <w:br/>
+        <w:t xml:space="preserve">      .head h2 {</w:t>
+        <w:br/>
+        <w:t xml:space="preserve">        font-size: 28px;</w:t>
+        <w:br/>
+        <w:t xml:space="preserve">        margin: 6px 0 0;</w:t>
+        <w:br/>
+        <w:t xml:space="preserve">      }</w:t>
+        <w:br/>
+        <w:t xml:space="preserve">      .head p {</w:t>
+        <w:br/>
+        <w:t xml:space="preserve">        color: var(--muted);</w:t>
+        <w:br/>
+        <w:t xml:space="preserve">        margin: 0;</w:t>
+        <w:br/>
+        <w:t xml:space="preserve">      }</w:t>
+        <w:br/>
+        <w:t xml:space="preserve">      .grid {</w:t>
+        <w:br/>
+        <w:t xml:space="preserve">        display: grid;</w:t>
+        <w:br/>
+        <w:t xml:space="preserve">        grid-template-columns: repeat(3, 1fr);</w:t>
+        <w:br/>
+        <w:t xml:space="preserve">        gap: 18px;</w:t>
+        <w:br/>
+        <w:t xml:space="preserve">      }</w:t>
+        <w:br/>
+        <w:t xml:space="preserve">      .card {</w:t>
+        <w:br/>
+        <w:t xml:space="preserve">        background: #fff;</w:t>
+        <w:br/>
+        <w:t xml:space="preserve">        border: 1px solid var(--line);</w:t>
+        <w:br/>
+        <w:t xml:space="preserve">        border-radius: 17px;</w:t>
+        <w:br/>
+        <w:t xml:space="preserve">        padding: 22px;</w:t>
+        <w:br/>
+        <w:t xml:space="preserve">      }</w:t>
+        <w:br/>
+        <w:t xml:space="preserve">      .card .initial {</w:t>
+        <w:br/>
+        <w:t xml:space="preserve">        width: 44px;</w:t>
+        <w:br/>
+        <w:t xml:space="preserve">        height: 44px;</w:t>
+        <w:br/>
+        <w:t xml:space="preserve">        border-radius: 12px;</w:t>
+        <w:br/>
+        <w:t xml:space="preserve">        background: var(--mint);</w:t>
+        <w:br/>
+        <w:t xml:space="preserve">        color: var(--teal);</w:t>
+        <w:br/>
+        <w:t xml:space="preserve">        display: grid;</w:t>
+        <w:br/>
+        <w:t xml:space="preserve">        place-items: center;</w:t>
+        <w:br/>
+        <w:t xml:space="preserve">        font-weight: 850;</w:t>
+        <w:br/>
+        <w:t xml:space="preserve">        font-size: 18px;</w:t>
+        <w:br/>
+        <w:t xml:space="preserve">      }</w:t>
+        <w:br/>
+        <w:t xml:space="preserve">      .card h3 {</w:t>
+        <w:br/>
+        <w:t xml:space="preserve">        margin: 16px 0 5px;</w:t>
+        <w:br/>
+        <w:t xml:space="preserve">        font-size: 18px;</w:t>
+        <w:br/>
+        <w:t xml:space="preserve">      }</w:t>
+        <w:br/>
+        <w:t xml:space="preserve">      .card p {</w:t>
+        <w:br/>
+        <w:t xml:space="preserve">        color: var(--muted);</w:t>
+        <w:br/>
+        <w:t xml:space="preserve">        line-height: 1.5;</w:t>
+        <w:br/>
+        <w:t xml:space="preserve">        margin: 0;</w:t>
+        <w:br/>
+        <w:t xml:space="preserve">      }</w:t>
+      </w:r>
+    </w:p>
+    <w:p>
+      <w:pPr>
+        <w:pStyle w:val="BodyText"/>
+        <w:keepNext/>
+        <w:keepLines/>
+        <w:pageBreakBefore/>
+      </w:pPr>
+      <w:r>
+        <w:rPr>
+          <w:rFonts w:ascii="Times New Roman" w:hAnsi="Times New Roman"/>
+          <w:b/>
+          <w:color w:val="000000"/>
+          <w:sz w:val="40"/>
+        </w:rPr>
+        <w:t>index.html (continued)</w:t>
+      </w:r>
+    </w:p>
+    <w:p>
+      <w:pPr>
+        <w:pStyle w:val="BodyText"/>
+        <w:keepNext w:val="0"/>
+        <w:keepLines/>
+        <w:spacing w:before="0" w:after="0" w:line="230" w:lineRule="exact"/>
+      </w:pPr>
+      <w:r>
+        <w:rPr>
+          <w:rFonts w:ascii="Consolas" w:hAnsi="Consolas"/>
+          <w:b w:val="0"/>
+          <w:color w:val="000000"/>
+          <w:sz w:val="20"/>
+        </w:rPr>
+        <w:t xml:space="preserve">      .specialty {</w:t>
+        <w:br/>
+        <w:t xml:space="preserve">        margin-top: 14px;</w:t>
+        <w:br/>
+        <w:t xml:space="preserve">        color: var(--teal);</w:t>
+        <w:br/>
+        <w:t xml:space="preserve">        font-size: 12px;</w:t>
+        <w:br/>
+        <w:t xml:space="preserve">        font-weight: 800;</w:t>
+        <w:br/>
+        <w:t xml:space="preserve">      }</w:t>
+        <w:br/>
+        <w:t xml:space="preserve">      .notice {</w:t>
+        <w:br/>
+        <w:t xml:space="preserve">        margin-top: 32px;</w:t>
+        <w:br/>
+        <w:t xml:space="preserve">        background: #153f43;</w:t>
+        <w:br/>
+        <w:t xml:space="preserve">        color: #fff;</w:t>
+        <w:br/>
+        <w:t xml:space="preserve">        border-radius: 18px;</w:t>
+        <w:br/>
+        <w:t xml:space="preserve">        padding: 25px;</w:t>
+        <w:br/>
+        <w:t xml:space="preserve">        display: flex;</w:t>
+        <w:br/>
+        <w:t xml:space="preserve">        justify-content: space-between;</w:t>
+        <w:br/>
+        <w:t xml:space="preserve">        align-items: center;</w:t>
+        <w:br/>
+        <w:t xml:space="preserve">      }</w:t>
+        <w:br/>
+        <w:t xml:space="preserve">      .notice p {</w:t>
+        <w:br/>
+        <w:t xml:space="preserve">        color: #cbe4df;</w:t>
+        <w:br/>
+        <w:t xml:space="preserve">        margin: 7px 0 0;</w:t>
+        <w:br/>
+        <w:t xml:space="preserve">      }</w:t>
+        <w:br/>
+        <w:t xml:space="preserve">      .notice strong {</w:t>
+        <w:br/>
+        <w:t xml:space="preserve">        font-size: 19px;</w:t>
+        <w:br/>
+        <w:t xml:space="preserve">      }</w:t>
+        <w:br/>
+        <w:t xml:space="preserve">      .pill {</w:t>
+        <w:br/>
+        <w:t xml:space="preserve">        background: #a6e1d2;</w:t>
+        <w:br/>
+        <w:t xml:space="preserve">        color: #154f48;</w:t>
+        <w:br/>
+        <w:t xml:space="preserve">        padding: 10px 14px;</w:t>
+        <w:br/>
+        <w:t xml:space="preserve">        border-radius: 999px;</w:t>
+        <w:br/>
+        <w:t xml:space="preserve">        font-weight: 800;</w:t>
+        <w:br/>
+        <w:t xml:space="preserve">        font-size: 12px;</w:t>
+        <w:br/>
+        <w:t xml:space="preserve">      }</w:t>
+        <w:br/>
+        <w:t xml:space="preserve">      .foot {</w:t>
+        <w:br/>
+        <w:t xml:space="preserve">        text-align: center;</w:t>
+        <w:br/>
+        <w:t xml:space="preserve">        color: var(--muted);</w:t>
+        <w:br/>
+        <w:t xml:space="preserve">        padding: 22px;</w:t>
+        <w:br/>
+        <w:t xml:space="preserve">        border-top: 1px solid var(--line);</w:t>
+        <w:br/>
+        <w:t xml:space="preserve">        font-size: 13px;</w:t>
+        <w:br/>
+        <w:t xml:space="preserve">      }</w:t>
+        <w:br/>
+        <w:t xml:space="preserve">      @media (max-width: 760px) {</w:t>
+        <w:br/>
+        <w:t xml:space="preserve">        .hero,</w:t>
+        <w:br/>
+        <w:t xml:space="preserve">        .grid {</w:t>
+        <w:br/>
+        <w:t xml:space="preserve">          grid-template-columns: 1fr;</w:t>
+        <w:br/>
+        <w:t xml:space="preserve">        }</w:t>
+        <w:br/>
+        <w:t xml:space="preserve">        .head {</w:t>
+        <w:br/>
+        <w:t xml:space="preserve">          display: block;</w:t>
+        <w:br/>
+        <w:t xml:space="preserve">        }</w:t>
+        <w:br/>
+        <w:t xml:space="preserve">        .head p {</w:t>
+        <w:br/>
+        <w:t xml:space="preserve">          margin-top: 8px;</w:t>
+        <w:br/>
+        <w:t xml:space="preserve">        }</w:t>
+        <w:br/>
+        <w:t xml:space="preserve">        .notice {</w:t>
+        <w:br/>
+        <w:t xml:space="preserve">          display: block;</w:t>
+        <w:br/>
+        <w:t xml:space="preserve">        }</w:t>
+      </w:r>
+    </w:p>
+    <w:p>
+      <w:pPr>
+        <w:pStyle w:val="BodyText"/>
+        <w:keepNext/>
+        <w:keepLines/>
+        <w:pageBreakBefore/>
+      </w:pPr>
+      <w:r>
+        <w:rPr>
+          <w:rFonts w:ascii="Times New Roman" w:hAnsi="Times New Roman"/>
+          <w:b/>
+          <w:color w:val="000000"/>
+          <w:sz w:val="40"/>
+        </w:rPr>
+        <w:t>index.html (continued)</w:t>
+      </w:r>
+    </w:p>
+    <w:p>
+      <w:pPr>
+        <w:pStyle w:val="BodyText"/>
+        <w:keepNext w:val="0"/>
+        <w:keepLines/>
+        <w:spacing w:before="0" w:after="0" w:line="230" w:lineRule="exact"/>
+      </w:pPr>
+      <w:r>
+        <w:rPr>
+          <w:rFonts w:ascii="Consolas" w:hAnsi="Consolas"/>
+          <w:b w:val="0"/>
+          <w:color w:val="000000"/>
+          <w:sz w:val="20"/>
+        </w:rPr>
+        <w:t xml:space="preserve">        .pill {</w:t>
+        <w:br/>
+        <w:t xml:space="preserve">          display: inline-block;</w:t>
+        <w:br/>
+        <w:t xml:space="preserve">          margin-top: 16px;</w:t>
+        <w:br/>
+        <w:t xml:space="preserve">        }</w:t>
+        <w:br/>
+        <w:t xml:space="preserve">        nav a {</w:t>
+        <w:br/>
+        <w:t xml:space="preserve">          margin-left: 8px;</w:t>
+        <w:br/>
+        <w:t xml:space="preserve">          font-size: 12px;</w:t>
+        <w:br/>
+        <w:t xml:space="preserve">        }</w:t>
+        <w:br/>
+        <w:t xml:space="preserve">      }</w:t>
+        <w:br/>
+        <w:t xml:space="preserve">      a:focus-visible {</w:t>
+        <w:br/>
+        <w:t xml:space="preserve">        outline: 3px solid #cf8b00;</w:t>
+        <w:br/>
+        <w:t xml:space="preserve">        outline-offset: 5px;</w:t>
+        <w:br/>
+        <w:t xml:space="preserve">      }</w:t>
+        <w:br/>
+        <w:t xml:space="preserve">      html {</w:t>
+        <w:br/>
+        <w:t xml:space="preserve">        scroll-behavior: smooth;</w:t>
+        <w:br/>
+        <w:t xml:space="preserve">      }</w:t>
+        <w:br/>
+        <w:t xml:space="preserve">      @media (prefers-reduced-motion: reduce) {</w:t>
+        <w:br/>
+        <w:t xml:space="preserve">        html {</w:t>
+        <w:br/>
+        <w:t xml:space="preserve">          scroll-behavior: auto;</w:t>
+        <w:br/>
+        <w:t xml:space="preserve">        }</w:t>
+        <w:br/>
+        <w:t xml:space="preserve">      }</w:t>
+        <w:br/>
+        <w:t xml:space="preserve">    &lt;/style&gt;</w:t>
+        <w:br/>
+        <w:t xml:space="preserve">  &lt;/head&gt;</w:t>
+        <w:br/>
+        <w:t xml:space="preserve">  &lt;body&gt;</w:t>
+        <w:br/>
+        <w:t xml:space="preserve">    &lt;header&gt;</w:t>
+        <w:br/>
+        <w:t xml:space="preserve">      &lt;nav&gt;</w:t>
+        <w:br/>
+        <w:t xml:space="preserve">        &lt;div class="brand"&gt;NORTHSTAR HEALTH&lt;/div&gt;</w:t>
+        <w:br/>
+        <w:t xml:space="preserve">        &lt;div&gt;</w:t>
+        <w:br/>
+        <w:t xml:space="preserve">          &lt;a href="#doctors"&gt;Doctors&lt;/a&gt;&lt;a href="#slots"&gt;Appointments&lt;/a</w:t>
+        <w:br/>
+        <w:t xml:space="preserve">          &gt;&lt;a href="#notices"&gt;Notices&lt;/a&gt;</w:t>
+        <w:br/>
+        <w:t xml:space="preserve">        &lt;/div&gt;</w:t>
+        <w:br/>
+        <w:t xml:space="preserve">      &lt;/nav&gt;</w:t>
+        <w:br/>
+        <w:t xml:space="preserve">      &lt;div class="hero"&gt;</w:t>
+        <w:br/>
+        <w:t xml:space="preserve">        &lt;div&gt;</w:t>
+        <w:br/>
+        <w:t xml:space="preserve">          &lt;div class="eyebrow"&gt;Care that fits your day&lt;/div&gt;</w:t>
+        <w:br/>
+        <w:t xml:space="preserve">          &lt;h1&gt;Find the right care, at the right time.&lt;/h1&gt;</w:t>
+        <w:br/>
+        <w:t xml:space="preserve">          &lt;p&gt;</w:t>
+        <w:br/>
+        <w:t xml:space="preserve">            Browse trusted specialists, view live appointment slots, and book a</w:t>
+        <w:br/>
+        <w:t xml:space="preserve">            consultation with confidence.</w:t>
+        <w:br/>
+        <w:t xml:space="preserve">          &lt;/p&gt;</w:t>
+        <w:br/>
+        <w:t xml:space="preserve">        &lt;/div&gt;</w:t>
+        <w:br/>
+        <w:t xml:space="preserve">        &lt;div class="hero-panel" id="slots"&gt;</w:t>
+        <w:br/>
+        <w:t xml:space="preserve">          &lt;div class="panel-title"&gt;</w:t>
+        <w:br/>
+        <w:t xml:space="preserve">            &lt;strong&gt;Today's availability&lt;/strong&gt;&lt;span class="status"&gt;Live&lt;/span&gt;</w:t>
+        <w:br/>
+        <w:t xml:space="preserve">          &lt;/div&gt;</w:t>
+        <w:br/>
+        <w:t xml:space="preserve">          &lt;div class="slot"&gt;&lt;span&gt;General medicine&lt;/span&gt;&lt;b&gt;12 slots&lt;/b&gt;&lt;/div&gt;</w:t>
+        <w:br/>
+        <w:t xml:space="preserve">          &lt;div class="slot"&gt;&lt;span&gt;Cardiology&lt;/span&gt;&lt;b&gt;04 slots&lt;/b&gt;&lt;/div&gt;</w:t>
+        <w:br/>
+        <w:t xml:space="preserve">          &lt;div class="slot"&gt;&lt;span&gt;Dermatology&lt;/span&gt;&lt;b&gt;07 slots&lt;/b&gt;&lt;/div&gt;</w:t>
+        <w:br/>
+        <w:t xml:space="preserve">          &lt;div class="slot"&gt;&lt;span&gt;Paediatrics&lt;/span&gt;&lt;b&gt;09 slots&lt;/b&gt;&lt;/div&gt;</w:t>
+        <w:br/>
+        <w:t xml:space="preserve">        &lt;/div&gt;</w:t>
+        <w:br/>
+        <w:t xml:space="preserve">      &lt;/div&gt;</w:t>
+        <w:br/>
+        <w:t xml:space="preserve">    &lt;/header&gt;</w:t>
+      </w:r>
+    </w:p>
+    <w:p>
+      <w:pPr>
+        <w:pStyle w:val="BodyText"/>
+        <w:keepNext/>
+        <w:keepLines/>
+        <w:pageBreakBefore/>
+      </w:pPr>
+      <w:r>
+        <w:rPr>
+          <w:rFonts w:ascii="Times New Roman" w:hAnsi="Times New Roman"/>
+          <w:b/>
+          <w:color w:val="000000"/>
+          <w:sz w:val="40"/>
+        </w:rPr>
+        <w:t>index.html (continued)</w:t>
+      </w:r>
+    </w:p>
+    <w:p>
+      <w:pPr>
+        <w:pStyle w:val="BodyText"/>
+        <w:keepNext w:val="0"/>
+        <w:keepLines/>
+        <w:spacing w:before="0" w:after="0" w:line="230" w:lineRule="exact"/>
+      </w:pPr>
+      <w:r>
+        <w:rPr>
+          <w:rFonts w:ascii="Consolas" w:hAnsi="Consolas"/>
+          <w:b w:val="0"/>
+          <w:color w:val="000000"/>
+          <w:sz w:val="20"/>
+        </w:rPr>
+        <w:t xml:space="preserve">    &lt;main&gt;</w:t>
+        <w:br/>
+        <w:t xml:space="preserve">      &lt;div class="head" id="doctors"&gt;</w:t>
+        <w:br/>
+        <w:t xml:space="preserve">        &lt;div&gt;</w:t>
+        <w:br/>
+        <w:t xml:space="preserve">          &lt;div class="eyebrow"&gt;Meet the team&lt;/div&gt;</w:t>
+        <w:br/>
+        <w:t xml:space="preserve">          &lt;h2&gt;Specialists you can trust&lt;/h2&gt;</w:t>
+        <w:br/>
+        <w:t xml:space="preserve">        &lt;/div&gt;</w:t>
+        <w:br/>
+        <w:t xml:space="preserve">        &lt;p&gt;Consultations available · 15 Oct 2026&lt;/p&gt;</w:t>
+        <w:br/>
+        <w:t xml:space="preserve">      &lt;/div&gt;</w:t>
+        <w:br/>
+        <w:t xml:space="preserve">      &lt;div class="grid"&gt;</w:t>
+        <w:br/>
+        <w:t xml:space="preserve">        &lt;article class="card"&gt;</w:t>
+        <w:br/>
+        <w:t xml:space="preserve">          &lt;div class="initial"&gt;AM&lt;/div&gt;</w:t>
+        <w:br/>
+        <w:t xml:space="preserve">          &lt;h3&gt;Dr. Aanya Menon&lt;/h3&gt;</w:t>
+        <w:br/>
+        <w:t xml:space="preserve">          &lt;p&gt;Consultant cardiologist · 12 years of experience&lt;/p&gt;</w:t>
+        <w:br/>
+        <w:t xml:space="preserve">          &lt;div class="specialty"&gt;Next slot · Today, 16:30&lt;/div&gt;</w:t>
+        <w:br/>
+        <w:t xml:space="preserve">        &lt;/article&gt;</w:t>
+        <w:br/>
+        <w:t xml:space="preserve">        &lt;article class="card"&gt;</w:t>
+        <w:br/>
+        <w:t xml:space="preserve">          &lt;div class="initial"&gt;RK&lt;/div&gt;</w:t>
+        <w:br/>
+        <w:t xml:space="preserve">          &lt;h3&gt;Dr. Rohan Kapoor&lt;/h3&gt;</w:t>
+        <w:br/>
+        <w:t xml:space="preserve">          &lt;p&gt;Senior dermatologist · 9 years of experience&lt;/p&gt;</w:t>
+        <w:br/>
+        <w:t xml:space="preserve">          &lt;div class="specialty"&gt;Next slot · Tomorrow, 09:15&lt;/div&gt;</w:t>
+        <w:br/>
+        <w:t xml:space="preserve">        &lt;/article&gt;</w:t>
+        <w:br/>
+        <w:t xml:space="preserve">        &lt;article class="card"&gt;</w:t>
+        <w:br/>
+        <w:t xml:space="preserve">          &lt;div class="initial"&gt;SI&lt;/div&gt;</w:t>
+        <w:br/>
+        <w:t xml:space="preserve">          &lt;h3&gt;Dr. Sara Iqbal&lt;/h3&gt;</w:t>
+        <w:br/>
+        <w:t xml:space="preserve">          &lt;p&gt;Consultant paediatrician · 14 years of experience&lt;/p&gt;</w:t>
+        <w:br/>
+        <w:t xml:space="preserve">          &lt;div class="specialty"&gt;Next slot · Today, 18:00&lt;/div&gt;</w:t>
+        <w:br/>
+        <w:t xml:space="preserve">        &lt;/article&gt;</w:t>
+        <w:br/>
+        <w:t xml:space="preserve">      &lt;/div&gt;</w:t>
+        <w:br/>
+        <w:t xml:space="preserve">      &lt;div class="notice" id="notices"&gt;</w:t>
+        <w:br/>
+        <w:t xml:space="preserve">        &lt;div&gt;</w:t>
+        <w:br/>
+        <w:t xml:space="preserve">          &lt;div class="eyebrow" style="color: #a6e1d2"&gt;Hospital announcement&lt;/div&gt;</w:t>
+        <w:br/>
+        <w:t xml:space="preserve">          &lt;strong&gt;Flu clinic appointments are now open&lt;/strong&gt;</w:t>
+        <w:br/>
+        <w:t xml:space="preserve">          &lt;p&gt;Reserve a same-week slot through the appointment desk.&lt;/p&gt;</w:t>
+        <w:br/>
+        <w:t xml:space="preserve">        &lt;/div&gt;</w:t>
+        <w:br/>
+        <w:t xml:space="preserve">        &lt;div class="pill"&gt;Book a slot&lt;/div&gt;</w:t>
+        <w:br/>
+        <w:t xml:space="preserve">      &lt;/div&gt;</w:t>
+        <w:br/>
+        <w:t xml:space="preserve">      &lt;section</w:t>
+        <w:br/>
+        <w:t xml:space="preserve">        id="release-update"</w:t>
+        <w:br/>
+        <w:t xml:space="preserve">        class="notice"</w:t>
+        <w:br/>
+        <w:t xml:space="preserve">        style="background: #e0f1ec; color: #172a31"</w:t>
+        <w:br/>
+        <w:t xml:space="preserve">      &gt;</w:t>
+        <w:br/>
+        <w:t xml:space="preserve">        &lt;div&gt;</w:t>
+        <w:br/>
+        <w:t xml:space="preserve">          &lt;div class="eyebrow"&gt;New appointment opportunity ? Version 2&lt;/div&gt;</w:t>
+        <w:br/>
+        <w:t xml:space="preserve">          &lt;h2&gt;Vaccination clinic with Dr. Maya Rao&lt;/h2&gt;</w:t>
+        <w:br/>
+        <w:t xml:space="preserve">          &lt;p style="color: #3c625b"&gt;</w:t>
+        <w:br/>
+        <w:t xml:space="preserve">            Family medicine and immunisation ? 16 years of experience&lt;br /&gt;New slots:</w:t>
+        <w:br/>
+        <w:t xml:space="preserve">            Monday 09:00, 09:30 and 10:00 ? Consultation: 09:00?12:00</w:t>
+        <w:br/>
+        <w:t xml:space="preserve">          &lt;/p&gt;</w:t>
+        <w:br/>
+        <w:t xml:space="preserve">        &lt;/div&gt;</w:t>
+        <w:br/>
+        <w:t xml:space="preserve">      &lt;/section&gt;</w:t>
+        <w:br/>
+        <w:t xml:space="preserve">    &lt;/main&gt;</w:t>
+        <w:br/>
+        <w:t xml:space="preserve">    &lt;footer class="foot"&gt;</w:t>
+        <w:br/>
+        <w:t xml:space="preserve">      Northstar Health · Hospital Appointment Portal · Secure care scheduling</w:t>
+        <w:br/>
+        <w:t xml:space="preserve">    &lt;/footer&gt;</w:t>
+        <w:br/>
+        <w:t xml:space="preserve">  &lt;/body&gt;</w:t>
+        <w:br/>
+        <w:t>&lt;/html&gt;</w:t>
       </w:r>
     </w:p>
     <w:p>

</xml_diff>